<commit_message>
table1 fisher test upadated
</commit_message>
<xml_diff>
--- a/output/tables/COAD/COAD_table1_APC.docx
+++ b/output/tables/COAD/COAD_table1_APC.docx
@@ -40,6 +40,7 @@
         <w:gridCol w:w="2001"/>
         <w:gridCol w:w="2001"/>
         <w:gridCol w:w="1181"/>
+        <w:gridCol w:w="2065"/>
       </w:tblGrid>
       <w:tr>
         <w:trPr>
@@ -160,6 +161,7 @@
         </w:tc>
         <w:tc>
           <w:tcPr>
+            <w:gridSpan w:val="2"/>
             <w:tcBorders>
               <w:bottom w:val="single" w:sz="8" w:space="0" w:color="000000"/>
               <w:top w:val="single" w:sz="8" w:space="0" w:color="000000"/>
@@ -667,6 +669,61 @@
             </w:r>
           </w:p>
         </w:tc>
+        <w:tc>
+          <w:tcPr>
+            <w:tcBorders>
+              <w:bottom w:val="single" w:sz="8" w:space="0" w:color="000000"/>
+              <w:top w:val="single" w:sz="8" w:space="0" w:color="000000"/>
+              <w:left w:val="none" w:sz="0" w:space="0" w:color="000000"/>
+              <w:right w:val="none" w:sz="0" w:space="0" w:color="000000"/>
+            </w:tcBorders>
+            <w:shd w:val="clear" w:color="auto" w:fill="FFFFFF"/>
+            <w:tcMar>
+              <w:top w:w="0" w:type="dxa"/>
+              <w:bottom w:w="0" w:type="dxa"/>
+              <w:left w:w="0" w:type="dxa"/>
+              <w:right w:w="0" w:type="dxa"/>
+            </w:tcMar>
+            <w:vAlign w:val="center"/>
+          </w:tcPr>
+          <w:p>
+            <w:pPr>
+              <w:pStyle w:val="Normal"/>
+              <w:jc w:val="center"/>
+              <w:pBdr>
+                <w:bottom w:val="none" w:sz="0" w:space="0" w:color="000000"/>
+                <w:top w:val="none" w:sz="0" w:space="0" w:color="000000"/>
+                <w:left w:val="none" w:sz="0" w:space="0" w:color="000000"/>
+                <w:right w:val="none" w:sz="0" w:space="0" w:color="000000"/>
+              </w:pBdr>
+              <w:spacing w:after="40" w:before="40" w:line="240"/>
+              <w:ind w:left="100" w:right="100" w:firstLine="0" w:firstLineChars="0"/>
+              <w:rPr>
+                <w:rFonts w:ascii="Times New Roman" w:hAnsi="Times New Roman" w:eastAsia="Times New Roman" w:cs="Times New Roman"/>
+                <w:i w:val="false"/>
+                <w:b w:val="false"/>
+                <w:u w:val="none"/>
+                <w:strike w:val="false"/>
+                <w:sz w:val="18"/>
+                <w:szCs w:val="18"/>
+                <w:color w:val="000000"/>
+              </w:rPr>
+            </w:pPr>
+            <w:r>
+              <w:rPr>
+                <w:rFonts w:ascii="Times New Roman" w:hAnsi="Times New Roman" w:eastAsia="Times New Roman" w:cs="Times New Roman"/>
+                <w:i w:val="false"/>
+                <w:b w:val="true"/>
+                <w:u w:val="none"/>
+                <w:strike w:val="false"/>
+                <w:sz w:val="18"/>
+                <w:szCs w:val="18"/>
+                <w:color w:val="000000"/>
+              </w:rPr>
+              <w:t xml:space="preserve">Fisher's exact p</w:t>
+            </w:r>
+          </w:p>
+        </w:tc>
       </w:tr>
       <w:tr>
         <w:trPr>
@@ -947,6 +1004,61 @@
             </w:r>
           </w:p>
         </w:tc>
+        <w:tc>
+          <w:tcPr>
+            <w:tcBorders>
+              <w:bottom w:val="none" w:sz="0" w:space="0" w:color="000000"/>
+              <w:top w:val="single" w:sz="8" w:space="0" w:color="000000"/>
+              <w:left w:val="none" w:sz="0" w:space="0" w:color="000000"/>
+              <w:right w:val="none" w:sz="0" w:space="0" w:color="000000"/>
+            </w:tcBorders>
+            <w:shd w:val="clear" w:color="auto" w:fill="FFFFFF"/>
+            <w:tcMar>
+              <w:top w:w="0" w:type="dxa"/>
+              <w:bottom w:w="0" w:type="dxa"/>
+              <w:left w:w="0" w:type="dxa"/>
+              <w:right w:w="0" w:type="dxa"/>
+            </w:tcMar>
+            <w:vAlign w:val="top"/>
+          </w:tcPr>
+          <w:p>
+            <w:pPr>
+              <w:pStyle w:val="Normal"/>
+              <w:jc w:val="center"/>
+              <w:pBdr>
+                <w:bottom w:val="none" w:sz="0" w:space="0" w:color="000000"/>
+                <w:top w:val="none" w:sz="0" w:space="0" w:color="000000"/>
+                <w:left w:val="none" w:sz="0" w:space="0" w:color="000000"/>
+                <w:right w:val="none" w:sz="0" w:space="0" w:color="000000"/>
+              </w:pBdr>
+              <w:spacing w:after="100" w:before="100" w:line="240"/>
+              <w:ind w:left="100" w:right="100" w:firstLine="0" w:firstLineChars="0"/>
+              <w:rPr>
+                <w:rFonts w:ascii="Times New Roman" w:hAnsi="Times New Roman" w:eastAsia="Times New Roman" w:cs="Times New Roman"/>
+                <w:i w:val="false"/>
+                <w:b w:val="false"/>
+                <w:u w:val="none"/>
+                <w:strike w:val="false"/>
+                <w:sz w:val="18"/>
+                <w:szCs w:val="18"/>
+                <w:color w:val="000000"/>
+              </w:rPr>
+            </w:pPr>
+            <w:r>
+              <w:rPr>
+                <w:rFonts w:ascii="Times New Roman" w:hAnsi="Times New Roman" w:eastAsia="Times New Roman" w:cs="Times New Roman"/>
+                <w:i w:val="false"/>
+                <w:b w:val="false"/>
+                <w:u w:val="none"/>
+                <w:strike w:val="false"/>
+                <w:sz w:val="18"/>
+                <w:szCs w:val="18"/>
+                <w:color w:val="000000"/>
+              </w:rPr>
+              <w:t xml:space="preserve"/>
+            </w:r>
+          </w:p>
+        </w:tc>
       </w:tr>
       <w:tr>
         <w:trPr>
@@ -1227,6 +1339,61 @@
             </w:r>
           </w:p>
         </w:tc>
+        <w:tc>
+          <w:tcPr>
+            <w:tcBorders>
+              <w:bottom w:val="none" w:sz="0" w:space="0" w:color="000000"/>
+              <w:top w:val="none" w:sz="0" w:space="0" w:color="000000"/>
+              <w:left w:val="none" w:sz="0" w:space="0" w:color="000000"/>
+              <w:right w:val="none" w:sz="0" w:space="0" w:color="000000"/>
+            </w:tcBorders>
+            <w:shd w:val="clear" w:color="auto" w:fill="FFFFFF"/>
+            <w:tcMar>
+              <w:top w:w="0" w:type="dxa"/>
+              <w:bottom w:w="0" w:type="dxa"/>
+              <w:left w:w="0" w:type="dxa"/>
+              <w:right w:w="0" w:type="dxa"/>
+            </w:tcMar>
+            <w:vAlign w:val="top"/>
+          </w:tcPr>
+          <w:p>
+            <w:pPr>
+              <w:pStyle w:val="Normal"/>
+              <w:jc w:val="center"/>
+              <w:pBdr>
+                <w:bottom w:val="none" w:sz="0" w:space="0" w:color="000000"/>
+                <w:top w:val="none" w:sz="0" w:space="0" w:color="000000"/>
+                <w:left w:val="none" w:sz="0" w:space="0" w:color="000000"/>
+                <w:right w:val="none" w:sz="0" w:space="0" w:color="000000"/>
+              </w:pBdr>
+              <w:spacing w:after="100" w:before="100" w:line="240"/>
+              <w:ind w:left="100" w:right="100" w:firstLine="0" w:firstLineChars="0"/>
+              <w:rPr>
+                <w:rFonts w:ascii="Times New Roman" w:hAnsi="Times New Roman" w:eastAsia="Times New Roman" w:cs="Times New Roman"/>
+                <w:i w:val="false"/>
+                <w:b w:val="false"/>
+                <w:u w:val="none"/>
+                <w:strike w:val="false"/>
+                <w:sz w:val="18"/>
+                <w:szCs w:val="18"/>
+                <w:color w:val="000000"/>
+              </w:rPr>
+            </w:pPr>
+            <w:r>
+              <w:rPr>
+                <w:rFonts w:ascii="Times New Roman" w:hAnsi="Times New Roman" w:eastAsia="Times New Roman" w:cs="Times New Roman"/>
+                <w:i w:val="false"/>
+                <w:b w:val="false"/>
+                <w:u w:val="none"/>
+                <w:strike w:val="false"/>
+                <w:sz w:val="18"/>
+                <w:szCs w:val="18"/>
+                <w:color w:val="000000"/>
+              </w:rPr>
+              <w:t xml:space="preserve">0.026</w:t>
+            </w:r>
+          </w:p>
+        </w:tc>
       </w:tr>
       <w:tr>
         <w:trPr>
@@ -1507,6 +1674,61 @@
             </w:r>
           </w:p>
         </w:tc>
+        <w:tc>
+          <w:tcPr>
+            <w:tcBorders>
+              <w:bottom w:val="none" w:sz="0" w:space="0" w:color="000000"/>
+              <w:top w:val="none" w:sz="0" w:space="0" w:color="000000"/>
+              <w:left w:val="none" w:sz="0" w:space="0" w:color="000000"/>
+              <w:right w:val="none" w:sz="0" w:space="0" w:color="000000"/>
+            </w:tcBorders>
+            <w:shd w:val="clear" w:color="auto" w:fill="FFFFFF"/>
+            <w:tcMar>
+              <w:top w:w="0" w:type="dxa"/>
+              <w:bottom w:w="0" w:type="dxa"/>
+              <w:left w:w="0" w:type="dxa"/>
+              <w:right w:w="0" w:type="dxa"/>
+            </w:tcMar>
+            <w:vAlign w:val="top"/>
+          </w:tcPr>
+          <w:p>
+            <w:pPr>
+              <w:pStyle w:val="Normal"/>
+              <w:jc w:val="center"/>
+              <w:pBdr>
+                <w:bottom w:val="none" w:sz="0" w:space="0" w:color="000000"/>
+                <w:top w:val="none" w:sz="0" w:space="0" w:color="000000"/>
+                <w:left w:val="none" w:sz="0" w:space="0" w:color="000000"/>
+                <w:right w:val="none" w:sz="0" w:space="0" w:color="000000"/>
+              </w:pBdr>
+              <w:spacing w:after="100" w:before="100" w:line="240"/>
+              <w:ind w:left="100" w:right="100" w:firstLine="0" w:firstLineChars="0"/>
+              <w:rPr>
+                <w:rFonts w:ascii="Times New Roman" w:hAnsi="Times New Roman" w:eastAsia="Times New Roman" w:cs="Times New Roman"/>
+                <w:i w:val="false"/>
+                <w:b w:val="false"/>
+                <w:u w:val="none"/>
+                <w:strike w:val="false"/>
+                <w:sz w:val="18"/>
+                <w:szCs w:val="18"/>
+                <w:color w:val="000000"/>
+              </w:rPr>
+            </w:pPr>
+            <w:r>
+              <w:rPr>
+                <w:rFonts w:ascii="Times New Roman" w:hAnsi="Times New Roman" w:eastAsia="Times New Roman" w:cs="Times New Roman"/>
+                <w:i w:val="false"/>
+                <w:b w:val="false"/>
+                <w:u w:val="none"/>
+                <w:strike w:val="false"/>
+                <w:sz w:val="18"/>
+                <w:szCs w:val="18"/>
+                <w:color w:val="000000"/>
+              </w:rPr>
+              <w:t xml:space="preserve"/>
+            </w:r>
+          </w:p>
+        </w:tc>
       </w:tr>
       <w:tr>
         <w:trPr>
@@ -1787,6 +2009,61 @@
             </w:r>
           </w:p>
         </w:tc>
+        <w:tc>
+          <w:tcPr>
+            <w:tcBorders>
+              <w:bottom w:val="none" w:sz="0" w:space="0" w:color="000000"/>
+              <w:top w:val="none" w:sz="0" w:space="0" w:color="000000"/>
+              <w:left w:val="none" w:sz="0" w:space="0" w:color="000000"/>
+              <w:right w:val="none" w:sz="0" w:space="0" w:color="000000"/>
+            </w:tcBorders>
+            <w:shd w:val="clear" w:color="auto" w:fill="FFFFFF"/>
+            <w:tcMar>
+              <w:top w:w="0" w:type="dxa"/>
+              <w:bottom w:w="0" w:type="dxa"/>
+              <w:left w:w="0" w:type="dxa"/>
+              <w:right w:w="0" w:type="dxa"/>
+            </w:tcMar>
+            <w:vAlign w:val="top"/>
+          </w:tcPr>
+          <w:p>
+            <w:pPr>
+              <w:pStyle w:val="Normal"/>
+              <w:jc w:val="center"/>
+              <w:pBdr>
+                <w:bottom w:val="none" w:sz="0" w:space="0" w:color="000000"/>
+                <w:top w:val="none" w:sz="0" w:space="0" w:color="000000"/>
+                <w:left w:val="none" w:sz="0" w:space="0" w:color="000000"/>
+                <w:right w:val="none" w:sz="0" w:space="0" w:color="000000"/>
+              </w:pBdr>
+              <w:spacing w:after="100" w:before="100" w:line="240"/>
+              <w:ind w:left="100" w:right="100" w:firstLine="0" w:firstLineChars="0"/>
+              <w:rPr>
+                <w:rFonts w:ascii="Times New Roman" w:hAnsi="Times New Roman" w:eastAsia="Times New Roman" w:cs="Times New Roman"/>
+                <w:i w:val="false"/>
+                <w:b w:val="false"/>
+                <w:u w:val="none"/>
+                <w:strike w:val="false"/>
+                <w:sz w:val="18"/>
+                <w:szCs w:val="18"/>
+                <w:color w:val="000000"/>
+              </w:rPr>
+            </w:pPr>
+            <w:r>
+              <w:rPr>
+                <w:rFonts w:ascii="Times New Roman" w:hAnsi="Times New Roman" w:eastAsia="Times New Roman" w:cs="Times New Roman"/>
+                <w:i w:val="false"/>
+                <w:b w:val="false"/>
+                <w:u w:val="none"/>
+                <w:strike w:val="false"/>
+                <w:sz w:val="18"/>
+                <w:szCs w:val="18"/>
+                <w:color w:val="000000"/>
+              </w:rPr>
+              <w:t xml:space="preserve"/>
+            </w:r>
+          </w:p>
+        </w:tc>
       </w:tr>
       <w:tr>
         <w:trPr>
@@ -2067,6 +2344,61 @@
             </w:r>
           </w:p>
         </w:tc>
+        <w:tc>
+          <w:tcPr>
+            <w:tcBorders>
+              <w:bottom w:val="none" w:sz="0" w:space="0" w:color="000000"/>
+              <w:top w:val="none" w:sz="0" w:space="0" w:color="000000"/>
+              <w:left w:val="none" w:sz="0" w:space="0" w:color="000000"/>
+              <w:right w:val="none" w:sz="0" w:space="0" w:color="000000"/>
+            </w:tcBorders>
+            <w:shd w:val="clear" w:color="auto" w:fill="FFFFFF"/>
+            <w:tcMar>
+              <w:top w:w="0" w:type="dxa"/>
+              <w:bottom w:w="0" w:type="dxa"/>
+              <w:left w:w="0" w:type="dxa"/>
+              <w:right w:w="0" w:type="dxa"/>
+            </w:tcMar>
+            <w:vAlign w:val="top"/>
+          </w:tcPr>
+          <w:p>
+            <w:pPr>
+              <w:pStyle w:val="Normal"/>
+              <w:jc w:val="center"/>
+              <w:pBdr>
+                <w:bottom w:val="none" w:sz="0" w:space="0" w:color="000000"/>
+                <w:top w:val="none" w:sz="0" w:space="0" w:color="000000"/>
+                <w:left w:val="none" w:sz="0" w:space="0" w:color="000000"/>
+                <w:right w:val="none" w:sz="0" w:space="0" w:color="000000"/>
+              </w:pBdr>
+              <w:spacing w:after="100" w:before="100" w:line="240"/>
+              <w:ind w:left="100" w:right="100" w:firstLine="0" w:firstLineChars="0"/>
+              <w:rPr>
+                <w:rFonts w:ascii="Times New Roman" w:hAnsi="Times New Roman" w:eastAsia="Times New Roman" w:cs="Times New Roman"/>
+                <w:i w:val="false"/>
+                <w:b w:val="false"/>
+                <w:u w:val="none"/>
+                <w:strike w:val="false"/>
+                <w:sz w:val="18"/>
+                <w:szCs w:val="18"/>
+                <w:color w:val="000000"/>
+              </w:rPr>
+            </w:pPr>
+            <w:r>
+              <w:rPr>
+                <w:rFonts w:ascii="Times New Roman" w:hAnsi="Times New Roman" w:eastAsia="Times New Roman" w:cs="Times New Roman"/>
+                <w:i w:val="false"/>
+                <w:b w:val="false"/>
+                <w:u w:val="none"/>
+                <w:strike w:val="false"/>
+                <w:sz w:val="18"/>
+                <w:szCs w:val="18"/>
+                <w:color w:val="000000"/>
+              </w:rPr>
+              <w:t xml:space="preserve">0.035</w:t>
+            </w:r>
+          </w:p>
+        </w:tc>
       </w:tr>
       <w:tr>
         <w:trPr>
@@ -2347,6 +2679,61 @@
             </w:r>
           </w:p>
         </w:tc>
+        <w:tc>
+          <w:tcPr>
+            <w:tcBorders>
+              <w:bottom w:val="none" w:sz="0" w:space="0" w:color="000000"/>
+              <w:top w:val="none" w:sz="0" w:space="0" w:color="000000"/>
+              <w:left w:val="none" w:sz="0" w:space="0" w:color="000000"/>
+              <w:right w:val="none" w:sz="0" w:space="0" w:color="000000"/>
+            </w:tcBorders>
+            <w:shd w:val="clear" w:color="auto" w:fill="FFFFFF"/>
+            <w:tcMar>
+              <w:top w:w="0" w:type="dxa"/>
+              <w:bottom w:w="0" w:type="dxa"/>
+              <w:left w:w="0" w:type="dxa"/>
+              <w:right w:w="0" w:type="dxa"/>
+            </w:tcMar>
+            <w:vAlign w:val="top"/>
+          </w:tcPr>
+          <w:p>
+            <w:pPr>
+              <w:pStyle w:val="Normal"/>
+              <w:jc w:val="center"/>
+              <w:pBdr>
+                <w:bottom w:val="none" w:sz="0" w:space="0" w:color="000000"/>
+                <w:top w:val="none" w:sz="0" w:space="0" w:color="000000"/>
+                <w:left w:val="none" w:sz="0" w:space="0" w:color="000000"/>
+                <w:right w:val="none" w:sz="0" w:space="0" w:color="000000"/>
+              </w:pBdr>
+              <w:spacing w:after="100" w:before="100" w:line="240"/>
+              <w:ind w:left="100" w:right="100" w:firstLine="0" w:firstLineChars="0"/>
+              <w:rPr>
+                <w:rFonts w:ascii="Times New Roman" w:hAnsi="Times New Roman" w:eastAsia="Times New Roman" w:cs="Times New Roman"/>
+                <w:i w:val="false"/>
+                <w:b w:val="false"/>
+                <w:u w:val="none"/>
+                <w:strike w:val="false"/>
+                <w:sz w:val="18"/>
+                <w:szCs w:val="18"/>
+                <w:color w:val="000000"/>
+              </w:rPr>
+            </w:pPr>
+            <w:r>
+              <w:rPr>
+                <w:rFonts w:ascii="Times New Roman" w:hAnsi="Times New Roman" w:eastAsia="Times New Roman" w:cs="Times New Roman"/>
+                <w:i w:val="false"/>
+                <w:b w:val="false"/>
+                <w:u w:val="none"/>
+                <w:strike w:val="false"/>
+                <w:sz w:val="18"/>
+                <w:szCs w:val="18"/>
+                <w:color w:val="000000"/>
+              </w:rPr>
+              <w:t xml:space="preserve"/>
+            </w:r>
+          </w:p>
+        </w:tc>
       </w:tr>
       <w:tr>
         <w:trPr>
@@ -2627,6 +3014,61 @@
             </w:r>
           </w:p>
         </w:tc>
+        <w:tc>
+          <w:tcPr>
+            <w:tcBorders>
+              <w:bottom w:val="none" w:sz="0" w:space="0" w:color="000000"/>
+              <w:top w:val="none" w:sz="0" w:space="0" w:color="000000"/>
+              <w:left w:val="none" w:sz="0" w:space="0" w:color="000000"/>
+              <w:right w:val="none" w:sz="0" w:space="0" w:color="000000"/>
+            </w:tcBorders>
+            <w:shd w:val="clear" w:color="auto" w:fill="FFFFFF"/>
+            <w:tcMar>
+              <w:top w:w="0" w:type="dxa"/>
+              <w:bottom w:w="0" w:type="dxa"/>
+              <w:left w:w="0" w:type="dxa"/>
+              <w:right w:w="0" w:type="dxa"/>
+            </w:tcMar>
+            <w:vAlign w:val="top"/>
+          </w:tcPr>
+          <w:p>
+            <w:pPr>
+              <w:pStyle w:val="Normal"/>
+              <w:jc w:val="center"/>
+              <w:pBdr>
+                <w:bottom w:val="none" w:sz="0" w:space="0" w:color="000000"/>
+                <w:top w:val="none" w:sz="0" w:space="0" w:color="000000"/>
+                <w:left w:val="none" w:sz="0" w:space="0" w:color="000000"/>
+                <w:right w:val="none" w:sz="0" w:space="0" w:color="000000"/>
+              </w:pBdr>
+              <w:spacing w:after="100" w:before="100" w:line="240"/>
+              <w:ind w:left="100" w:right="100" w:firstLine="0" w:firstLineChars="0"/>
+              <w:rPr>
+                <w:rFonts w:ascii="Times New Roman" w:hAnsi="Times New Roman" w:eastAsia="Times New Roman" w:cs="Times New Roman"/>
+                <w:i w:val="false"/>
+                <w:b w:val="false"/>
+                <w:u w:val="none"/>
+                <w:strike w:val="false"/>
+                <w:sz w:val="18"/>
+                <w:szCs w:val="18"/>
+                <w:color w:val="000000"/>
+              </w:rPr>
+            </w:pPr>
+            <w:r>
+              <w:rPr>
+                <w:rFonts w:ascii="Times New Roman" w:hAnsi="Times New Roman" w:eastAsia="Times New Roman" w:cs="Times New Roman"/>
+                <w:i w:val="false"/>
+                <w:b w:val="false"/>
+                <w:u w:val="none"/>
+                <w:strike w:val="false"/>
+                <w:sz w:val="18"/>
+                <w:szCs w:val="18"/>
+                <w:color w:val="000000"/>
+              </w:rPr>
+              <w:t xml:space="preserve"/>
+            </w:r>
+          </w:p>
+        </w:tc>
       </w:tr>
       <w:tr>
         <w:trPr>
@@ -2907,6 +3349,61 @@
             </w:r>
           </w:p>
         </w:tc>
+        <w:tc>
+          <w:tcPr>
+            <w:tcBorders>
+              <w:bottom w:val="none" w:sz="0" w:space="0" w:color="000000"/>
+              <w:top w:val="none" w:sz="0" w:space="0" w:color="000000"/>
+              <w:left w:val="none" w:sz="0" w:space="0" w:color="000000"/>
+              <w:right w:val="none" w:sz="0" w:space="0" w:color="000000"/>
+            </w:tcBorders>
+            <w:shd w:val="clear" w:color="auto" w:fill="FFFFFF"/>
+            <w:tcMar>
+              <w:top w:w="0" w:type="dxa"/>
+              <w:bottom w:w="0" w:type="dxa"/>
+              <w:left w:w="0" w:type="dxa"/>
+              <w:right w:w="0" w:type="dxa"/>
+            </w:tcMar>
+            <w:vAlign w:val="top"/>
+          </w:tcPr>
+          <w:p>
+            <w:pPr>
+              <w:pStyle w:val="Normal"/>
+              <w:jc w:val="center"/>
+              <w:pBdr>
+                <w:bottom w:val="none" w:sz="0" w:space="0" w:color="000000"/>
+                <w:top w:val="none" w:sz="0" w:space="0" w:color="000000"/>
+                <w:left w:val="none" w:sz="0" w:space="0" w:color="000000"/>
+                <w:right w:val="none" w:sz="0" w:space="0" w:color="000000"/>
+              </w:pBdr>
+              <w:spacing w:after="100" w:before="100" w:line="240"/>
+              <w:ind w:left="100" w:right="100" w:firstLine="0" w:firstLineChars="0"/>
+              <w:rPr>
+                <w:rFonts w:ascii="Times New Roman" w:hAnsi="Times New Roman" w:eastAsia="Times New Roman" w:cs="Times New Roman"/>
+                <w:i w:val="false"/>
+                <w:b w:val="false"/>
+                <w:u w:val="none"/>
+                <w:strike w:val="false"/>
+                <w:sz w:val="18"/>
+                <w:szCs w:val="18"/>
+                <w:color w:val="000000"/>
+              </w:rPr>
+            </w:pPr>
+            <w:r>
+              <w:rPr>
+                <w:rFonts w:ascii="Times New Roman" w:hAnsi="Times New Roman" w:eastAsia="Times New Roman" w:cs="Times New Roman"/>
+                <w:i w:val="false"/>
+                <w:b w:val="false"/>
+                <w:u w:val="none"/>
+                <w:strike w:val="false"/>
+                <w:sz w:val="18"/>
+                <w:szCs w:val="18"/>
+                <w:color w:val="000000"/>
+              </w:rPr>
+              <w:t xml:space="preserve">0.732</w:t>
+            </w:r>
+          </w:p>
+        </w:tc>
       </w:tr>
       <w:tr>
         <w:trPr>
@@ -3187,6 +3684,61 @@
             </w:r>
           </w:p>
         </w:tc>
+        <w:tc>
+          <w:tcPr>
+            <w:tcBorders>
+              <w:bottom w:val="none" w:sz="0" w:space="0" w:color="000000"/>
+              <w:top w:val="none" w:sz="0" w:space="0" w:color="000000"/>
+              <w:left w:val="none" w:sz="0" w:space="0" w:color="000000"/>
+              <w:right w:val="none" w:sz="0" w:space="0" w:color="000000"/>
+            </w:tcBorders>
+            <w:shd w:val="clear" w:color="auto" w:fill="FFFFFF"/>
+            <w:tcMar>
+              <w:top w:w="0" w:type="dxa"/>
+              <w:bottom w:w="0" w:type="dxa"/>
+              <w:left w:w="0" w:type="dxa"/>
+              <w:right w:w="0" w:type="dxa"/>
+            </w:tcMar>
+            <w:vAlign w:val="top"/>
+          </w:tcPr>
+          <w:p>
+            <w:pPr>
+              <w:pStyle w:val="Normal"/>
+              <w:jc w:val="center"/>
+              <w:pBdr>
+                <w:bottom w:val="none" w:sz="0" w:space="0" w:color="000000"/>
+                <w:top w:val="none" w:sz="0" w:space="0" w:color="000000"/>
+                <w:left w:val="none" w:sz="0" w:space="0" w:color="000000"/>
+                <w:right w:val="none" w:sz="0" w:space="0" w:color="000000"/>
+              </w:pBdr>
+              <w:spacing w:after="100" w:before="100" w:line="240"/>
+              <w:ind w:left="100" w:right="100" w:firstLine="0" w:firstLineChars="0"/>
+              <w:rPr>
+                <w:rFonts w:ascii="Times New Roman" w:hAnsi="Times New Roman" w:eastAsia="Times New Roman" w:cs="Times New Roman"/>
+                <w:i w:val="false"/>
+                <w:b w:val="false"/>
+                <w:u w:val="none"/>
+                <w:strike w:val="false"/>
+                <w:sz w:val="18"/>
+                <w:szCs w:val="18"/>
+                <w:color w:val="000000"/>
+              </w:rPr>
+            </w:pPr>
+            <w:r>
+              <w:rPr>
+                <w:rFonts w:ascii="Times New Roman" w:hAnsi="Times New Roman" w:eastAsia="Times New Roman" w:cs="Times New Roman"/>
+                <w:i w:val="false"/>
+                <w:b w:val="false"/>
+                <w:u w:val="none"/>
+                <w:strike w:val="false"/>
+                <w:sz w:val="18"/>
+                <w:szCs w:val="18"/>
+                <w:color w:val="000000"/>
+              </w:rPr>
+              <w:t xml:space="preserve"/>
+            </w:r>
+          </w:p>
+        </w:tc>
       </w:tr>
       <w:tr>
         <w:trPr>
@@ -3467,6 +4019,61 @@
             </w:r>
           </w:p>
         </w:tc>
+        <w:tc>
+          <w:tcPr>
+            <w:tcBorders>
+              <w:bottom w:val="none" w:sz="0" w:space="0" w:color="000000"/>
+              <w:top w:val="none" w:sz="0" w:space="0" w:color="000000"/>
+              <w:left w:val="none" w:sz="0" w:space="0" w:color="000000"/>
+              <w:right w:val="none" w:sz="0" w:space="0" w:color="000000"/>
+            </w:tcBorders>
+            <w:shd w:val="clear" w:color="auto" w:fill="FFFFFF"/>
+            <w:tcMar>
+              <w:top w:w="0" w:type="dxa"/>
+              <w:bottom w:w="0" w:type="dxa"/>
+              <w:left w:w="0" w:type="dxa"/>
+              <w:right w:w="0" w:type="dxa"/>
+            </w:tcMar>
+            <w:vAlign w:val="top"/>
+          </w:tcPr>
+          <w:p>
+            <w:pPr>
+              <w:pStyle w:val="Normal"/>
+              <w:jc w:val="center"/>
+              <w:pBdr>
+                <w:bottom w:val="none" w:sz="0" w:space="0" w:color="000000"/>
+                <w:top w:val="none" w:sz="0" w:space="0" w:color="000000"/>
+                <w:left w:val="none" w:sz="0" w:space="0" w:color="000000"/>
+                <w:right w:val="none" w:sz="0" w:space="0" w:color="000000"/>
+              </w:pBdr>
+              <w:spacing w:after="100" w:before="100" w:line="240"/>
+              <w:ind w:left="100" w:right="100" w:firstLine="0" w:firstLineChars="0"/>
+              <w:rPr>
+                <w:rFonts w:ascii="Times New Roman" w:hAnsi="Times New Roman" w:eastAsia="Times New Roman" w:cs="Times New Roman"/>
+                <w:i w:val="false"/>
+                <w:b w:val="false"/>
+                <w:u w:val="none"/>
+                <w:strike w:val="false"/>
+                <w:sz w:val="18"/>
+                <w:szCs w:val="18"/>
+                <w:color w:val="000000"/>
+              </w:rPr>
+            </w:pPr>
+            <w:r>
+              <w:rPr>
+                <w:rFonts w:ascii="Times New Roman" w:hAnsi="Times New Roman" w:eastAsia="Times New Roman" w:cs="Times New Roman"/>
+                <w:i w:val="false"/>
+                <w:b w:val="false"/>
+                <w:u w:val="none"/>
+                <w:strike w:val="false"/>
+                <w:sz w:val="18"/>
+                <w:szCs w:val="18"/>
+                <w:color w:val="000000"/>
+              </w:rPr>
+              <w:t xml:space="preserve"/>
+            </w:r>
+          </w:p>
+        </w:tc>
       </w:tr>
       <w:tr>
         <w:trPr>
@@ -3747,6 +4354,61 @@
             </w:r>
           </w:p>
         </w:tc>
+        <w:tc>
+          <w:tcPr>
+            <w:tcBorders>
+              <w:bottom w:val="none" w:sz="0" w:space="0" w:color="000000"/>
+              <w:top w:val="none" w:sz="0" w:space="0" w:color="000000"/>
+              <w:left w:val="none" w:sz="0" w:space="0" w:color="000000"/>
+              <w:right w:val="none" w:sz="0" w:space="0" w:color="000000"/>
+            </w:tcBorders>
+            <w:shd w:val="clear" w:color="auto" w:fill="FFFFFF"/>
+            <w:tcMar>
+              <w:top w:w="0" w:type="dxa"/>
+              <w:bottom w:w="0" w:type="dxa"/>
+              <w:left w:w="0" w:type="dxa"/>
+              <w:right w:w="0" w:type="dxa"/>
+            </w:tcMar>
+            <w:vAlign w:val="top"/>
+          </w:tcPr>
+          <w:p>
+            <w:pPr>
+              <w:pStyle w:val="Normal"/>
+              <w:jc w:val="center"/>
+              <w:pBdr>
+                <w:bottom w:val="none" w:sz="0" w:space="0" w:color="000000"/>
+                <w:top w:val="none" w:sz="0" w:space="0" w:color="000000"/>
+                <w:left w:val="none" w:sz="0" w:space="0" w:color="000000"/>
+                <w:right w:val="none" w:sz="0" w:space="0" w:color="000000"/>
+              </w:pBdr>
+              <w:spacing w:after="100" w:before="100" w:line="240"/>
+              <w:ind w:left="100" w:right="100" w:firstLine="0" w:firstLineChars="0"/>
+              <w:rPr>
+                <w:rFonts w:ascii="Times New Roman" w:hAnsi="Times New Roman" w:eastAsia="Times New Roman" w:cs="Times New Roman"/>
+                <w:i w:val="false"/>
+                <w:b w:val="false"/>
+                <w:u w:val="none"/>
+                <w:strike w:val="false"/>
+                <w:sz w:val="18"/>
+                <w:szCs w:val="18"/>
+                <w:color w:val="000000"/>
+              </w:rPr>
+            </w:pPr>
+            <w:r>
+              <w:rPr>
+                <w:rFonts w:ascii="Times New Roman" w:hAnsi="Times New Roman" w:eastAsia="Times New Roman" w:cs="Times New Roman"/>
+                <w:i w:val="false"/>
+                <w:b w:val="false"/>
+                <w:u w:val="none"/>
+                <w:strike w:val="false"/>
+                <w:sz w:val="18"/>
+                <w:szCs w:val="18"/>
+                <w:color w:val="000000"/>
+              </w:rPr>
+              <w:t xml:space="preserve"/>
+            </w:r>
+          </w:p>
+        </w:tc>
       </w:tr>
       <w:tr>
         <w:trPr>
@@ -4027,6 +4689,61 @@
             </w:r>
           </w:p>
         </w:tc>
+        <w:tc>
+          <w:tcPr>
+            <w:tcBorders>
+              <w:bottom w:val="none" w:sz="0" w:space="0" w:color="000000"/>
+              <w:top w:val="none" w:sz="0" w:space="0" w:color="000000"/>
+              <w:left w:val="none" w:sz="0" w:space="0" w:color="000000"/>
+              <w:right w:val="none" w:sz="0" w:space="0" w:color="000000"/>
+            </w:tcBorders>
+            <w:shd w:val="clear" w:color="auto" w:fill="FFFFFF"/>
+            <w:tcMar>
+              <w:top w:w="0" w:type="dxa"/>
+              <w:bottom w:w="0" w:type="dxa"/>
+              <w:left w:w="0" w:type="dxa"/>
+              <w:right w:w="0" w:type="dxa"/>
+            </w:tcMar>
+            <w:vAlign w:val="top"/>
+          </w:tcPr>
+          <w:p>
+            <w:pPr>
+              <w:pStyle w:val="Normal"/>
+              <w:jc w:val="center"/>
+              <w:pBdr>
+                <w:bottom w:val="none" w:sz="0" w:space="0" w:color="000000"/>
+                <w:top w:val="none" w:sz="0" w:space="0" w:color="000000"/>
+                <w:left w:val="none" w:sz="0" w:space="0" w:color="000000"/>
+                <w:right w:val="none" w:sz="0" w:space="0" w:color="000000"/>
+              </w:pBdr>
+              <w:spacing w:after="100" w:before="100" w:line="240"/>
+              <w:ind w:left="100" w:right="100" w:firstLine="0" w:firstLineChars="0"/>
+              <w:rPr>
+                <w:rFonts w:ascii="Times New Roman" w:hAnsi="Times New Roman" w:eastAsia="Times New Roman" w:cs="Times New Roman"/>
+                <w:i w:val="false"/>
+                <w:b w:val="false"/>
+                <w:u w:val="none"/>
+                <w:strike w:val="false"/>
+                <w:sz w:val="18"/>
+                <w:szCs w:val="18"/>
+                <w:color w:val="000000"/>
+              </w:rPr>
+            </w:pPr>
+            <w:r>
+              <w:rPr>
+                <w:rFonts w:ascii="Times New Roman" w:hAnsi="Times New Roman" w:eastAsia="Times New Roman" w:cs="Times New Roman"/>
+                <w:i w:val="false"/>
+                <w:b w:val="false"/>
+                <w:u w:val="none"/>
+                <w:strike w:val="false"/>
+                <w:sz w:val="18"/>
+                <w:szCs w:val="18"/>
+                <w:color w:val="000000"/>
+              </w:rPr>
+              <w:t xml:space="preserve"/>
+            </w:r>
+          </w:p>
+        </w:tc>
       </w:tr>
       <w:tr>
         <w:trPr>
@@ -4307,6 +5024,61 @@
             </w:r>
           </w:p>
         </w:tc>
+        <w:tc>
+          <w:tcPr>
+            <w:tcBorders>
+              <w:bottom w:val="none" w:sz="0" w:space="0" w:color="000000"/>
+              <w:top w:val="none" w:sz="0" w:space="0" w:color="000000"/>
+              <w:left w:val="none" w:sz="0" w:space="0" w:color="000000"/>
+              <w:right w:val="none" w:sz="0" w:space="0" w:color="000000"/>
+            </w:tcBorders>
+            <w:shd w:val="clear" w:color="auto" w:fill="FFFFFF"/>
+            <w:tcMar>
+              <w:top w:w="0" w:type="dxa"/>
+              <w:bottom w:w="0" w:type="dxa"/>
+              <w:left w:w="0" w:type="dxa"/>
+              <w:right w:w="0" w:type="dxa"/>
+            </w:tcMar>
+            <w:vAlign w:val="top"/>
+          </w:tcPr>
+          <w:p>
+            <w:pPr>
+              <w:pStyle w:val="Normal"/>
+              <w:jc w:val="center"/>
+              <w:pBdr>
+                <w:bottom w:val="none" w:sz="0" w:space="0" w:color="000000"/>
+                <w:top w:val="none" w:sz="0" w:space="0" w:color="000000"/>
+                <w:left w:val="none" w:sz="0" w:space="0" w:color="000000"/>
+                <w:right w:val="none" w:sz="0" w:space="0" w:color="000000"/>
+              </w:pBdr>
+              <w:spacing w:after="100" w:before="100" w:line="240"/>
+              <w:ind w:left="100" w:right="100" w:firstLine="0" w:firstLineChars="0"/>
+              <w:rPr>
+                <w:rFonts w:ascii="Times New Roman" w:hAnsi="Times New Roman" w:eastAsia="Times New Roman" w:cs="Times New Roman"/>
+                <w:i w:val="false"/>
+                <w:b w:val="false"/>
+                <w:u w:val="none"/>
+                <w:strike w:val="false"/>
+                <w:sz w:val="18"/>
+                <w:szCs w:val="18"/>
+                <w:color w:val="000000"/>
+              </w:rPr>
+            </w:pPr>
+            <w:r>
+              <w:rPr>
+                <w:rFonts w:ascii="Times New Roman" w:hAnsi="Times New Roman" w:eastAsia="Times New Roman" w:cs="Times New Roman"/>
+                <w:i w:val="false"/>
+                <w:b w:val="false"/>
+                <w:u w:val="none"/>
+                <w:strike w:val="false"/>
+                <w:sz w:val="18"/>
+                <w:szCs w:val="18"/>
+                <w:color w:val="000000"/>
+              </w:rPr>
+              <w:t xml:space="preserve"/>
+            </w:r>
+          </w:p>
+        </w:tc>
       </w:tr>
       <w:tr>
         <w:trPr>
@@ -4587,6 +5359,61 @@
             </w:r>
           </w:p>
         </w:tc>
+        <w:tc>
+          <w:tcPr>
+            <w:tcBorders>
+              <w:bottom w:val="none" w:sz="0" w:space="0" w:color="000000"/>
+              <w:top w:val="none" w:sz="0" w:space="0" w:color="000000"/>
+              <w:left w:val="none" w:sz="0" w:space="0" w:color="000000"/>
+              <w:right w:val="none" w:sz="0" w:space="0" w:color="000000"/>
+            </w:tcBorders>
+            <w:shd w:val="clear" w:color="auto" w:fill="FFFFFF"/>
+            <w:tcMar>
+              <w:top w:w="0" w:type="dxa"/>
+              <w:bottom w:w="0" w:type="dxa"/>
+              <w:left w:w="0" w:type="dxa"/>
+              <w:right w:w="0" w:type="dxa"/>
+            </w:tcMar>
+            <w:vAlign w:val="top"/>
+          </w:tcPr>
+          <w:p>
+            <w:pPr>
+              <w:pStyle w:val="Normal"/>
+              <w:jc w:val="center"/>
+              <w:pBdr>
+                <w:bottom w:val="none" w:sz="0" w:space="0" w:color="000000"/>
+                <w:top w:val="none" w:sz="0" w:space="0" w:color="000000"/>
+                <w:left w:val="none" w:sz="0" w:space="0" w:color="000000"/>
+                <w:right w:val="none" w:sz="0" w:space="0" w:color="000000"/>
+              </w:pBdr>
+              <w:spacing w:after="100" w:before="100" w:line="240"/>
+              <w:ind w:left="100" w:right="100" w:firstLine="0" w:firstLineChars="0"/>
+              <w:rPr>
+                <w:rFonts w:ascii="Times New Roman" w:hAnsi="Times New Roman" w:eastAsia="Times New Roman" w:cs="Times New Roman"/>
+                <w:i w:val="false"/>
+                <w:b w:val="false"/>
+                <w:u w:val="none"/>
+                <w:strike w:val="false"/>
+                <w:sz w:val="18"/>
+                <w:szCs w:val="18"/>
+                <w:color w:val="000000"/>
+              </w:rPr>
+            </w:pPr>
+            <w:r>
+              <w:rPr>
+                <w:rFonts w:ascii="Times New Roman" w:hAnsi="Times New Roman" w:eastAsia="Times New Roman" w:cs="Times New Roman"/>
+                <w:i w:val="false"/>
+                <w:b w:val="false"/>
+                <w:u w:val="none"/>
+                <w:strike w:val="false"/>
+                <w:sz w:val="18"/>
+                <w:szCs w:val="18"/>
+                <w:color w:val="000000"/>
+              </w:rPr>
+              <w:t xml:space="preserve">0.082</w:t>
+            </w:r>
+          </w:p>
+        </w:tc>
       </w:tr>
       <w:tr>
         <w:trPr>
@@ -4867,6 +5694,61 @@
             </w:r>
           </w:p>
         </w:tc>
+        <w:tc>
+          <w:tcPr>
+            <w:tcBorders>
+              <w:bottom w:val="none" w:sz="0" w:space="0" w:color="000000"/>
+              <w:top w:val="none" w:sz="0" w:space="0" w:color="000000"/>
+              <w:left w:val="none" w:sz="0" w:space="0" w:color="000000"/>
+              <w:right w:val="none" w:sz="0" w:space="0" w:color="000000"/>
+            </w:tcBorders>
+            <w:shd w:val="clear" w:color="auto" w:fill="FFFFFF"/>
+            <w:tcMar>
+              <w:top w:w="0" w:type="dxa"/>
+              <w:bottom w:w="0" w:type="dxa"/>
+              <w:left w:w="0" w:type="dxa"/>
+              <w:right w:w="0" w:type="dxa"/>
+            </w:tcMar>
+            <w:vAlign w:val="top"/>
+          </w:tcPr>
+          <w:p>
+            <w:pPr>
+              <w:pStyle w:val="Normal"/>
+              <w:jc w:val="center"/>
+              <w:pBdr>
+                <w:bottom w:val="none" w:sz="0" w:space="0" w:color="000000"/>
+                <w:top w:val="none" w:sz="0" w:space="0" w:color="000000"/>
+                <w:left w:val="none" w:sz="0" w:space="0" w:color="000000"/>
+                <w:right w:val="none" w:sz="0" w:space="0" w:color="000000"/>
+              </w:pBdr>
+              <w:spacing w:after="100" w:before="100" w:line="240"/>
+              <w:ind w:left="100" w:right="100" w:firstLine="0" w:firstLineChars="0"/>
+              <w:rPr>
+                <w:rFonts w:ascii="Times New Roman" w:hAnsi="Times New Roman" w:eastAsia="Times New Roman" w:cs="Times New Roman"/>
+                <w:i w:val="false"/>
+                <w:b w:val="false"/>
+                <w:u w:val="none"/>
+                <w:strike w:val="false"/>
+                <w:sz w:val="18"/>
+                <w:szCs w:val="18"/>
+                <w:color w:val="000000"/>
+              </w:rPr>
+            </w:pPr>
+            <w:r>
+              <w:rPr>
+                <w:rFonts w:ascii="Times New Roman" w:hAnsi="Times New Roman" w:eastAsia="Times New Roman" w:cs="Times New Roman"/>
+                <w:i w:val="false"/>
+                <w:b w:val="false"/>
+                <w:u w:val="none"/>
+                <w:strike w:val="false"/>
+                <w:sz w:val="18"/>
+                <w:szCs w:val="18"/>
+                <w:color w:val="000000"/>
+              </w:rPr>
+              <w:t xml:space="preserve"/>
+            </w:r>
+          </w:p>
+        </w:tc>
       </w:tr>
       <w:tr>
         <w:trPr>
@@ -5147,6 +6029,61 @@
             </w:r>
           </w:p>
         </w:tc>
+        <w:tc>
+          <w:tcPr>
+            <w:tcBorders>
+              <w:bottom w:val="none" w:sz="0" w:space="0" w:color="000000"/>
+              <w:top w:val="none" w:sz="0" w:space="0" w:color="000000"/>
+              <w:left w:val="none" w:sz="0" w:space="0" w:color="000000"/>
+              <w:right w:val="none" w:sz="0" w:space="0" w:color="000000"/>
+            </w:tcBorders>
+            <w:shd w:val="clear" w:color="auto" w:fill="FFFFFF"/>
+            <w:tcMar>
+              <w:top w:w="0" w:type="dxa"/>
+              <w:bottom w:w="0" w:type="dxa"/>
+              <w:left w:w="0" w:type="dxa"/>
+              <w:right w:w="0" w:type="dxa"/>
+            </w:tcMar>
+            <w:vAlign w:val="top"/>
+          </w:tcPr>
+          <w:p>
+            <w:pPr>
+              <w:pStyle w:val="Normal"/>
+              <w:jc w:val="center"/>
+              <w:pBdr>
+                <w:bottom w:val="none" w:sz="0" w:space="0" w:color="000000"/>
+                <w:top w:val="none" w:sz="0" w:space="0" w:color="000000"/>
+                <w:left w:val="none" w:sz="0" w:space="0" w:color="000000"/>
+                <w:right w:val="none" w:sz="0" w:space="0" w:color="000000"/>
+              </w:pBdr>
+              <w:spacing w:after="100" w:before="100" w:line="240"/>
+              <w:ind w:left="100" w:right="100" w:firstLine="0" w:firstLineChars="0"/>
+              <w:rPr>
+                <w:rFonts w:ascii="Times New Roman" w:hAnsi="Times New Roman" w:eastAsia="Times New Roman" w:cs="Times New Roman"/>
+                <w:i w:val="false"/>
+                <w:b w:val="false"/>
+                <w:u w:val="none"/>
+                <w:strike w:val="false"/>
+                <w:sz w:val="18"/>
+                <w:szCs w:val="18"/>
+                <w:color w:val="000000"/>
+              </w:rPr>
+            </w:pPr>
+            <w:r>
+              <w:rPr>
+                <w:rFonts w:ascii="Times New Roman" w:hAnsi="Times New Roman" w:eastAsia="Times New Roman" w:cs="Times New Roman"/>
+                <w:i w:val="false"/>
+                <w:b w:val="false"/>
+                <w:u w:val="none"/>
+                <w:strike w:val="false"/>
+                <w:sz w:val="18"/>
+                <w:szCs w:val="18"/>
+                <w:color w:val="000000"/>
+              </w:rPr>
+              <w:t xml:space="preserve"/>
+            </w:r>
+          </w:p>
+        </w:tc>
       </w:tr>
       <w:tr>
         <w:trPr>
@@ -5427,6 +6364,61 @@
             </w:r>
           </w:p>
         </w:tc>
+        <w:tc>
+          <w:tcPr>
+            <w:tcBorders>
+              <w:bottom w:val="none" w:sz="0" w:space="0" w:color="000000"/>
+              <w:top w:val="none" w:sz="0" w:space="0" w:color="000000"/>
+              <w:left w:val="none" w:sz="0" w:space="0" w:color="000000"/>
+              <w:right w:val="none" w:sz="0" w:space="0" w:color="000000"/>
+            </w:tcBorders>
+            <w:shd w:val="clear" w:color="auto" w:fill="FFFFFF"/>
+            <w:tcMar>
+              <w:top w:w="0" w:type="dxa"/>
+              <w:bottom w:w="0" w:type="dxa"/>
+              <w:left w:w="0" w:type="dxa"/>
+              <w:right w:w="0" w:type="dxa"/>
+            </w:tcMar>
+            <w:vAlign w:val="top"/>
+          </w:tcPr>
+          <w:p>
+            <w:pPr>
+              <w:pStyle w:val="Normal"/>
+              <w:jc w:val="center"/>
+              <w:pBdr>
+                <w:bottom w:val="none" w:sz="0" w:space="0" w:color="000000"/>
+                <w:top w:val="none" w:sz="0" w:space="0" w:color="000000"/>
+                <w:left w:val="none" w:sz="0" w:space="0" w:color="000000"/>
+                <w:right w:val="none" w:sz="0" w:space="0" w:color="000000"/>
+              </w:pBdr>
+              <w:spacing w:after="100" w:before="100" w:line="240"/>
+              <w:ind w:left="100" w:right="100" w:firstLine="0" w:firstLineChars="0"/>
+              <w:rPr>
+                <w:rFonts w:ascii="Times New Roman" w:hAnsi="Times New Roman" w:eastAsia="Times New Roman" w:cs="Times New Roman"/>
+                <w:i w:val="false"/>
+                <w:b w:val="false"/>
+                <w:u w:val="none"/>
+                <w:strike w:val="false"/>
+                <w:sz w:val="18"/>
+                <w:szCs w:val="18"/>
+                <w:color w:val="000000"/>
+              </w:rPr>
+            </w:pPr>
+            <w:r>
+              <w:rPr>
+                <w:rFonts w:ascii="Times New Roman" w:hAnsi="Times New Roman" w:eastAsia="Times New Roman" w:cs="Times New Roman"/>
+                <w:i w:val="false"/>
+                <w:b w:val="false"/>
+                <w:u w:val="none"/>
+                <w:strike w:val="false"/>
+                <w:sz w:val="18"/>
+                <w:szCs w:val="18"/>
+                <w:color w:val="000000"/>
+              </w:rPr>
+              <w:t xml:space="preserve"/>
+            </w:r>
+          </w:p>
+        </w:tc>
       </w:tr>
       <w:tr>
         <w:trPr>
@@ -5707,6 +6699,61 @@
             </w:r>
           </w:p>
         </w:tc>
+        <w:tc>
+          <w:tcPr>
+            <w:tcBorders>
+              <w:bottom w:val="none" w:sz="0" w:space="0" w:color="000000"/>
+              <w:top w:val="none" w:sz="0" w:space="0" w:color="000000"/>
+              <w:left w:val="none" w:sz="0" w:space="0" w:color="000000"/>
+              <w:right w:val="none" w:sz="0" w:space="0" w:color="000000"/>
+            </w:tcBorders>
+            <w:shd w:val="clear" w:color="auto" w:fill="FFFFFF"/>
+            <w:tcMar>
+              <w:top w:w="0" w:type="dxa"/>
+              <w:bottom w:w="0" w:type="dxa"/>
+              <w:left w:w="0" w:type="dxa"/>
+              <w:right w:w="0" w:type="dxa"/>
+            </w:tcMar>
+            <w:vAlign w:val="top"/>
+          </w:tcPr>
+          <w:p>
+            <w:pPr>
+              <w:pStyle w:val="Normal"/>
+              <w:jc w:val="center"/>
+              <w:pBdr>
+                <w:bottom w:val="none" w:sz="0" w:space="0" w:color="000000"/>
+                <w:top w:val="none" w:sz="0" w:space="0" w:color="000000"/>
+                <w:left w:val="none" w:sz="0" w:space="0" w:color="000000"/>
+                <w:right w:val="none" w:sz="0" w:space="0" w:color="000000"/>
+              </w:pBdr>
+              <w:spacing w:after="100" w:before="100" w:line="240"/>
+              <w:ind w:left="100" w:right="100" w:firstLine="0" w:firstLineChars="0"/>
+              <w:rPr>
+                <w:rFonts w:ascii="Times New Roman" w:hAnsi="Times New Roman" w:eastAsia="Times New Roman" w:cs="Times New Roman"/>
+                <w:i w:val="false"/>
+                <w:b w:val="false"/>
+                <w:u w:val="none"/>
+                <w:strike w:val="false"/>
+                <w:sz w:val="18"/>
+                <w:szCs w:val="18"/>
+                <w:color w:val="000000"/>
+              </w:rPr>
+            </w:pPr>
+            <w:r>
+              <w:rPr>
+                <w:rFonts w:ascii="Times New Roman" w:hAnsi="Times New Roman" w:eastAsia="Times New Roman" w:cs="Times New Roman"/>
+                <w:i w:val="false"/>
+                <w:b w:val="false"/>
+                <w:u w:val="none"/>
+                <w:strike w:val="false"/>
+                <w:sz w:val="18"/>
+                <w:szCs w:val="18"/>
+                <w:color w:val="000000"/>
+              </w:rPr>
+              <w:t xml:space="preserve"/>
+            </w:r>
+          </w:p>
+        </w:tc>
       </w:tr>
       <w:tr>
         <w:trPr>
@@ -5987,6 +7034,61 @@
             </w:r>
           </w:p>
         </w:tc>
+        <w:tc>
+          <w:tcPr>
+            <w:tcBorders>
+              <w:bottom w:val="none" w:sz="0" w:space="0" w:color="000000"/>
+              <w:top w:val="none" w:sz="0" w:space="0" w:color="000000"/>
+              <w:left w:val="none" w:sz="0" w:space="0" w:color="000000"/>
+              <w:right w:val="none" w:sz="0" w:space="0" w:color="000000"/>
+            </w:tcBorders>
+            <w:shd w:val="clear" w:color="auto" w:fill="FFFFFF"/>
+            <w:tcMar>
+              <w:top w:w="0" w:type="dxa"/>
+              <w:bottom w:w="0" w:type="dxa"/>
+              <w:left w:w="0" w:type="dxa"/>
+              <w:right w:w="0" w:type="dxa"/>
+            </w:tcMar>
+            <w:vAlign w:val="top"/>
+          </w:tcPr>
+          <w:p>
+            <w:pPr>
+              <w:pStyle w:val="Normal"/>
+              <w:jc w:val="center"/>
+              <w:pBdr>
+                <w:bottom w:val="none" w:sz="0" w:space="0" w:color="000000"/>
+                <w:top w:val="none" w:sz="0" w:space="0" w:color="000000"/>
+                <w:left w:val="none" w:sz="0" w:space="0" w:color="000000"/>
+                <w:right w:val="none" w:sz="0" w:space="0" w:color="000000"/>
+              </w:pBdr>
+              <w:spacing w:after="100" w:before="100" w:line="240"/>
+              <w:ind w:left="100" w:right="100" w:firstLine="0" w:firstLineChars="0"/>
+              <w:rPr>
+                <w:rFonts w:ascii="Times New Roman" w:hAnsi="Times New Roman" w:eastAsia="Times New Roman" w:cs="Times New Roman"/>
+                <w:i w:val="false"/>
+                <w:b w:val="false"/>
+                <w:u w:val="none"/>
+                <w:strike w:val="false"/>
+                <w:sz w:val="18"/>
+                <w:szCs w:val="18"/>
+                <w:color w:val="000000"/>
+              </w:rPr>
+            </w:pPr>
+            <w:r>
+              <w:rPr>
+                <w:rFonts w:ascii="Times New Roman" w:hAnsi="Times New Roman" w:eastAsia="Times New Roman" w:cs="Times New Roman"/>
+                <w:i w:val="false"/>
+                <w:b w:val="false"/>
+                <w:u w:val="none"/>
+                <w:strike w:val="false"/>
+                <w:sz w:val="18"/>
+                <w:szCs w:val="18"/>
+                <w:color w:val="000000"/>
+              </w:rPr>
+              <w:t xml:space="preserve">0.510</w:t>
+            </w:r>
+          </w:p>
+        </w:tc>
       </w:tr>
       <w:tr>
         <w:trPr>
@@ -6267,6 +7369,61 @@
             </w:r>
           </w:p>
         </w:tc>
+        <w:tc>
+          <w:tcPr>
+            <w:tcBorders>
+              <w:bottom w:val="none" w:sz="0" w:space="0" w:color="000000"/>
+              <w:top w:val="none" w:sz="0" w:space="0" w:color="000000"/>
+              <w:left w:val="none" w:sz="0" w:space="0" w:color="000000"/>
+              <w:right w:val="none" w:sz="0" w:space="0" w:color="000000"/>
+            </w:tcBorders>
+            <w:shd w:val="clear" w:color="auto" w:fill="FFFFFF"/>
+            <w:tcMar>
+              <w:top w:w="0" w:type="dxa"/>
+              <w:bottom w:w="0" w:type="dxa"/>
+              <w:left w:w="0" w:type="dxa"/>
+              <w:right w:w="0" w:type="dxa"/>
+            </w:tcMar>
+            <w:vAlign w:val="top"/>
+          </w:tcPr>
+          <w:p>
+            <w:pPr>
+              <w:pStyle w:val="Normal"/>
+              <w:jc w:val="center"/>
+              <w:pBdr>
+                <w:bottom w:val="none" w:sz="0" w:space="0" w:color="000000"/>
+                <w:top w:val="none" w:sz="0" w:space="0" w:color="000000"/>
+                <w:left w:val="none" w:sz="0" w:space="0" w:color="000000"/>
+                <w:right w:val="none" w:sz="0" w:space="0" w:color="000000"/>
+              </w:pBdr>
+              <w:spacing w:after="100" w:before="100" w:line="240"/>
+              <w:ind w:left="100" w:right="100" w:firstLine="0" w:firstLineChars="0"/>
+              <w:rPr>
+                <w:rFonts w:ascii="Times New Roman" w:hAnsi="Times New Roman" w:eastAsia="Times New Roman" w:cs="Times New Roman"/>
+                <w:i w:val="false"/>
+                <w:b w:val="false"/>
+                <w:u w:val="none"/>
+                <w:strike w:val="false"/>
+                <w:sz w:val="18"/>
+                <w:szCs w:val="18"/>
+                <w:color w:val="000000"/>
+              </w:rPr>
+            </w:pPr>
+            <w:r>
+              <w:rPr>
+                <w:rFonts w:ascii="Times New Roman" w:hAnsi="Times New Roman" w:eastAsia="Times New Roman" w:cs="Times New Roman"/>
+                <w:i w:val="false"/>
+                <w:b w:val="false"/>
+                <w:u w:val="none"/>
+                <w:strike w:val="false"/>
+                <w:sz w:val="18"/>
+                <w:szCs w:val="18"/>
+                <w:color w:val="000000"/>
+              </w:rPr>
+              <w:t xml:space="preserve"/>
+            </w:r>
+          </w:p>
+        </w:tc>
       </w:tr>
       <w:tr>
         <w:trPr>
@@ -6547,6 +7704,61 @@
             </w:r>
           </w:p>
         </w:tc>
+        <w:tc>
+          <w:tcPr>
+            <w:tcBorders>
+              <w:bottom w:val="none" w:sz="0" w:space="0" w:color="000000"/>
+              <w:top w:val="none" w:sz="0" w:space="0" w:color="000000"/>
+              <w:left w:val="none" w:sz="0" w:space="0" w:color="000000"/>
+              <w:right w:val="none" w:sz="0" w:space="0" w:color="000000"/>
+            </w:tcBorders>
+            <w:shd w:val="clear" w:color="auto" w:fill="FFFFFF"/>
+            <w:tcMar>
+              <w:top w:w="0" w:type="dxa"/>
+              <w:bottom w:w="0" w:type="dxa"/>
+              <w:left w:w="0" w:type="dxa"/>
+              <w:right w:w="0" w:type="dxa"/>
+            </w:tcMar>
+            <w:vAlign w:val="top"/>
+          </w:tcPr>
+          <w:p>
+            <w:pPr>
+              <w:pStyle w:val="Normal"/>
+              <w:jc w:val="center"/>
+              <w:pBdr>
+                <w:bottom w:val="none" w:sz="0" w:space="0" w:color="000000"/>
+                <w:top w:val="none" w:sz="0" w:space="0" w:color="000000"/>
+                <w:left w:val="none" w:sz="0" w:space="0" w:color="000000"/>
+                <w:right w:val="none" w:sz="0" w:space="0" w:color="000000"/>
+              </w:pBdr>
+              <w:spacing w:after="100" w:before="100" w:line="240"/>
+              <w:ind w:left="100" w:right="100" w:firstLine="0" w:firstLineChars="0"/>
+              <w:rPr>
+                <w:rFonts w:ascii="Times New Roman" w:hAnsi="Times New Roman" w:eastAsia="Times New Roman" w:cs="Times New Roman"/>
+                <w:i w:val="false"/>
+                <w:b w:val="false"/>
+                <w:u w:val="none"/>
+                <w:strike w:val="false"/>
+                <w:sz w:val="18"/>
+                <w:szCs w:val="18"/>
+                <w:color w:val="000000"/>
+              </w:rPr>
+            </w:pPr>
+            <w:r>
+              <w:rPr>
+                <w:rFonts w:ascii="Times New Roman" w:hAnsi="Times New Roman" w:eastAsia="Times New Roman" w:cs="Times New Roman"/>
+                <w:i w:val="false"/>
+                <w:b w:val="false"/>
+                <w:u w:val="none"/>
+                <w:strike w:val="false"/>
+                <w:sz w:val="18"/>
+                <w:szCs w:val="18"/>
+                <w:color w:val="000000"/>
+              </w:rPr>
+              <w:t xml:space="preserve"/>
+            </w:r>
+          </w:p>
+        </w:tc>
       </w:tr>
       <w:tr>
         <w:trPr>
@@ -6827,6 +8039,61 @@
             </w:r>
           </w:p>
         </w:tc>
+        <w:tc>
+          <w:tcPr>
+            <w:tcBorders>
+              <w:bottom w:val="none" w:sz="0" w:space="0" w:color="000000"/>
+              <w:top w:val="none" w:sz="0" w:space="0" w:color="000000"/>
+              <w:left w:val="none" w:sz="0" w:space="0" w:color="000000"/>
+              <w:right w:val="none" w:sz="0" w:space="0" w:color="000000"/>
+            </w:tcBorders>
+            <w:shd w:val="clear" w:color="auto" w:fill="FFFFFF"/>
+            <w:tcMar>
+              <w:top w:w="0" w:type="dxa"/>
+              <w:bottom w:w="0" w:type="dxa"/>
+              <w:left w:w="0" w:type="dxa"/>
+              <w:right w:w="0" w:type="dxa"/>
+            </w:tcMar>
+            <w:vAlign w:val="top"/>
+          </w:tcPr>
+          <w:p>
+            <w:pPr>
+              <w:pStyle w:val="Normal"/>
+              <w:jc w:val="center"/>
+              <w:pBdr>
+                <w:bottom w:val="none" w:sz="0" w:space="0" w:color="000000"/>
+                <w:top w:val="none" w:sz="0" w:space="0" w:color="000000"/>
+                <w:left w:val="none" w:sz="0" w:space="0" w:color="000000"/>
+                <w:right w:val="none" w:sz="0" w:space="0" w:color="000000"/>
+              </w:pBdr>
+              <w:spacing w:after="100" w:before="100" w:line="240"/>
+              <w:ind w:left="100" w:right="100" w:firstLine="0" w:firstLineChars="0"/>
+              <w:rPr>
+                <w:rFonts w:ascii="Times New Roman" w:hAnsi="Times New Roman" w:eastAsia="Times New Roman" w:cs="Times New Roman"/>
+                <w:i w:val="false"/>
+                <w:b w:val="false"/>
+                <w:u w:val="none"/>
+                <w:strike w:val="false"/>
+                <w:sz w:val="18"/>
+                <w:szCs w:val="18"/>
+                <w:color w:val="000000"/>
+              </w:rPr>
+            </w:pPr>
+            <w:r>
+              <w:rPr>
+                <w:rFonts w:ascii="Times New Roman" w:hAnsi="Times New Roman" w:eastAsia="Times New Roman" w:cs="Times New Roman"/>
+                <w:i w:val="false"/>
+                <w:b w:val="false"/>
+                <w:u w:val="none"/>
+                <w:strike w:val="false"/>
+                <w:sz w:val="18"/>
+                <w:szCs w:val="18"/>
+                <w:color w:val="000000"/>
+              </w:rPr>
+              <w:t xml:space="preserve"/>
+            </w:r>
+          </w:p>
+        </w:tc>
       </w:tr>
       <w:tr>
         <w:trPr>
@@ -7107,6 +8374,61 @@
             </w:r>
           </w:p>
         </w:tc>
+        <w:tc>
+          <w:tcPr>
+            <w:tcBorders>
+              <w:bottom w:val="none" w:sz="0" w:space="0" w:color="000000"/>
+              <w:top w:val="none" w:sz="0" w:space="0" w:color="000000"/>
+              <w:left w:val="none" w:sz="0" w:space="0" w:color="000000"/>
+              <w:right w:val="none" w:sz="0" w:space="0" w:color="000000"/>
+            </w:tcBorders>
+            <w:shd w:val="clear" w:color="auto" w:fill="FFFFFF"/>
+            <w:tcMar>
+              <w:top w:w="0" w:type="dxa"/>
+              <w:bottom w:w="0" w:type="dxa"/>
+              <w:left w:w="0" w:type="dxa"/>
+              <w:right w:w="0" w:type="dxa"/>
+            </w:tcMar>
+            <w:vAlign w:val="top"/>
+          </w:tcPr>
+          <w:p>
+            <w:pPr>
+              <w:pStyle w:val="Normal"/>
+              <w:jc w:val="center"/>
+              <w:pBdr>
+                <w:bottom w:val="none" w:sz="0" w:space="0" w:color="000000"/>
+                <w:top w:val="none" w:sz="0" w:space="0" w:color="000000"/>
+                <w:left w:val="none" w:sz="0" w:space="0" w:color="000000"/>
+                <w:right w:val="none" w:sz="0" w:space="0" w:color="000000"/>
+              </w:pBdr>
+              <w:spacing w:after="100" w:before="100" w:line="240"/>
+              <w:ind w:left="100" w:right="100" w:firstLine="0" w:firstLineChars="0"/>
+              <w:rPr>
+                <w:rFonts w:ascii="Times New Roman" w:hAnsi="Times New Roman" w:eastAsia="Times New Roman" w:cs="Times New Roman"/>
+                <w:i w:val="false"/>
+                <w:b w:val="false"/>
+                <w:u w:val="none"/>
+                <w:strike w:val="false"/>
+                <w:sz w:val="18"/>
+                <w:szCs w:val="18"/>
+                <w:color w:val="000000"/>
+              </w:rPr>
+            </w:pPr>
+            <w:r>
+              <w:rPr>
+                <w:rFonts w:ascii="Times New Roman" w:hAnsi="Times New Roman" w:eastAsia="Times New Roman" w:cs="Times New Roman"/>
+                <w:i w:val="false"/>
+                <w:b w:val="false"/>
+                <w:u w:val="none"/>
+                <w:strike w:val="false"/>
+                <w:sz w:val="18"/>
+                <w:szCs w:val="18"/>
+                <w:color w:val="000000"/>
+              </w:rPr>
+              <w:t xml:space="preserve">&gt;0.999</w:t>
+            </w:r>
+          </w:p>
+        </w:tc>
       </w:tr>
       <w:tr>
         <w:trPr>
@@ -7387,6 +8709,61 @@
             </w:r>
           </w:p>
         </w:tc>
+        <w:tc>
+          <w:tcPr>
+            <w:tcBorders>
+              <w:bottom w:val="none" w:sz="0" w:space="0" w:color="000000"/>
+              <w:top w:val="none" w:sz="0" w:space="0" w:color="000000"/>
+              <w:left w:val="none" w:sz="0" w:space="0" w:color="000000"/>
+              <w:right w:val="none" w:sz="0" w:space="0" w:color="000000"/>
+            </w:tcBorders>
+            <w:shd w:val="clear" w:color="auto" w:fill="FFFFFF"/>
+            <w:tcMar>
+              <w:top w:w="0" w:type="dxa"/>
+              <w:bottom w:w="0" w:type="dxa"/>
+              <w:left w:w="0" w:type="dxa"/>
+              <w:right w:w="0" w:type="dxa"/>
+            </w:tcMar>
+            <w:vAlign w:val="top"/>
+          </w:tcPr>
+          <w:p>
+            <w:pPr>
+              <w:pStyle w:val="Normal"/>
+              <w:jc w:val="center"/>
+              <w:pBdr>
+                <w:bottom w:val="none" w:sz="0" w:space="0" w:color="000000"/>
+                <w:top w:val="none" w:sz="0" w:space="0" w:color="000000"/>
+                <w:left w:val="none" w:sz="0" w:space="0" w:color="000000"/>
+                <w:right w:val="none" w:sz="0" w:space="0" w:color="000000"/>
+              </w:pBdr>
+              <w:spacing w:after="100" w:before="100" w:line="240"/>
+              <w:ind w:left="100" w:right="100" w:firstLine="0" w:firstLineChars="0"/>
+              <w:rPr>
+                <w:rFonts w:ascii="Times New Roman" w:hAnsi="Times New Roman" w:eastAsia="Times New Roman" w:cs="Times New Roman"/>
+                <w:i w:val="false"/>
+                <w:b w:val="false"/>
+                <w:u w:val="none"/>
+                <w:strike w:val="false"/>
+                <w:sz w:val="18"/>
+                <w:szCs w:val="18"/>
+                <w:color w:val="000000"/>
+              </w:rPr>
+            </w:pPr>
+            <w:r>
+              <w:rPr>
+                <w:rFonts w:ascii="Times New Roman" w:hAnsi="Times New Roman" w:eastAsia="Times New Roman" w:cs="Times New Roman"/>
+                <w:i w:val="false"/>
+                <w:b w:val="false"/>
+                <w:u w:val="none"/>
+                <w:strike w:val="false"/>
+                <w:sz w:val="18"/>
+                <w:szCs w:val="18"/>
+                <w:color w:val="000000"/>
+              </w:rPr>
+              <w:t xml:space="preserve"/>
+            </w:r>
+          </w:p>
+        </w:tc>
       </w:tr>
       <w:tr>
         <w:trPr>
@@ -7667,6 +9044,61 @@
             </w:r>
           </w:p>
         </w:tc>
+        <w:tc>
+          <w:tcPr>
+            <w:tcBorders>
+              <w:bottom w:val="none" w:sz="0" w:space="0" w:color="000000"/>
+              <w:top w:val="none" w:sz="0" w:space="0" w:color="000000"/>
+              <w:left w:val="none" w:sz="0" w:space="0" w:color="000000"/>
+              <w:right w:val="none" w:sz="0" w:space="0" w:color="000000"/>
+            </w:tcBorders>
+            <w:shd w:val="clear" w:color="auto" w:fill="FFFFFF"/>
+            <w:tcMar>
+              <w:top w:w="0" w:type="dxa"/>
+              <w:bottom w:w="0" w:type="dxa"/>
+              <w:left w:w="0" w:type="dxa"/>
+              <w:right w:w="0" w:type="dxa"/>
+            </w:tcMar>
+            <w:vAlign w:val="top"/>
+          </w:tcPr>
+          <w:p>
+            <w:pPr>
+              <w:pStyle w:val="Normal"/>
+              <w:jc w:val="center"/>
+              <w:pBdr>
+                <w:bottom w:val="none" w:sz="0" w:space="0" w:color="000000"/>
+                <w:top w:val="none" w:sz="0" w:space="0" w:color="000000"/>
+                <w:left w:val="none" w:sz="0" w:space="0" w:color="000000"/>
+                <w:right w:val="none" w:sz="0" w:space="0" w:color="000000"/>
+              </w:pBdr>
+              <w:spacing w:after="100" w:before="100" w:line="240"/>
+              <w:ind w:left="100" w:right="100" w:firstLine="0" w:firstLineChars="0"/>
+              <w:rPr>
+                <w:rFonts w:ascii="Times New Roman" w:hAnsi="Times New Roman" w:eastAsia="Times New Roman" w:cs="Times New Roman"/>
+                <w:i w:val="false"/>
+                <w:b w:val="false"/>
+                <w:u w:val="none"/>
+                <w:strike w:val="false"/>
+                <w:sz w:val="18"/>
+                <w:szCs w:val="18"/>
+                <w:color w:val="000000"/>
+              </w:rPr>
+            </w:pPr>
+            <w:r>
+              <w:rPr>
+                <w:rFonts w:ascii="Times New Roman" w:hAnsi="Times New Roman" w:eastAsia="Times New Roman" w:cs="Times New Roman"/>
+                <w:i w:val="false"/>
+                <w:b w:val="false"/>
+                <w:u w:val="none"/>
+                <w:strike w:val="false"/>
+                <w:sz w:val="18"/>
+                <w:szCs w:val="18"/>
+                <w:color w:val="000000"/>
+              </w:rPr>
+              <w:t xml:space="preserve"/>
+            </w:r>
+          </w:p>
+        </w:tc>
       </w:tr>
       <w:tr>
         <w:trPr>
@@ -7947,6 +9379,61 @@
             </w:r>
           </w:p>
         </w:tc>
+        <w:tc>
+          <w:tcPr>
+            <w:tcBorders>
+              <w:bottom w:val="none" w:sz="0" w:space="0" w:color="000000"/>
+              <w:top w:val="none" w:sz="0" w:space="0" w:color="000000"/>
+              <w:left w:val="none" w:sz="0" w:space="0" w:color="000000"/>
+              <w:right w:val="none" w:sz="0" w:space="0" w:color="000000"/>
+            </w:tcBorders>
+            <w:shd w:val="clear" w:color="auto" w:fill="FFFFFF"/>
+            <w:tcMar>
+              <w:top w:w="0" w:type="dxa"/>
+              <w:bottom w:w="0" w:type="dxa"/>
+              <w:left w:w="0" w:type="dxa"/>
+              <w:right w:w="0" w:type="dxa"/>
+            </w:tcMar>
+            <w:vAlign w:val="top"/>
+          </w:tcPr>
+          <w:p>
+            <w:pPr>
+              <w:pStyle w:val="Normal"/>
+              <w:jc w:val="center"/>
+              <w:pBdr>
+                <w:bottom w:val="none" w:sz="0" w:space="0" w:color="000000"/>
+                <w:top w:val="none" w:sz="0" w:space="0" w:color="000000"/>
+                <w:left w:val="none" w:sz="0" w:space="0" w:color="000000"/>
+                <w:right w:val="none" w:sz="0" w:space="0" w:color="000000"/>
+              </w:pBdr>
+              <w:spacing w:after="100" w:before="100" w:line="240"/>
+              <w:ind w:left="100" w:right="100" w:firstLine="0" w:firstLineChars="0"/>
+              <w:rPr>
+                <w:rFonts w:ascii="Times New Roman" w:hAnsi="Times New Roman" w:eastAsia="Times New Roman" w:cs="Times New Roman"/>
+                <w:i w:val="false"/>
+                <w:b w:val="false"/>
+                <w:u w:val="none"/>
+                <w:strike w:val="false"/>
+                <w:sz w:val="18"/>
+                <w:szCs w:val="18"/>
+                <w:color w:val="000000"/>
+              </w:rPr>
+            </w:pPr>
+            <w:r>
+              <w:rPr>
+                <w:rFonts w:ascii="Times New Roman" w:hAnsi="Times New Roman" w:eastAsia="Times New Roman" w:cs="Times New Roman"/>
+                <w:i w:val="false"/>
+                <w:b w:val="false"/>
+                <w:u w:val="none"/>
+                <w:strike w:val="false"/>
+                <w:sz w:val="18"/>
+                <w:szCs w:val="18"/>
+                <w:color w:val="000000"/>
+              </w:rPr>
+              <w:t xml:space="preserve"/>
+            </w:r>
+          </w:p>
+        </w:tc>
       </w:tr>
       <w:tr>
         <w:trPr>
@@ -8227,6 +9714,61 @@
             </w:r>
           </w:p>
         </w:tc>
+        <w:tc>
+          <w:tcPr>
+            <w:tcBorders>
+              <w:bottom w:val="none" w:sz="0" w:space="0" w:color="000000"/>
+              <w:top w:val="none" w:sz="0" w:space="0" w:color="000000"/>
+              <w:left w:val="none" w:sz="0" w:space="0" w:color="000000"/>
+              <w:right w:val="none" w:sz="0" w:space="0" w:color="000000"/>
+            </w:tcBorders>
+            <w:shd w:val="clear" w:color="auto" w:fill="FFFFFF"/>
+            <w:tcMar>
+              <w:top w:w="0" w:type="dxa"/>
+              <w:bottom w:w="0" w:type="dxa"/>
+              <w:left w:w="0" w:type="dxa"/>
+              <w:right w:w="0" w:type="dxa"/>
+            </w:tcMar>
+            <w:vAlign w:val="top"/>
+          </w:tcPr>
+          <w:p>
+            <w:pPr>
+              <w:pStyle w:val="Normal"/>
+              <w:jc w:val="center"/>
+              <w:pBdr>
+                <w:bottom w:val="none" w:sz="0" w:space="0" w:color="000000"/>
+                <w:top w:val="none" w:sz="0" w:space="0" w:color="000000"/>
+                <w:left w:val="none" w:sz="0" w:space="0" w:color="000000"/>
+                <w:right w:val="none" w:sz="0" w:space="0" w:color="000000"/>
+              </w:pBdr>
+              <w:spacing w:after="100" w:before="100" w:line="240"/>
+              <w:ind w:left="100" w:right="100" w:firstLine="0" w:firstLineChars="0"/>
+              <w:rPr>
+                <w:rFonts w:ascii="Times New Roman" w:hAnsi="Times New Roman" w:eastAsia="Times New Roman" w:cs="Times New Roman"/>
+                <w:i w:val="false"/>
+                <w:b w:val="false"/>
+                <w:u w:val="none"/>
+                <w:strike w:val="false"/>
+                <w:sz w:val="18"/>
+                <w:szCs w:val="18"/>
+                <w:color w:val="000000"/>
+              </w:rPr>
+            </w:pPr>
+            <w:r>
+              <w:rPr>
+                <w:rFonts w:ascii="Times New Roman" w:hAnsi="Times New Roman" w:eastAsia="Times New Roman" w:cs="Times New Roman"/>
+                <w:i w:val="false"/>
+                <w:b w:val="false"/>
+                <w:u w:val="none"/>
+                <w:strike w:val="false"/>
+                <w:sz w:val="18"/>
+                <w:szCs w:val="18"/>
+                <w:color w:val="000000"/>
+              </w:rPr>
+              <w:t xml:space="preserve">0.923</w:t>
+            </w:r>
+          </w:p>
+        </w:tc>
       </w:tr>
       <w:tr>
         <w:trPr>
@@ -8507,6 +10049,61 @@
             </w:r>
           </w:p>
         </w:tc>
+        <w:tc>
+          <w:tcPr>
+            <w:tcBorders>
+              <w:bottom w:val="none" w:sz="0" w:space="0" w:color="000000"/>
+              <w:top w:val="none" w:sz="0" w:space="0" w:color="000000"/>
+              <w:left w:val="none" w:sz="0" w:space="0" w:color="000000"/>
+              <w:right w:val="none" w:sz="0" w:space="0" w:color="000000"/>
+            </w:tcBorders>
+            <w:shd w:val="clear" w:color="auto" w:fill="FFFFFF"/>
+            <w:tcMar>
+              <w:top w:w="0" w:type="dxa"/>
+              <w:bottom w:w="0" w:type="dxa"/>
+              <w:left w:w="0" w:type="dxa"/>
+              <w:right w:w="0" w:type="dxa"/>
+            </w:tcMar>
+            <w:vAlign w:val="top"/>
+          </w:tcPr>
+          <w:p>
+            <w:pPr>
+              <w:pStyle w:val="Normal"/>
+              <w:jc w:val="center"/>
+              <w:pBdr>
+                <w:bottom w:val="none" w:sz="0" w:space="0" w:color="000000"/>
+                <w:top w:val="none" w:sz="0" w:space="0" w:color="000000"/>
+                <w:left w:val="none" w:sz="0" w:space="0" w:color="000000"/>
+                <w:right w:val="none" w:sz="0" w:space="0" w:color="000000"/>
+              </w:pBdr>
+              <w:spacing w:after="100" w:before="100" w:line="240"/>
+              <w:ind w:left="100" w:right="100" w:firstLine="0" w:firstLineChars="0"/>
+              <w:rPr>
+                <w:rFonts w:ascii="Times New Roman" w:hAnsi="Times New Roman" w:eastAsia="Times New Roman" w:cs="Times New Roman"/>
+                <w:i w:val="false"/>
+                <w:b w:val="false"/>
+                <w:u w:val="none"/>
+                <w:strike w:val="false"/>
+                <w:sz w:val="18"/>
+                <w:szCs w:val="18"/>
+                <w:color w:val="000000"/>
+              </w:rPr>
+            </w:pPr>
+            <w:r>
+              <w:rPr>
+                <w:rFonts w:ascii="Times New Roman" w:hAnsi="Times New Roman" w:eastAsia="Times New Roman" w:cs="Times New Roman"/>
+                <w:i w:val="false"/>
+                <w:b w:val="false"/>
+                <w:u w:val="none"/>
+                <w:strike w:val="false"/>
+                <w:sz w:val="18"/>
+                <w:szCs w:val="18"/>
+                <w:color w:val="000000"/>
+              </w:rPr>
+              <w:t xml:space="preserve"/>
+            </w:r>
+          </w:p>
+        </w:tc>
       </w:tr>
       <w:tr>
         <w:trPr>
@@ -8787,6 +10384,61 @@
             </w:r>
           </w:p>
         </w:tc>
+        <w:tc>
+          <w:tcPr>
+            <w:tcBorders>
+              <w:bottom w:val="none" w:sz="0" w:space="0" w:color="000000"/>
+              <w:top w:val="none" w:sz="0" w:space="0" w:color="000000"/>
+              <w:left w:val="none" w:sz="0" w:space="0" w:color="000000"/>
+              <w:right w:val="none" w:sz="0" w:space="0" w:color="000000"/>
+            </w:tcBorders>
+            <w:shd w:val="clear" w:color="auto" w:fill="FFFFFF"/>
+            <w:tcMar>
+              <w:top w:w="0" w:type="dxa"/>
+              <w:bottom w:w="0" w:type="dxa"/>
+              <w:left w:w="0" w:type="dxa"/>
+              <w:right w:w="0" w:type="dxa"/>
+            </w:tcMar>
+            <w:vAlign w:val="top"/>
+          </w:tcPr>
+          <w:p>
+            <w:pPr>
+              <w:pStyle w:val="Normal"/>
+              <w:jc w:val="center"/>
+              <w:pBdr>
+                <w:bottom w:val="none" w:sz="0" w:space="0" w:color="000000"/>
+                <w:top w:val="none" w:sz="0" w:space="0" w:color="000000"/>
+                <w:left w:val="none" w:sz="0" w:space="0" w:color="000000"/>
+                <w:right w:val="none" w:sz="0" w:space="0" w:color="000000"/>
+              </w:pBdr>
+              <w:spacing w:after="100" w:before="100" w:line="240"/>
+              <w:ind w:left="100" w:right="100" w:firstLine="0" w:firstLineChars="0"/>
+              <w:rPr>
+                <w:rFonts w:ascii="Times New Roman" w:hAnsi="Times New Roman" w:eastAsia="Times New Roman" w:cs="Times New Roman"/>
+                <w:i w:val="false"/>
+                <w:b w:val="false"/>
+                <w:u w:val="none"/>
+                <w:strike w:val="false"/>
+                <w:sz w:val="18"/>
+                <w:szCs w:val="18"/>
+                <w:color w:val="000000"/>
+              </w:rPr>
+            </w:pPr>
+            <w:r>
+              <w:rPr>
+                <w:rFonts w:ascii="Times New Roman" w:hAnsi="Times New Roman" w:eastAsia="Times New Roman" w:cs="Times New Roman"/>
+                <w:i w:val="false"/>
+                <w:b w:val="false"/>
+                <w:u w:val="none"/>
+                <w:strike w:val="false"/>
+                <w:sz w:val="18"/>
+                <w:szCs w:val="18"/>
+                <w:color w:val="000000"/>
+              </w:rPr>
+              <w:t xml:space="preserve"/>
+            </w:r>
+          </w:p>
+        </w:tc>
       </w:tr>
       <w:tr>
         <w:trPr>
@@ -9067,6 +10719,61 @@
             </w:r>
           </w:p>
         </w:tc>
+        <w:tc>
+          <w:tcPr>
+            <w:tcBorders>
+              <w:bottom w:val="none" w:sz="0" w:space="0" w:color="000000"/>
+              <w:top w:val="none" w:sz="0" w:space="0" w:color="000000"/>
+              <w:left w:val="none" w:sz="0" w:space="0" w:color="000000"/>
+              <w:right w:val="none" w:sz="0" w:space="0" w:color="000000"/>
+            </w:tcBorders>
+            <w:shd w:val="clear" w:color="auto" w:fill="FFFFFF"/>
+            <w:tcMar>
+              <w:top w:w="0" w:type="dxa"/>
+              <w:bottom w:w="0" w:type="dxa"/>
+              <w:left w:w="0" w:type="dxa"/>
+              <w:right w:w="0" w:type="dxa"/>
+            </w:tcMar>
+            <w:vAlign w:val="top"/>
+          </w:tcPr>
+          <w:p>
+            <w:pPr>
+              <w:pStyle w:val="Normal"/>
+              <w:jc w:val="center"/>
+              <w:pBdr>
+                <w:bottom w:val="none" w:sz="0" w:space="0" w:color="000000"/>
+                <w:top w:val="none" w:sz="0" w:space="0" w:color="000000"/>
+                <w:left w:val="none" w:sz="0" w:space="0" w:color="000000"/>
+                <w:right w:val="none" w:sz="0" w:space="0" w:color="000000"/>
+              </w:pBdr>
+              <w:spacing w:after="100" w:before="100" w:line="240"/>
+              <w:ind w:left="100" w:right="100" w:firstLine="0" w:firstLineChars="0"/>
+              <w:rPr>
+                <w:rFonts w:ascii="Times New Roman" w:hAnsi="Times New Roman" w:eastAsia="Times New Roman" w:cs="Times New Roman"/>
+                <w:i w:val="false"/>
+                <w:b w:val="false"/>
+                <w:u w:val="none"/>
+                <w:strike w:val="false"/>
+                <w:sz w:val="18"/>
+                <w:szCs w:val="18"/>
+                <w:color w:val="000000"/>
+              </w:rPr>
+            </w:pPr>
+            <w:r>
+              <w:rPr>
+                <w:rFonts w:ascii="Times New Roman" w:hAnsi="Times New Roman" w:eastAsia="Times New Roman" w:cs="Times New Roman"/>
+                <w:i w:val="false"/>
+                <w:b w:val="false"/>
+                <w:u w:val="none"/>
+                <w:strike w:val="false"/>
+                <w:sz w:val="18"/>
+                <w:szCs w:val="18"/>
+                <w:color w:val="000000"/>
+              </w:rPr>
+              <w:t xml:space="preserve"/>
+            </w:r>
+          </w:p>
+        </w:tc>
       </w:tr>
       <w:tr>
         <w:trPr>
@@ -9347,6 +11054,61 @@
             </w:r>
           </w:p>
         </w:tc>
+        <w:tc>
+          <w:tcPr>
+            <w:tcBorders>
+              <w:bottom w:val="none" w:sz="0" w:space="0" w:color="000000"/>
+              <w:top w:val="none" w:sz="0" w:space="0" w:color="000000"/>
+              <w:left w:val="none" w:sz="0" w:space="0" w:color="000000"/>
+              <w:right w:val="none" w:sz="0" w:space="0" w:color="000000"/>
+            </w:tcBorders>
+            <w:shd w:val="clear" w:color="auto" w:fill="FFFFFF"/>
+            <w:tcMar>
+              <w:top w:w="0" w:type="dxa"/>
+              <w:bottom w:w="0" w:type="dxa"/>
+              <w:left w:w="0" w:type="dxa"/>
+              <w:right w:w="0" w:type="dxa"/>
+            </w:tcMar>
+            <w:vAlign w:val="top"/>
+          </w:tcPr>
+          <w:p>
+            <w:pPr>
+              <w:pStyle w:val="Normal"/>
+              <w:jc w:val="center"/>
+              <w:pBdr>
+                <w:bottom w:val="none" w:sz="0" w:space="0" w:color="000000"/>
+                <w:top w:val="none" w:sz="0" w:space="0" w:color="000000"/>
+                <w:left w:val="none" w:sz="0" w:space="0" w:color="000000"/>
+                <w:right w:val="none" w:sz="0" w:space="0" w:color="000000"/>
+              </w:pBdr>
+              <w:spacing w:after="100" w:before="100" w:line="240"/>
+              <w:ind w:left="100" w:right="100" w:firstLine="0" w:firstLineChars="0"/>
+              <w:rPr>
+                <w:rFonts w:ascii="Times New Roman" w:hAnsi="Times New Roman" w:eastAsia="Times New Roman" w:cs="Times New Roman"/>
+                <w:i w:val="false"/>
+                <w:b w:val="false"/>
+                <w:u w:val="none"/>
+                <w:strike w:val="false"/>
+                <w:sz w:val="18"/>
+                <w:szCs w:val="18"/>
+                <w:color w:val="000000"/>
+              </w:rPr>
+            </w:pPr>
+            <w:r>
+              <w:rPr>
+                <w:rFonts w:ascii="Times New Roman" w:hAnsi="Times New Roman" w:eastAsia="Times New Roman" w:cs="Times New Roman"/>
+                <w:i w:val="false"/>
+                <w:b w:val="false"/>
+                <w:u w:val="none"/>
+                <w:strike w:val="false"/>
+                <w:sz w:val="18"/>
+                <w:szCs w:val="18"/>
+                <w:color w:val="000000"/>
+              </w:rPr>
+              <w:t xml:space="preserve">&gt;0.999</w:t>
+            </w:r>
+          </w:p>
+        </w:tc>
       </w:tr>
       <w:tr>
         <w:trPr>
@@ -9627,6 +11389,61 @@
             </w:r>
           </w:p>
         </w:tc>
+        <w:tc>
+          <w:tcPr>
+            <w:tcBorders>
+              <w:bottom w:val="none" w:sz="0" w:space="0" w:color="000000"/>
+              <w:top w:val="none" w:sz="0" w:space="0" w:color="000000"/>
+              <w:left w:val="none" w:sz="0" w:space="0" w:color="000000"/>
+              <w:right w:val="none" w:sz="0" w:space="0" w:color="000000"/>
+            </w:tcBorders>
+            <w:shd w:val="clear" w:color="auto" w:fill="FFFFFF"/>
+            <w:tcMar>
+              <w:top w:w="0" w:type="dxa"/>
+              <w:bottom w:w="0" w:type="dxa"/>
+              <w:left w:w="0" w:type="dxa"/>
+              <w:right w:w="0" w:type="dxa"/>
+            </w:tcMar>
+            <w:vAlign w:val="top"/>
+          </w:tcPr>
+          <w:p>
+            <w:pPr>
+              <w:pStyle w:val="Normal"/>
+              <w:jc w:val="center"/>
+              <w:pBdr>
+                <w:bottom w:val="none" w:sz="0" w:space="0" w:color="000000"/>
+                <w:top w:val="none" w:sz="0" w:space="0" w:color="000000"/>
+                <w:left w:val="none" w:sz="0" w:space="0" w:color="000000"/>
+                <w:right w:val="none" w:sz="0" w:space="0" w:color="000000"/>
+              </w:pBdr>
+              <w:spacing w:after="100" w:before="100" w:line="240"/>
+              <w:ind w:left="100" w:right="100" w:firstLine="0" w:firstLineChars="0"/>
+              <w:rPr>
+                <w:rFonts w:ascii="Times New Roman" w:hAnsi="Times New Roman" w:eastAsia="Times New Roman" w:cs="Times New Roman"/>
+                <w:i w:val="false"/>
+                <w:b w:val="false"/>
+                <w:u w:val="none"/>
+                <w:strike w:val="false"/>
+                <w:sz w:val="18"/>
+                <w:szCs w:val="18"/>
+                <w:color w:val="000000"/>
+              </w:rPr>
+            </w:pPr>
+            <w:r>
+              <w:rPr>
+                <w:rFonts w:ascii="Times New Roman" w:hAnsi="Times New Roman" w:eastAsia="Times New Roman" w:cs="Times New Roman"/>
+                <w:i w:val="false"/>
+                <w:b w:val="false"/>
+                <w:u w:val="none"/>
+                <w:strike w:val="false"/>
+                <w:sz w:val="18"/>
+                <w:szCs w:val="18"/>
+                <w:color w:val="000000"/>
+              </w:rPr>
+              <w:t xml:space="preserve"/>
+            </w:r>
+          </w:p>
+        </w:tc>
       </w:tr>
       <w:tr>
         <w:trPr>
@@ -9907,6 +11724,61 @@
             </w:r>
           </w:p>
         </w:tc>
+        <w:tc>
+          <w:tcPr>
+            <w:tcBorders>
+              <w:bottom w:val="none" w:sz="0" w:space="0" w:color="000000"/>
+              <w:top w:val="none" w:sz="0" w:space="0" w:color="000000"/>
+              <w:left w:val="none" w:sz="0" w:space="0" w:color="000000"/>
+              <w:right w:val="none" w:sz="0" w:space="0" w:color="000000"/>
+            </w:tcBorders>
+            <w:shd w:val="clear" w:color="auto" w:fill="FFFFFF"/>
+            <w:tcMar>
+              <w:top w:w="0" w:type="dxa"/>
+              <w:bottom w:w="0" w:type="dxa"/>
+              <w:left w:w="0" w:type="dxa"/>
+              <w:right w:w="0" w:type="dxa"/>
+            </w:tcMar>
+            <w:vAlign w:val="top"/>
+          </w:tcPr>
+          <w:p>
+            <w:pPr>
+              <w:pStyle w:val="Normal"/>
+              <w:jc w:val="center"/>
+              <w:pBdr>
+                <w:bottom w:val="none" w:sz="0" w:space="0" w:color="000000"/>
+                <w:top w:val="none" w:sz="0" w:space="0" w:color="000000"/>
+                <w:left w:val="none" w:sz="0" w:space="0" w:color="000000"/>
+                <w:right w:val="none" w:sz="0" w:space="0" w:color="000000"/>
+              </w:pBdr>
+              <w:spacing w:after="100" w:before="100" w:line="240"/>
+              <w:ind w:left="100" w:right="100" w:firstLine="0" w:firstLineChars="0"/>
+              <w:rPr>
+                <w:rFonts w:ascii="Times New Roman" w:hAnsi="Times New Roman" w:eastAsia="Times New Roman" w:cs="Times New Roman"/>
+                <w:i w:val="false"/>
+                <w:b w:val="false"/>
+                <w:u w:val="none"/>
+                <w:strike w:val="false"/>
+                <w:sz w:val="18"/>
+                <w:szCs w:val="18"/>
+                <w:color w:val="000000"/>
+              </w:rPr>
+            </w:pPr>
+            <w:r>
+              <w:rPr>
+                <w:rFonts w:ascii="Times New Roman" w:hAnsi="Times New Roman" w:eastAsia="Times New Roman" w:cs="Times New Roman"/>
+                <w:i w:val="false"/>
+                <w:b w:val="false"/>
+                <w:u w:val="none"/>
+                <w:strike w:val="false"/>
+                <w:sz w:val="18"/>
+                <w:szCs w:val="18"/>
+                <w:color w:val="000000"/>
+              </w:rPr>
+              <w:t xml:space="preserve"/>
+            </w:r>
+          </w:p>
+        </w:tc>
       </w:tr>
       <w:tr>
         <w:trPr>
@@ -10187,6 +12059,61 @@
             </w:r>
           </w:p>
         </w:tc>
+        <w:tc>
+          <w:tcPr>
+            <w:tcBorders>
+              <w:bottom w:val="none" w:sz="0" w:space="0" w:color="000000"/>
+              <w:top w:val="none" w:sz="0" w:space="0" w:color="000000"/>
+              <w:left w:val="none" w:sz="0" w:space="0" w:color="000000"/>
+              <w:right w:val="none" w:sz="0" w:space="0" w:color="000000"/>
+            </w:tcBorders>
+            <w:shd w:val="clear" w:color="auto" w:fill="FFFFFF"/>
+            <w:tcMar>
+              <w:top w:w="0" w:type="dxa"/>
+              <w:bottom w:w="0" w:type="dxa"/>
+              <w:left w:w="0" w:type="dxa"/>
+              <w:right w:w="0" w:type="dxa"/>
+            </w:tcMar>
+            <w:vAlign w:val="top"/>
+          </w:tcPr>
+          <w:p>
+            <w:pPr>
+              <w:pStyle w:val="Normal"/>
+              <w:jc w:val="center"/>
+              <w:pBdr>
+                <w:bottom w:val="none" w:sz="0" w:space="0" w:color="000000"/>
+                <w:top w:val="none" w:sz="0" w:space="0" w:color="000000"/>
+                <w:left w:val="none" w:sz="0" w:space="0" w:color="000000"/>
+                <w:right w:val="none" w:sz="0" w:space="0" w:color="000000"/>
+              </w:pBdr>
+              <w:spacing w:after="100" w:before="100" w:line="240"/>
+              <w:ind w:left="100" w:right="100" w:firstLine="0" w:firstLineChars="0"/>
+              <w:rPr>
+                <w:rFonts w:ascii="Times New Roman" w:hAnsi="Times New Roman" w:eastAsia="Times New Roman" w:cs="Times New Roman"/>
+                <w:i w:val="false"/>
+                <w:b w:val="false"/>
+                <w:u w:val="none"/>
+                <w:strike w:val="false"/>
+                <w:sz w:val="18"/>
+                <w:szCs w:val="18"/>
+                <w:color w:val="000000"/>
+              </w:rPr>
+            </w:pPr>
+            <w:r>
+              <w:rPr>
+                <w:rFonts w:ascii="Times New Roman" w:hAnsi="Times New Roman" w:eastAsia="Times New Roman" w:cs="Times New Roman"/>
+                <w:i w:val="false"/>
+                <w:b w:val="false"/>
+                <w:u w:val="none"/>
+                <w:strike w:val="false"/>
+                <w:sz w:val="18"/>
+                <w:szCs w:val="18"/>
+                <w:color w:val="000000"/>
+              </w:rPr>
+              <w:t xml:space="preserve"/>
+            </w:r>
+          </w:p>
+        </w:tc>
       </w:tr>
       <w:tr>
         <w:trPr>
@@ -10467,6 +12394,61 @@
             </w:r>
           </w:p>
         </w:tc>
+        <w:tc>
+          <w:tcPr>
+            <w:tcBorders>
+              <w:bottom w:val="none" w:sz="0" w:space="0" w:color="000000"/>
+              <w:top w:val="none" w:sz="0" w:space="0" w:color="000000"/>
+              <w:left w:val="none" w:sz="0" w:space="0" w:color="000000"/>
+              <w:right w:val="none" w:sz="0" w:space="0" w:color="000000"/>
+            </w:tcBorders>
+            <w:shd w:val="clear" w:color="auto" w:fill="FFFFFF"/>
+            <w:tcMar>
+              <w:top w:w="0" w:type="dxa"/>
+              <w:bottom w:w="0" w:type="dxa"/>
+              <w:left w:w="0" w:type="dxa"/>
+              <w:right w:w="0" w:type="dxa"/>
+            </w:tcMar>
+            <w:vAlign w:val="top"/>
+          </w:tcPr>
+          <w:p>
+            <w:pPr>
+              <w:pStyle w:val="Normal"/>
+              <w:jc w:val="center"/>
+              <w:pBdr>
+                <w:bottom w:val="none" w:sz="0" w:space="0" w:color="000000"/>
+                <w:top w:val="none" w:sz="0" w:space="0" w:color="000000"/>
+                <w:left w:val="none" w:sz="0" w:space="0" w:color="000000"/>
+                <w:right w:val="none" w:sz="0" w:space="0" w:color="000000"/>
+              </w:pBdr>
+              <w:spacing w:after="100" w:before="100" w:line="240"/>
+              <w:ind w:left="100" w:right="100" w:firstLine="0" w:firstLineChars="0"/>
+              <w:rPr>
+                <w:rFonts w:ascii="Times New Roman" w:hAnsi="Times New Roman" w:eastAsia="Times New Roman" w:cs="Times New Roman"/>
+                <w:i w:val="false"/>
+                <w:b w:val="false"/>
+                <w:u w:val="none"/>
+                <w:strike w:val="false"/>
+                <w:sz w:val="18"/>
+                <w:szCs w:val="18"/>
+                <w:color w:val="000000"/>
+              </w:rPr>
+            </w:pPr>
+            <w:r>
+              <w:rPr>
+                <w:rFonts w:ascii="Times New Roman" w:hAnsi="Times New Roman" w:eastAsia="Times New Roman" w:cs="Times New Roman"/>
+                <w:i w:val="false"/>
+                <w:b w:val="false"/>
+                <w:u w:val="none"/>
+                <w:strike w:val="false"/>
+                <w:sz w:val="18"/>
+                <w:szCs w:val="18"/>
+                <w:color w:val="000000"/>
+              </w:rPr>
+              <w:t xml:space="preserve">0.216</w:t>
+            </w:r>
+          </w:p>
+        </w:tc>
       </w:tr>
       <w:tr>
         <w:trPr>
@@ -10747,6 +12729,61 @@
             </w:r>
           </w:p>
         </w:tc>
+        <w:tc>
+          <w:tcPr>
+            <w:tcBorders>
+              <w:bottom w:val="none" w:sz="0" w:space="0" w:color="000000"/>
+              <w:top w:val="none" w:sz="0" w:space="0" w:color="000000"/>
+              <w:left w:val="none" w:sz="0" w:space="0" w:color="000000"/>
+              <w:right w:val="none" w:sz="0" w:space="0" w:color="000000"/>
+            </w:tcBorders>
+            <w:shd w:val="clear" w:color="auto" w:fill="FFFFFF"/>
+            <w:tcMar>
+              <w:top w:w="0" w:type="dxa"/>
+              <w:bottom w:w="0" w:type="dxa"/>
+              <w:left w:w="0" w:type="dxa"/>
+              <w:right w:w="0" w:type="dxa"/>
+            </w:tcMar>
+            <w:vAlign w:val="top"/>
+          </w:tcPr>
+          <w:p>
+            <w:pPr>
+              <w:pStyle w:val="Normal"/>
+              <w:jc w:val="center"/>
+              <w:pBdr>
+                <w:bottom w:val="none" w:sz="0" w:space="0" w:color="000000"/>
+                <w:top w:val="none" w:sz="0" w:space="0" w:color="000000"/>
+                <w:left w:val="none" w:sz="0" w:space="0" w:color="000000"/>
+                <w:right w:val="none" w:sz="0" w:space="0" w:color="000000"/>
+              </w:pBdr>
+              <w:spacing w:after="100" w:before="100" w:line="240"/>
+              <w:ind w:left="100" w:right="100" w:firstLine="0" w:firstLineChars="0"/>
+              <w:rPr>
+                <w:rFonts w:ascii="Times New Roman" w:hAnsi="Times New Roman" w:eastAsia="Times New Roman" w:cs="Times New Roman"/>
+                <w:i w:val="false"/>
+                <w:b w:val="false"/>
+                <w:u w:val="none"/>
+                <w:strike w:val="false"/>
+                <w:sz w:val="18"/>
+                <w:szCs w:val="18"/>
+                <w:color w:val="000000"/>
+              </w:rPr>
+            </w:pPr>
+            <w:r>
+              <w:rPr>
+                <w:rFonts w:ascii="Times New Roman" w:hAnsi="Times New Roman" w:eastAsia="Times New Roman" w:cs="Times New Roman"/>
+                <w:i w:val="false"/>
+                <w:b w:val="false"/>
+                <w:u w:val="none"/>
+                <w:strike w:val="false"/>
+                <w:sz w:val="18"/>
+                <w:szCs w:val="18"/>
+                <w:color w:val="000000"/>
+              </w:rPr>
+              <w:t xml:space="preserve"/>
+            </w:r>
+          </w:p>
+        </w:tc>
       </w:tr>
       <w:tr>
         <w:trPr>
@@ -11027,6 +13064,61 @@
             </w:r>
           </w:p>
         </w:tc>
+        <w:tc>
+          <w:tcPr>
+            <w:tcBorders>
+              <w:bottom w:val="none" w:sz="0" w:space="0" w:color="000000"/>
+              <w:top w:val="none" w:sz="0" w:space="0" w:color="000000"/>
+              <w:left w:val="none" w:sz="0" w:space="0" w:color="000000"/>
+              <w:right w:val="none" w:sz="0" w:space="0" w:color="000000"/>
+            </w:tcBorders>
+            <w:shd w:val="clear" w:color="auto" w:fill="FFFFFF"/>
+            <w:tcMar>
+              <w:top w:w="0" w:type="dxa"/>
+              <w:bottom w:w="0" w:type="dxa"/>
+              <w:left w:w="0" w:type="dxa"/>
+              <w:right w:w="0" w:type="dxa"/>
+            </w:tcMar>
+            <w:vAlign w:val="top"/>
+          </w:tcPr>
+          <w:p>
+            <w:pPr>
+              <w:pStyle w:val="Normal"/>
+              <w:jc w:val="center"/>
+              <w:pBdr>
+                <w:bottom w:val="none" w:sz="0" w:space="0" w:color="000000"/>
+                <w:top w:val="none" w:sz="0" w:space="0" w:color="000000"/>
+                <w:left w:val="none" w:sz="0" w:space="0" w:color="000000"/>
+                <w:right w:val="none" w:sz="0" w:space="0" w:color="000000"/>
+              </w:pBdr>
+              <w:spacing w:after="100" w:before="100" w:line="240"/>
+              <w:ind w:left="100" w:right="100" w:firstLine="0" w:firstLineChars="0"/>
+              <w:rPr>
+                <w:rFonts w:ascii="Times New Roman" w:hAnsi="Times New Roman" w:eastAsia="Times New Roman" w:cs="Times New Roman"/>
+                <w:i w:val="false"/>
+                <w:b w:val="false"/>
+                <w:u w:val="none"/>
+                <w:strike w:val="false"/>
+                <w:sz w:val="18"/>
+                <w:szCs w:val="18"/>
+                <w:color w:val="000000"/>
+              </w:rPr>
+            </w:pPr>
+            <w:r>
+              <w:rPr>
+                <w:rFonts w:ascii="Times New Roman" w:hAnsi="Times New Roman" w:eastAsia="Times New Roman" w:cs="Times New Roman"/>
+                <w:i w:val="false"/>
+                <w:b w:val="false"/>
+                <w:u w:val="none"/>
+                <w:strike w:val="false"/>
+                <w:sz w:val="18"/>
+                <w:szCs w:val="18"/>
+                <w:color w:val="000000"/>
+              </w:rPr>
+              <w:t xml:space="preserve"/>
+            </w:r>
+          </w:p>
+        </w:tc>
       </w:tr>
       <w:tr>
         <w:trPr>
@@ -11307,6 +13399,61 @@
             </w:r>
           </w:p>
         </w:tc>
+        <w:tc>
+          <w:tcPr>
+            <w:tcBorders>
+              <w:bottom w:val="none" w:sz="0" w:space="0" w:color="000000"/>
+              <w:top w:val="none" w:sz="0" w:space="0" w:color="000000"/>
+              <w:left w:val="none" w:sz="0" w:space="0" w:color="000000"/>
+              <w:right w:val="none" w:sz="0" w:space="0" w:color="000000"/>
+            </w:tcBorders>
+            <w:shd w:val="clear" w:color="auto" w:fill="FFFFFF"/>
+            <w:tcMar>
+              <w:top w:w="0" w:type="dxa"/>
+              <w:bottom w:w="0" w:type="dxa"/>
+              <w:left w:w="0" w:type="dxa"/>
+              <w:right w:w="0" w:type="dxa"/>
+            </w:tcMar>
+            <w:vAlign w:val="top"/>
+          </w:tcPr>
+          <w:p>
+            <w:pPr>
+              <w:pStyle w:val="Normal"/>
+              <w:jc w:val="center"/>
+              <w:pBdr>
+                <w:bottom w:val="none" w:sz="0" w:space="0" w:color="000000"/>
+                <w:top w:val="none" w:sz="0" w:space="0" w:color="000000"/>
+                <w:left w:val="none" w:sz="0" w:space="0" w:color="000000"/>
+                <w:right w:val="none" w:sz="0" w:space="0" w:color="000000"/>
+              </w:pBdr>
+              <w:spacing w:after="100" w:before="100" w:line="240"/>
+              <w:ind w:left="100" w:right="100" w:firstLine="0" w:firstLineChars="0"/>
+              <w:rPr>
+                <w:rFonts w:ascii="Times New Roman" w:hAnsi="Times New Roman" w:eastAsia="Times New Roman" w:cs="Times New Roman"/>
+                <w:i w:val="false"/>
+                <w:b w:val="false"/>
+                <w:u w:val="none"/>
+                <w:strike w:val="false"/>
+                <w:sz w:val="18"/>
+                <w:szCs w:val="18"/>
+                <w:color w:val="000000"/>
+              </w:rPr>
+            </w:pPr>
+            <w:r>
+              <w:rPr>
+                <w:rFonts w:ascii="Times New Roman" w:hAnsi="Times New Roman" w:eastAsia="Times New Roman" w:cs="Times New Roman"/>
+                <w:i w:val="false"/>
+                <w:b w:val="false"/>
+                <w:u w:val="none"/>
+                <w:strike w:val="false"/>
+                <w:sz w:val="18"/>
+                <w:szCs w:val="18"/>
+                <w:color w:val="000000"/>
+              </w:rPr>
+              <w:t xml:space="preserve"/>
+            </w:r>
+          </w:p>
+        </w:tc>
       </w:tr>
       <w:tr>
         <w:trPr>
@@ -11587,6 +13734,61 @@
             </w:r>
           </w:p>
         </w:tc>
+        <w:tc>
+          <w:tcPr>
+            <w:tcBorders>
+              <w:bottom w:val="none" w:sz="0" w:space="0" w:color="000000"/>
+              <w:top w:val="none" w:sz="0" w:space="0" w:color="000000"/>
+              <w:left w:val="none" w:sz="0" w:space="0" w:color="000000"/>
+              <w:right w:val="none" w:sz="0" w:space="0" w:color="000000"/>
+            </w:tcBorders>
+            <w:shd w:val="clear" w:color="auto" w:fill="FFFFFF"/>
+            <w:tcMar>
+              <w:top w:w="0" w:type="dxa"/>
+              <w:bottom w:w="0" w:type="dxa"/>
+              <w:left w:w="0" w:type="dxa"/>
+              <w:right w:w="0" w:type="dxa"/>
+            </w:tcMar>
+            <w:vAlign w:val="top"/>
+          </w:tcPr>
+          <w:p>
+            <w:pPr>
+              <w:pStyle w:val="Normal"/>
+              <w:jc w:val="center"/>
+              <w:pBdr>
+                <w:bottom w:val="none" w:sz="0" w:space="0" w:color="000000"/>
+                <w:top w:val="none" w:sz="0" w:space="0" w:color="000000"/>
+                <w:left w:val="none" w:sz="0" w:space="0" w:color="000000"/>
+                <w:right w:val="none" w:sz="0" w:space="0" w:color="000000"/>
+              </w:pBdr>
+              <w:spacing w:after="100" w:before="100" w:line="240"/>
+              <w:ind w:left="100" w:right="100" w:firstLine="0" w:firstLineChars="0"/>
+              <w:rPr>
+                <w:rFonts w:ascii="Times New Roman" w:hAnsi="Times New Roman" w:eastAsia="Times New Roman" w:cs="Times New Roman"/>
+                <w:i w:val="false"/>
+                <w:b w:val="false"/>
+                <w:u w:val="none"/>
+                <w:strike w:val="false"/>
+                <w:sz w:val="18"/>
+                <w:szCs w:val="18"/>
+                <w:color w:val="000000"/>
+              </w:rPr>
+            </w:pPr>
+            <w:r>
+              <w:rPr>
+                <w:rFonts w:ascii="Times New Roman" w:hAnsi="Times New Roman" w:eastAsia="Times New Roman" w:cs="Times New Roman"/>
+                <w:i w:val="false"/>
+                <w:b w:val="false"/>
+                <w:u w:val="none"/>
+                <w:strike w:val="false"/>
+                <w:sz w:val="18"/>
+                <w:szCs w:val="18"/>
+                <w:color w:val="000000"/>
+              </w:rPr>
+              <w:t xml:space="preserve">0.547</w:t>
+            </w:r>
+          </w:p>
+        </w:tc>
       </w:tr>
       <w:tr>
         <w:trPr>
@@ -11867,6 +14069,61 @@
             </w:r>
           </w:p>
         </w:tc>
+        <w:tc>
+          <w:tcPr>
+            <w:tcBorders>
+              <w:bottom w:val="none" w:sz="0" w:space="0" w:color="000000"/>
+              <w:top w:val="none" w:sz="0" w:space="0" w:color="000000"/>
+              <w:left w:val="none" w:sz="0" w:space="0" w:color="000000"/>
+              <w:right w:val="none" w:sz="0" w:space="0" w:color="000000"/>
+            </w:tcBorders>
+            <w:shd w:val="clear" w:color="auto" w:fill="FFFFFF"/>
+            <w:tcMar>
+              <w:top w:w="0" w:type="dxa"/>
+              <w:bottom w:w="0" w:type="dxa"/>
+              <w:left w:w="0" w:type="dxa"/>
+              <w:right w:w="0" w:type="dxa"/>
+            </w:tcMar>
+            <w:vAlign w:val="top"/>
+          </w:tcPr>
+          <w:p>
+            <w:pPr>
+              <w:pStyle w:val="Normal"/>
+              <w:jc w:val="center"/>
+              <w:pBdr>
+                <w:bottom w:val="none" w:sz="0" w:space="0" w:color="000000"/>
+                <w:top w:val="none" w:sz="0" w:space="0" w:color="000000"/>
+                <w:left w:val="none" w:sz="0" w:space="0" w:color="000000"/>
+                <w:right w:val="none" w:sz="0" w:space="0" w:color="000000"/>
+              </w:pBdr>
+              <w:spacing w:after="100" w:before="100" w:line="240"/>
+              <w:ind w:left="100" w:right="100" w:firstLine="0" w:firstLineChars="0"/>
+              <w:rPr>
+                <w:rFonts w:ascii="Times New Roman" w:hAnsi="Times New Roman" w:eastAsia="Times New Roman" w:cs="Times New Roman"/>
+                <w:i w:val="false"/>
+                <w:b w:val="false"/>
+                <w:u w:val="none"/>
+                <w:strike w:val="false"/>
+                <w:sz w:val="18"/>
+                <w:szCs w:val="18"/>
+                <w:color w:val="000000"/>
+              </w:rPr>
+            </w:pPr>
+            <w:r>
+              <w:rPr>
+                <w:rFonts w:ascii="Times New Roman" w:hAnsi="Times New Roman" w:eastAsia="Times New Roman" w:cs="Times New Roman"/>
+                <w:i w:val="false"/>
+                <w:b w:val="false"/>
+                <w:u w:val="none"/>
+                <w:strike w:val="false"/>
+                <w:sz w:val="18"/>
+                <w:szCs w:val="18"/>
+                <w:color w:val="000000"/>
+              </w:rPr>
+              <w:t xml:space="preserve"/>
+            </w:r>
+          </w:p>
+        </w:tc>
       </w:tr>
       <w:tr>
         <w:trPr>
@@ -12147,6 +14404,61 @@
             </w:r>
           </w:p>
         </w:tc>
+        <w:tc>
+          <w:tcPr>
+            <w:tcBorders>
+              <w:bottom w:val="none" w:sz="0" w:space="0" w:color="000000"/>
+              <w:top w:val="none" w:sz="0" w:space="0" w:color="000000"/>
+              <w:left w:val="none" w:sz="0" w:space="0" w:color="000000"/>
+              <w:right w:val="none" w:sz="0" w:space="0" w:color="000000"/>
+            </w:tcBorders>
+            <w:shd w:val="clear" w:color="auto" w:fill="FFFFFF"/>
+            <w:tcMar>
+              <w:top w:w="0" w:type="dxa"/>
+              <w:bottom w:w="0" w:type="dxa"/>
+              <w:left w:w="0" w:type="dxa"/>
+              <w:right w:w="0" w:type="dxa"/>
+            </w:tcMar>
+            <w:vAlign w:val="top"/>
+          </w:tcPr>
+          <w:p>
+            <w:pPr>
+              <w:pStyle w:val="Normal"/>
+              <w:jc w:val="center"/>
+              <w:pBdr>
+                <w:bottom w:val="none" w:sz="0" w:space="0" w:color="000000"/>
+                <w:top w:val="none" w:sz="0" w:space="0" w:color="000000"/>
+                <w:left w:val="none" w:sz="0" w:space="0" w:color="000000"/>
+                <w:right w:val="none" w:sz="0" w:space="0" w:color="000000"/>
+              </w:pBdr>
+              <w:spacing w:after="100" w:before="100" w:line="240"/>
+              <w:ind w:left="100" w:right="100" w:firstLine="0" w:firstLineChars="0"/>
+              <w:rPr>
+                <w:rFonts w:ascii="Times New Roman" w:hAnsi="Times New Roman" w:eastAsia="Times New Roman" w:cs="Times New Roman"/>
+                <w:i w:val="false"/>
+                <w:b w:val="false"/>
+                <w:u w:val="none"/>
+                <w:strike w:val="false"/>
+                <w:sz w:val="18"/>
+                <w:szCs w:val="18"/>
+                <w:color w:val="000000"/>
+              </w:rPr>
+            </w:pPr>
+            <w:r>
+              <w:rPr>
+                <w:rFonts w:ascii="Times New Roman" w:hAnsi="Times New Roman" w:eastAsia="Times New Roman" w:cs="Times New Roman"/>
+                <w:i w:val="false"/>
+                <w:b w:val="false"/>
+                <w:u w:val="none"/>
+                <w:strike w:val="false"/>
+                <w:sz w:val="18"/>
+                <w:szCs w:val="18"/>
+                <w:color w:val="000000"/>
+              </w:rPr>
+              <w:t xml:space="preserve"/>
+            </w:r>
+          </w:p>
+        </w:tc>
       </w:tr>
       <w:tr>
         <w:trPr>
@@ -12427,6 +14739,61 @@
             </w:r>
           </w:p>
         </w:tc>
+        <w:tc>
+          <w:tcPr>
+            <w:tcBorders>
+              <w:bottom w:val="none" w:sz="0" w:space="0" w:color="000000"/>
+              <w:top w:val="none" w:sz="0" w:space="0" w:color="000000"/>
+              <w:left w:val="none" w:sz="0" w:space="0" w:color="000000"/>
+              <w:right w:val="none" w:sz="0" w:space="0" w:color="000000"/>
+            </w:tcBorders>
+            <w:shd w:val="clear" w:color="auto" w:fill="FFFFFF"/>
+            <w:tcMar>
+              <w:top w:w="0" w:type="dxa"/>
+              <w:bottom w:w="0" w:type="dxa"/>
+              <w:left w:w="0" w:type="dxa"/>
+              <w:right w:w="0" w:type="dxa"/>
+            </w:tcMar>
+            <w:vAlign w:val="top"/>
+          </w:tcPr>
+          <w:p>
+            <w:pPr>
+              <w:pStyle w:val="Normal"/>
+              <w:jc w:val="center"/>
+              <w:pBdr>
+                <w:bottom w:val="none" w:sz="0" w:space="0" w:color="000000"/>
+                <w:top w:val="none" w:sz="0" w:space="0" w:color="000000"/>
+                <w:left w:val="none" w:sz="0" w:space="0" w:color="000000"/>
+                <w:right w:val="none" w:sz="0" w:space="0" w:color="000000"/>
+              </w:pBdr>
+              <w:spacing w:after="100" w:before="100" w:line="240"/>
+              <w:ind w:left="100" w:right="100" w:firstLine="0" w:firstLineChars="0"/>
+              <w:rPr>
+                <w:rFonts w:ascii="Times New Roman" w:hAnsi="Times New Roman" w:eastAsia="Times New Roman" w:cs="Times New Roman"/>
+                <w:i w:val="false"/>
+                <w:b w:val="false"/>
+                <w:u w:val="none"/>
+                <w:strike w:val="false"/>
+                <w:sz w:val="18"/>
+                <w:szCs w:val="18"/>
+                <w:color w:val="000000"/>
+              </w:rPr>
+            </w:pPr>
+            <w:r>
+              <w:rPr>
+                <w:rFonts w:ascii="Times New Roman" w:hAnsi="Times New Roman" w:eastAsia="Times New Roman" w:cs="Times New Roman"/>
+                <w:i w:val="false"/>
+                <w:b w:val="false"/>
+                <w:u w:val="none"/>
+                <w:strike w:val="false"/>
+                <w:sz w:val="18"/>
+                <w:szCs w:val="18"/>
+                <w:color w:val="000000"/>
+              </w:rPr>
+              <w:t xml:space="preserve"/>
+            </w:r>
+          </w:p>
+        </w:tc>
       </w:tr>
       <w:tr>
         <w:trPr>
@@ -12707,6 +15074,61 @@
             </w:r>
           </w:p>
         </w:tc>
+        <w:tc>
+          <w:tcPr>
+            <w:tcBorders>
+              <w:bottom w:val="none" w:sz="0" w:space="0" w:color="000000"/>
+              <w:top w:val="none" w:sz="0" w:space="0" w:color="000000"/>
+              <w:left w:val="none" w:sz="0" w:space="0" w:color="000000"/>
+              <w:right w:val="none" w:sz="0" w:space="0" w:color="000000"/>
+            </w:tcBorders>
+            <w:shd w:val="clear" w:color="auto" w:fill="FFFFFF"/>
+            <w:tcMar>
+              <w:top w:w="0" w:type="dxa"/>
+              <w:bottom w:w="0" w:type="dxa"/>
+              <w:left w:w="0" w:type="dxa"/>
+              <w:right w:w="0" w:type="dxa"/>
+            </w:tcMar>
+            <w:vAlign w:val="top"/>
+          </w:tcPr>
+          <w:p>
+            <w:pPr>
+              <w:pStyle w:val="Normal"/>
+              <w:jc w:val="center"/>
+              <w:pBdr>
+                <w:bottom w:val="none" w:sz="0" w:space="0" w:color="000000"/>
+                <w:top w:val="none" w:sz="0" w:space="0" w:color="000000"/>
+                <w:left w:val="none" w:sz="0" w:space="0" w:color="000000"/>
+                <w:right w:val="none" w:sz="0" w:space="0" w:color="000000"/>
+              </w:pBdr>
+              <w:spacing w:after="100" w:before="100" w:line="240"/>
+              <w:ind w:left="100" w:right="100" w:firstLine="0" w:firstLineChars="0"/>
+              <w:rPr>
+                <w:rFonts w:ascii="Times New Roman" w:hAnsi="Times New Roman" w:eastAsia="Times New Roman" w:cs="Times New Roman"/>
+                <w:i w:val="false"/>
+                <w:b w:val="false"/>
+                <w:u w:val="none"/>
+                <w:strike w:val="false"/>
+                <w:sz w:val="18"/>
+                <w:szCs w:val="18"/>
+                <w:color w:val="000000"/>
+              </w:rPr>
+            </w:pPr>
+            <w:r>
+              <w:rPr>
+                <w:rFonts w:ascii="Times New Roman" w:hAnsi="Times New Roman" w:eastAsia="Times New Roman" w:cs="Times New Roman"/>
+                <w:i w:val="false"/>
+                <w:b w:val="false"/>
+                <w:u w:val="none"/>
+                <w:strike w:val="false"/>
+                <w:sz w:val="18"/>
+                <w:szCs w:val="18"/>
+                <w:color w:val="000000"/>
+              </w:rPr>
+              <w:t xml:space="preserve">0.277</w:t>
+            </w:r>
+          </w:p>
+        </w:tc>
       </w:tr>
       <w:tr>
         <w:trPr>
@@ -12987,6 +15409,61 @@
             </w:r>
           </w:p>
         </w:tc>
+        <w:tc>
+          <w:tcPr>
+            <w:tcBorders>
+              <w:bottom w:val="none" w:sz="0" w:space="0" w:color="000000"/>
+              <w:top w:val="none" w:sz="0" w:space="0" w:color="000000"/>
+              <w:left w:val="none" w:sz="0" w:space="0" w:color="000000"/>
+              <w:right w:val="none" w:sz="0" w:space="0" w:color="000000"/>
+            </w:tcBorders>
+            <w:shd w:val="clear" w:color="auto" w:fill="FFFFFF"/>
+            <w:tcMar>
+              <w:top w:w="0" w:type="dxa"/>
+              <w:bottom w:w="0" w:type="dxa"/>
+              <w:left w:w="0" w:type="dxa"/>
+              <w:right w:w="0" w:type="dxa"/>
+            </w:tcMar>
+            <w:vAlign w:val="top"/>
+          </w:tcPr>
+          <w:p>
+            <w:pPr>
+              <w:pStyle w:val="Normal"/>
+              <w:jc w:val="center"/>
+              <w:pBdr>
+                <w:bottom w:val="none" w:sz="0" w:space="0" w:color="000000"/>
+                <w:top w:val="none" w:sz="0" w:space="0" w:color="000000"/>
+                <w:left w:val="none" w:sz="0" w:space="0" w:color="000000"/>
+                <w:right w:val="none" w:sz="0" w:space="0" w:color="000000"/>
+              </w:pBdr>
+              <w:spacing w:after="100" w:before="100" w:line="240"/>
+              <w:ind w:left="100" w:right="100" w:firstLine="0" w:firstLineChars="0"/>
+              <w:rPr>
+                <w:rFonts w:ascii="Times New Roman" w:hAnsi="Times New Roman" w:eastAsia="Times New Roman" w:cs="Times New Roman"/>
+                <w:i w:val="false"/>
+                <w:b w:val="false"/>
+                <w:u w:val="none"/>
+                <w:strike w:val="false"/>
+                <w:sz w:val="18"/>
+                <w:szCs w:val="18"/>
+                <w:color w:val="000000"/>
+              </w:rPr>
+            </w:pPr>
+            <w:r>
+              <w:rPr>
+                <w:rFonts w:ascii="Times New Roman" w:hAnsi="Times New Roman" w:eastAsia="Times New Roman" w:cs="Times New Roman"/>
+                <w:i w:val="false"/>
+                <w:b w:val="false"/>
+                <w:u w:val="none"/>
+                <w:strike w:val="false"/>
+                <w:sz w:val="18"/>
+                <w:szCs w:val="18"/>
+                <w:color w:val="000000"/>
+              </w:rPr>
+              <w:t xml:space="preserve"/>
+            </w:r>
+          </w:p>
+        </w:tc>
       </w:tr>
       <w:tr>
         <w:trPr>
@@ -13267,6 +15744,61 @@
             </w:r>
           </w:p>
         </w:tc>
+        <w:tc>
+          <w:tcPr>
+            <w:tcBorders>
+              <w:bottom w:val="none" w:sz="0" w:space="0" w:color="000000"/>
+              <w:top w:val="none" w:sz="0" w:space="0" w:color="000000"/>
+              <w:left w:val="none" w:sz="0" w:space="0" w:color="000000"/>
+              <w:right w:val="none" w:sz="0" w:space="0" w:color="000000"/>
+            </w:tcBorders>
+            <w:shd w:val="clear" w:color="auto" w:fill="FFFFFF"/>
+            <w:tcMar>
+              <w:top w:w="0" w:type="dxa"/>
+              <w:bottom w:w="0" w:type="dxa"/>
+              <w:left w:w="0" w:type="dxa"/>
+              <w:right w:w="0" w:type="dxa"/>
+            </w:tcMar>
+            <w:vAlign w:val="top"/>
+          </w:tcPr>
+          <w:p>
+            <w:pPr>
+              <w:pStyle w:val="Normal"/>
+              <w:jc w:val="center"/>
+              <w:pBdr>
+                <w:bottom w:val="none" w:sz="0" w:space="0" w:color="000000"/>
+                <w:top w:val="none" w:sz="0" w:space="0" w:color="000000"/>
+                <w:left w:val="none" w:sz="0" w:space="0" w:color="000000"/>
+                <w:right w:val="none" w:sz="0" w:space="0" w:color="000000"/>
+              </w:pBdr>
+              <w:spacing w:after="100" w:before="100" w:line="240"/>
+              <w:ind w:left="100" w:right="100" w:firstLine="0" w:firstLineChars="0"/>
+              <w:rPr>
+                <w:rFonts w:ascii="Times New Roman" w:hAnsi="Times New Roman" w:eastAsia="Times New Roman" w:cs="Times New Roman"/>
+                <w:i w:val="false"/>
+                <w:b w:val="false"/>
+                <w:u w:val="none"/>
+                <w:strike w:val="false"/>
+                <w:sz w:val="18"/>
+                <w:szCs w:val="18"/>
+                <w:color w:val="000000"/>
+              </w:rPr>
+            </w:pPr>
+            <w:r>
+              <w:rPr>
+                <w:rFonts w:ascii="Times New Roman" w:hAnsi="Times New Roman" w:eastAsia="Times New Roman" w:cs="Times New Roman"/>
+                <w:i w:val="false"/>
+                <w:b w:val="false"/>
+                <w:u w:val="none"/>
+                <w:strike w:val="false"/>
+                <w:sz w:val="18"/>
+                <w:szCs w:val="18"/>
+                <w:color w:val="000000"/>
+              </w:rPr>
+              <w:t xml:space="preserve"/>
+            </w:r>
+          </w:p>
+        </w:tc>
       </w:tr>
       <w:tr>
         <w:trPr>
@@ -13547,6 +16079,61 @@
             </w:r>
           </w:p>
         </w:tc>
+        <w:tc>
+          <w:tcPr>
+            <w:tcBorders>
+              <w:bottom w:val="none" w:sz="0" w:space="0" w:color="000000"/>
+              <w:top w:val="none" w:sz="0" w:space="0" w:color="000000"/>
+              <w:left w:val="none" w:sz="0" w:space="0" w:color="000000"/>
+              <w:right w:val="none" w:sz="0" w:space="0" w:color="000000"/>
+            </w:tcBorders>
+            <w:shd w:val="clear" w:color="auto" w:fill="FFFFFF"/>
+            <w:tcMar>
+              <w:top w:w="0" w:type="dxa"/>
+              <w:bottom w:w="0" w:type="dxa"/>
+              <w:left w:w="0" w:type="dxa"/>
+              <w:right w:w="0" w:type="dxa"/>
+            </w:tcMar>
+            <w:vAlign w:val="top"/>
+          </w:tcPr>
+          <w:p>
+            <w:pPr>
+              <w:pStyle w:val="Normal"/>
+              <w:jc w:val="center"/>
+              <w:pBdr>
+                <w:bottom w:val="none" w:sz="0" w:space="0" w:color="000000"/>
+                <w:top w:val="none" w:sz="0" w:space="0" w:color="000000"/>
+                <w:left w:val="none" w:sz="0" w:space="0" w:color="000000"/>
+                <w:right w:val="none" w:sz="0" w:space="0" w:color="000000"/>
+              </w:pBdr>
+              <w:spacing w:after="100" w:before="100" w:line="240"/>
+              <w:ind w:left="100" w:right="100" w:firstLine="0" w:firstLineChars="0"/>
+              <w:rPr>
+                <w:rFonts w:ascii="Times New Roman" w:hAnsi="Times New Roman" w:eastAsia="Times New Roman" w:cs="Times New Roman"/>
+                <w:i w:val="false"/>
+                <w:b w:val="false"/>
+                <w:u w:val="none"/>
+                <w:strike w:val="false"/>
+                <w:sz w:val="18"/>
+                <w:szCs w:val="18"/>
+                <w:color w:val="000000"/>
+              </w:rPr>
+            </w:pPr>
+            <w:r>
+              <w:rPr>
+                <w:rFonts w:ascii="Times New Roman" w:hAnsi="Times New Roman" w:eastAsia="Times New Roman" w:cs="Times New Roman"/>
+                <w:i w:val="false"/>
+                <w:b w:val="false"/>
+                <w:u w:val="none"/>
+                <w:strike w:val="false"/>
+                <w:sz w:val="18"/>
+                <w:szCs w:val="18"/>
+                <w:color w:val="000000"/>
+              </w:rPr>
+              <w:t xml:space="preserve"/>
+            </w:r>
+          </w:p>
+        </w:tc>
       </w:tr>
       <w:tr>
         <w:trPr>
@@ -13827,6 +16414,61 @@
             </w:r>
           </w:p>
         </w:tc>
+        <w:tc>
+          <w:tcPr>
+            <w:tcBorders>
+              <w:bottom w:val="none" w:sz="0" w:space="0" w:color="000000"/>
+              <w:top w:val="none" w:sz="0" w:space="0" w:color="000000"/>
+              <w:left w:val="none" w:sz="0" w:space="0" w:color="000000"/>
+              <w:right w:val="none" w:sz="0" w:space="0" w:color="000000"/>
+            </w:tcBorders>
+            <w:shd w:val="clear" w:color="auto" w:fill="FFFFFF"/>
+            <w:tcMar>
+              <w:top w:w="0" w:type="dxa"/>
+              <w:bottom w:w="0" w:type="dxa"/>
+              <w:left w:w="0" w:type="dxa"/>
+              <w:right w:w="0" w:type="dxa"/>
+            </w:tcMar>
+            <w:vAlign w:val="top"/>
+          </w:tcPr>
+          <w:p>
+            <w:pPr>
+              <w:pStyle w:val="Normal"/>
+              <w:jc w:val="center"/>
+              <w:pBdr>
+                <w:bottom w:val="none" w:sz="0" w:space="0" w:color="000000"/>
+                <w:top w:val="none" w:sz="0" w:space="0" w:color="000000"/>
+                <w:left w:val="none" w:sz="0" w:space="0" w:color="000000"/>
+                <w:right w:val="none" w:sz="0" w:space="0" w:color="000000"/>
+              </w:pBdr>
+              <w:spacing w:after="100" w:before="100" w:line="240"/>
+              <w:ind w:left="100" w:right="100" w:firstLine="0" w:firstLineChars="0"/>
+              <w:rPr>
+                <w:rFonts w:ascii="Times New Roman" w:hAnsi="Times New Roman" w:eastAsia="Times New Roman" w:cs="Times New Roman"/>
+                <w:i w:val="false"/>
+                <w:b w:val="false"/>
+                <w:u w:val="none"/>
+                <w:strike w:val="false"/>
+                <w:sz w:val="18"/>
+                <w:szCs w:val="18"/>
+                <w:color w:val="000000"/>
+              </w:rPr>
+            </w:pPr>
+            <w:r>
+              <w:rPr>
+                <w:rFonts w:ascii="Times New Roman" w:hAnsi="Times New Roman" w:eastAsia="Times New Roman" w:cs="Times New Roman"/>
+                <w:i w:val="false"/>
+                <w:b w:val="false"/>
+                <w:u w:val="none"/>
+                <w:strike w:val="false"/>
+                <w:sz w:val="18"/>
+                <w:szCs w:val="18"/>
+                <w:color w:val="000000"/>
+              </w:rPr>
+              <w:t xml:space="preserve"/>
+            </w:r>
+          </w:p>
+        </w:tc>
       </w:tr>
       <w:tr>
         <w:trPr>
@@ -14107,6 +16749,61 @@
             </w:r>
           </w:p>
         </w:tc>
+        <w:tc>
+          <w:tcPr>
+            <w:tcBorders>
+              <w:bottom w:val="none" w:sz="0" w:space="0" w:color="000000"/>
+              <w:top w:val="none" w:sz="0" w:space="0" w:color="000000"/>
+              <w:left w:val="none" w:sz="0" w:space="0" w:color="000000"/>
+              <w:right w:val="none" w:sz="0" w:space="0" w:color="000000"/>
+            </w:tcBorders>
+            <w:shd w:val="clear" w:color="auto" w:fill="FFFFFF"/>
+            <w:tcMar>
+              <w:top w:w="0" w:type="dxa"/>
+              <w:bottom w:w="0" w:type="dxa"/>
+              <w:left w:w="0" w:type="dxa"/>
+              <w:right w:w="0" w:type="dxa"/>
+            </w:tcMar>
+            <w:vAlign w:val="top"/>
+          </w:tcPr>
+          <w:p>
+            <w:pPr>
+              <w:pStyle w:val="Normal"/>
+              <w:jc w:val="center"/>
+              <w:pBdr>
+                <w:bottom w:val="none" w:sz="0" w:space="0" w:color="000000"/>
+                <w:top w:val="none" w:sz="0" w:space="0" w:color="000000"/>
+                <w:left w:val="none" w:sz="0" w:space="0" w:color="000000"/>
+                <w:right w:val="none" w:sz="0" w:space="0" w:color="000000"/>
+              </w:pBdr>
+              <w:spacing w:after="100" w:before="100" w:line="240"/>
+              <w:ind w:left="100" w:right="100" w:firstLine="0" w:firstLineChars="0"/>
+              <w:rPr>
+                <w:rFonts w:ascii="Times New Roman" w:hAnsi="Times New Roman" w:eastAsia="Times New Roman" w:cs="Times New Roman"/>
+                <w:i w:val="false"/>
+                <w:b w:val="false"/>
+                <w:u w:val="none"/>
+                <w:strike w:val="false"/>
+                <w:sz w:val="18"/>
+                <w:szCs w:val="18"/>
+                <w:color w:val="000000"/>
+              </w:rPr>
+            </w:pPr>
+            <w:r>
+              <w:rPr>
+                <w:rFonts w:ascii="Times New Roman" w:hAnsi="Times New Roman" w:eastAsia="Times New Roman" w:cs="Times New Roman"/>
+                <w:i w:val="false"/>
+                <w:b w:val="false"/>
+                <w:u w:val="none"/>
+                <w:strike w:val="false"/>
+                <w:sz w:val="18"/>
+                <w:szCs w:val="18"/>
+                <w:color w:val="000000"/>
+              </w:rPr>
+              <w:t xml:space="preserve">0.037</w:t>
+            </w:r>
+          </w:p>
+        </w:tc>
       </w:tr>
       <w:tr>
         <w:trPr>
@@ -14387,6 +17084,61 @@
             </w:r>
           </w:p>
         </w:tc>
+        <w:tc>
+          <w:tcPr>
+            <w:tcBorders>
+              <w:bottom w:val="none" w:sz="0" w:space="0" w:color="000000"/>
+              <w:top w:val="none" w:sz="0" w:space="0" w:color="000000"/>
+              <w:left w:val="none" w:sz="0" w:space="0" w:color="000000"/>
+              <w:right w:val="none" w:sz="0" w:space="0" w:color="000000"/>
+            </w:tcBorders>
+            <w:shd w:val="clear" w:color="auto" w:fill="FFFFFF"/>
+            <w:tcMar>
+              <w:top w:w="0" w:type="dxa"/>
+              <w:bottom w:w="0" w:type="dxa"/>
+              <w:left w:w="0" w:type="dxa"/>
+              <w:right w:w="0" w:type="dxa"/>
+            </w:tcMar>
+            <w:vAlign w:val="top"/>
+          </w:tcPr>
+          <w:p>
+            <w:pPr>
+              <w:pStyle w:val="Normal"/>
+              <w:jc w:val="center"/>
+              <w:pBdr>
+                <w:bottom w:val="none" w:sz="0" w:space="0" w:color="000000"/>
+                <w:top w:val="none" w:sz="0" w:space="0" w:color="000000"/>
+                <w:left w:val="none" w:sz="0" w:space="0" w:color="000000"/>
+                <w:right w:val="none" w:sz="0" w:space="0" w:color="000000"/>
+              </w:pBdr>
+              <w:spacing w:after="100" w:before="100" w:line="240"/>
+              <w:ind w:left="100" w:right="100" w:firstLine="0" w:firstLineChars="0"/>
+              <w:rPr>
+                <w:rFonts w:ascii="Times New Roman" w:hAnsi="Times New Roman" w:eastAsia="Times New Roman" w:cs="Times New Roman"/>
+                <w:i w:val="false"/>
+                <w:b w:val="false"/>
+                <w:u w:val="none"/>
+                <w:strike w:val="false"/>
+                <w:sz w:val="18"/>
+                <w:szCs w:val="18"/>
+                <w:color w:val="000000"/>
+              </w:rPr>
+            </w:pPr>
+            <w:r>
+              <w:rPr>
+                <w:rFonts w:ascii="Times New Roman" w:hAnsi="Times New Roman" w:eastAsia="Times New Roman" w:cs="Times New Roman"/>
+                <w:i w:val="false"/>
+                <w:b w:val="false"/>
+                <w:u w:val="none"/>
+                <w:strike w:val="false"/>
+                <w:sz w:val="18"/>
+                <w:szCs w:val="18"/>
+                <w:color w:val="000000"/>
+              </w:rPr>
+              <w:t xml:space="preserve"/>
+            </w:r>
+          </w:p>
+        </w:tc>
       </w:tr>
       <w:tr>
         <w:trPr>
@@ -14667,6 +17419,61 @@
             </w:r>
           </w:p>
         </w:tc>
+        <w:tc>
+          <w:tcPr>
+            <w:tcBorders>
+              <w:bottom w:val="none" w:sz="0" w:space="0" w:color="000000"/>
+              <w:top w:val="none" w:sz="0" w:space="0" w:color="000000"/>
+              <w:left w:val="none" w:sz="0" w:space="0" w:color="000000"/>
+              <w:right w:val="none" w:sz="0" w:space="0" w:color="000000"/>
+            </w:tcBorders>
+            <w:shd w:val="clear" w:color="auto" w:fill="FFFFFF"/>
+            <w:tcMar>
+              <w:top w:w="0" w:type="dxa"/>
+              <w:bottom w:w="0" w:type="dxa"/>
+              <w:left w:w="0" w:type="dxa"/>
+              <w:right w:w="0" w:type="dxa"/>
+            </w:tcMar>
+            <w:vAlign w:val="top"/>
+          </w:tcPr>
+          <w:p>
+            <w:pPr>
+              <w:pStyle w:val="Normal"/>
+              <w:jc w:val="center"/>
+              <w:pBdr>
+                <w:bottom w:val="none" w:sz="0" w:space="0" w:color="000000"/>
+                <w:top w:val="none" w:sz="0" w:space="0" w:color="000000"/>
+                <w:left w:val="none" w:sz="0" w:space="0" w:color="000000"/>
+                <w:right w:val="none" w:sz="0" w:space="0" w:color="000000"/>
+              </w:pBdr>
+              <w:spacing w:after="100" w:before="100" w:line="240"/>
+              <w:ind w:left="100" w:right="100" w:firstLine="0" w:firstLineChars="0"/>
+              <w:rPr>
+                <w:rFonts w:ascii="Times New Roman" w:hAnsi="Times New Roman" w:eastAsia="Times New Roman" w:cs="Times New Roman"/>
+                <w:i w:val="false"/>
+                <w:b w:val="false"/>
+                <w:u w:val="none"/>
+                <w:strike w:val="false"/>
+                <w:sz w:val="18"/>
+                <w:szCs w:val="18"/>
+                <w:color w:val="000000"/>
+              </w:rPr>
+            </w:pPr>
+            <w:r>
+              <w:rPr>
+                <w:rFonts w:ascii="Times New Roman" w:hAnsi="Times New Roman" w:eastAsia="Times New Roman" w:cs="Times New Roman"/>
+                <w:i w:val="false"/>
+                <w:b w:val="false"/>
+                <w:u w:val="none"/>
+                <w:strike w:val="false"/>
+                <w:sz w:val="18"/>
+                <w:szCs w:val="18"/>
+                <w:color w:val="000000"/>
+              </w:rPr>
+              <w:t xml:space="preserve"/>
+            </w:r>
+          </w:p>
+        </w:tc>
       </w:tr>
       <w:tr>
         <w:trPr>
@@ -14947,6 +17754,61 @@
             </w:r>
           </w:p>
         </w:tc>
+        <w:tc>
+          <w:tcPr>
+            <w:tcBorders>
+              <w:bottom w:val="none" w:sz="0" w:space="0" w:color="000000"/>
+              <w:top w:val="none" w:sz="0" w:space="0" w:color="000000"/>
+              <w:left w:val="none" w:sz="0" w:space="0" w:color="000000"/>
+              <w:right w:val="none" w:sz="0" w:space="0" w:color="000000"/>
+            </w:tcBorders>
+            <w:shd w:val="clear" w:color="auto" w:fill="FFFFFF"/>
+            <w:tcMar>
+              <w:top w:w="0" w:type="dxa"/>
+              <w:bottom w:w="0" w:type="dxa"/>
+              <w:left w:w="0" w:type="dxa"/>
+              <w:right w:w="0" w:type="dxa"/>
+            </w:tcMar>
+            <w:vAlign w:val="top"/>
+          </w:tcPr>
+          <w:p>
+            <w:pPr>
+              <w:pStyle w:val="Normal"/>
+              <w:jc w:val="center"/>
+              <w:pBdr>
+                <w:bottom w:val="none" w:sz="0" w:space="0" w:color="000000"/>
+                <w:top w:val="none" w:sz="0" w:space="0" w:color="000000"/>
+                <w:left w:val="none" w:sz="0" w:space="0" w:color="000000"/>
+                <w:right w:val="none" w:sz="0" w:space="0" w:color="000000"/>
+              </w:pBdr>
+              <w:spacing w:after="100" w:before="100" w:line="240"/>
+              <w:ind w:left="100" w:right="100" w:firstLine="0" w:firstLineChars="0"/>
+              <w:rPr>
+                <w:rFonts w:ascii="Times New Roman" w:hAnsi="Times New Roman" w:eastAsia="Times New Roman" w:cs="Times New Roman"/>
+                <w:i w:val="false"/>
+                <w:b w:val="false"/>
+                <w:u w:val="none"/>
+                <w:strike w:val="false"/>
+                <w:sz w:val="18"/>
+                <w:szCs w:val="18"/>
+                <w:color w:val="000000"/>
+              </w:rPr>
+            </w:pPr>
+            <w:r>
+              <w:rPr>
+                <w:rFonts w:ascii="Times New Roman" w:hAnsi="Times New Roman" w:eastAsia="Times New Roman" w:cs="Times New Roman"/>
+                <w:i w:val="false"/>
+                <w:b w:val="false"/>
+                <w:u w:val="none"/>
+                <w:strike w:val="false"/>
+                <w:sz w:val="18"/>
+                <w:szCs w:val="18"/>
+                <w:color w:val="000000"/>
+              </w:rPr>
+              <w:t xml:space="preserve"/>
+            </w:r>
+          </w:p>
+        </w:tc>
       </w:tr>
       <w:tr>
         <w:trPr>
@@ -15227,6 +18089,61 @@
             </w:r>
           </w:p>
         </w:tc>
+        <w:tc>
+          <w:tcPr>
+            <w:tcBorders>
+              <w:bottom w:val="none" w:sz="0" w:space="0" w:color="000000"/>
+              <w:top w:val="none" w:sz="0" w:space="0" w:color="000000"/>
+              <w:left w:val="none" w:sz="0" w:space="0" w:color="000000"/>
+              <w:right w:val="none" w:sz="0" w:space="0" w:color="000000"/>
+            </w:tcBorders>
+            <w:shd w:val="clear" w:color="auto" w:fill="FFFFFF"/>
+            <w:tcMar>
+              <w:top w:w="0" w:type="dxa"/>
+              <w:bottom w:w="0" w:type="dxa"/>
+              <w:left w:w="0" w:type="dxa"/>
+              <w:right w:w="0" w:type="dxa"/>
+            </w:tcMar>
+            <w:vAlign w:val="top"/>
+          </w:tcPr>
+          <w:p>
+            <w:pPr>
+              <w:pStyle w:val="Normal"/>
+              <w:jc w:val="center"/>
+              <w:pBdr>
+                <w:bottom w:val="none" w:sz="0" w:space="0" w:color="000000"/>
+                <w:top w:val="none" w:sz="0" w:space="0" w:color="000000"/>
+                <w:left w:val="none" w:sz="0" w:space="0" w:color="000000"/>
+                <w:right w:val="none" w:sz="0" w:space="0" w:color="000000"/>
+              </w:pBdr>
+              <w:spacing w:after="100" w:before="100" w:line="240"/>
+              <w:ind w:left="100" w:right="100" w:firstLine="0" w:firstLineChars="0"/>
+              <w:rPr>
+                <w:rFonts w:ascii="Times New Roman" w:hAnsi="Times New Roman" w:eastAsia="Times New Roman" w:cs="Times New Roman"/>
+                <w:i w:val="false"/>
+                <w:b w:val="false"/>
+                <w:u w:val="none"/>
+                <w:strike w:val="false"/>
+                <w:sz w:val="18"/>
+                <w:szCs w:val="18"/>
+                <w:color w:val="000000"/>
+              </w:rPr>
+            </w:pPr>
+            <w:r>
+              <w:rPr>
+                <w:rFonts w:ascii="Times New Roman" w:hAnsi="Times New Roman" w:eastAsia="Times New Roman" w:cs="Times New Roman"/>
+                <w:i w:val="false"/>
+                <w:b w:val="false"/>
+                <w:u w:val="none"/>
+                <w:strike w:val="false"/>
+                <w:sz w:val="18"/>
+                <w:szCs w:val="18"/>
+                <w:color w:val="000000"/>
+              </w:rPr>
+              <w:t xml:space="preserve">0.001</w:t>
+            </w:r>
+          </w:p>
+        </w:tc>
       </w:tr>
       <w:tr>
         <w:trPr>
@@ -15507,6 +18424,61 @@
             </w:r>
           </w:p>
         </w:tc>
+        <w:tc>
+          <w:tcPr>
+            <w:tcBorders>
+              <w:bottom w:val="none" w:sz="0" w:space="0" w:color="000000"/>
+              <w:top w:val="none" w:sz="0" w:space="0" w:color="000000"/>
+              <w:left w:val="none" w:sz="0" w:space="0" w:color="000000"/>
+              <w:right w:val="none" w:sz="0" w:space="0" w:color="000000"/>
+            </w:tcBorders>
+            <w:shd w:val="clear" w:color="auto" w:fill="FFFFFF"/>
+            <w:tcMar>
+              <w:top w:w="0" w:type="dxa"/>
+              <w:bottom w:w="0" w:type="dxa"/>
+              <w:left w:w="0" w:type="dxa"/>
+              <w:right w:w="0" w:type="dxa"/>
+            </w:tcMar>
+            <w:vAlign w:val="top"/>
+          </w:tcPr>
+          <w:p>
+            <w:pPr>
+              <w:pStyle w:val="Normal"/>
+              <w:jc w:val="center"/>
+              <w:pBdr>
+                <w:bottom w:val="none" w:sz="0" w:space="0" w:color="000000"/>
+                <w:top w:val="none" w:sz="0" w:space="0" w:color="000000"/>
+                <w:left w:val="none" w:sz="0" w:space="0" w:color="000000"/>
+                <w:right w:val="none" w:sz="0" w:space="0" w:color="000000"/>
+              </w:pBdr>
+              <w:spacing w:after="100" w:before="100" w:line="240"/>
+              <w:ind w:left="100" w:right="100" w:firstLine="0" w:firstLineChars="0"/>
+              <w:rPr>
+                <w:rFonts w:ascii="Times New Roman" w:hAnsi="Times New Roman" w:eastAsia="Times New Roman" w:cs="Times New Roman"/>
+                <w:i w:val="false"/>
+                <w:b w:val="false"/>
+                <w:u w:val="none"/>
+                <w:strike w:val="false"/>
+                <w:sz w:val="18"/>
+                <w:szCs w:val="18"/>
+                <w:color w:val="000000"/>
+              </w:rPr>
+            </w:pPr>
+            <w:r>
+              <w:rPr>
+                <w:rFonts w:ascii="Times New Roman" w:hAnsi="Times New Roman" w:eastAsia="Times New Roman" w:cs="Times New Roman"/>
+                <w:i w:val="false"/>
+                <w:b w:val="false"/>
+                <w:u w:val="none"/>
+                <w:strike w:val="false"/>
+                <w:sz w:val="18"/>
+                <w:szCs w:val="18"/>
+                <w:color w:val="000000"/>
+              </w:rPr>
+              <w:t xml:space="preserve"/>
+            </w:r>
+          </w:p>
+        </w:tc>
       </w:tr>
       <w:tr>
         <w:trPr>
@@ -15787,6 +18759,61 @@
             </w:r>
           </w:p>
         </w:tc>
+        <w:tc>
+          <w:tcPr>
+            <w:tcBorders>
+              <w:bottom w:val="none" w:sz="0" w:space="0" w:color="000000"/>
+              <w:top w:val="none" w:sz="0" w:space="0" w:color="000000"/>
+              <w:left w:val="none" w:sz="0" w:space="0" w:color="000000"/>
+              <w:right w:val="none" w:sz="0" w:space="0" w:color="000000"/>
+            </w:tcBorders>
+            <w:shd w:val="clear" w:color="auto" w:fill="FFFFFF"/>
+            <w:tcMar>
+              <w:top w:w="0" w:type="dxa"/>
+              <w:bottom w:w="0" w:type="dxa"/>
+              <w:left w:w="0" w:type="dxa"/>
+              <w:right w:w="0" w:type="dxa"/>
+            </w:tcMar>
+            <w:vAlign w:val="top"/>
+          </w:tcPr>
+          <w:p>
+            <w:pPr>
+              <w:pStyle w:val="Normal"/>
+              <w:jc w:val="center"/>
+              <w:pBdr>
+                <w:bottom w:val="none" w:sz="0" w:space="0" w:color="000000"/>
+                <w:top w:val="none" w:sz="0" w:space="0" w:color="000000"/>
+                <w:left w:val="none" w:sz="0" w:space="0" w:color="000000"/>
+                <w:right w:val="none" w:sz="0" w:space="0" w:color="000000"/>
+              </w:pBdr>
+              <w:spacing w:after="100" w:before="100" w:line="240"/>
+              <w:ind w:left="100" w:right="100" w:firstLine="0" w:firstLineChars="0"/>
+              <w:rPr>
+                <w:rFonts w:ascii="Times New Roman" w:hAnsi="Times New Roman" w:eastAsia="Times New Roman" w:cs="Times New Roman"/>
+                <w:i w:val="false"/>
+                <w:b w:val="false"/>
+                <w:u w:val="none"/>
+                <w:strike w:val="false"/>
+                <w:sz w:val="18"/>
+                <w:szCs w:val="18"/>
+                <w:color w:val="000000"/>
+              </w:rPr>
+            </w:pPr>
+            <w:r>
+              <w:rPr>
+                <w:rFonts w:ascii="Times New Roman" w:hAnsi="Times New Roman" w:eastAsia="Times New Roman" w:cs="Times New Roman"/>
+                <w:i w:val="false"/>
+                <w:b w:val="false"/>
+                <w:u w:val="none"/>
+                <w:strike w:val="false"/>
+                <w:sz w:val="18"/>
+                <w:szCs w:val="18"/>
+                <w:color w:val="000000"/>
+              </w:rPr>
+              <w:t xml:space="preserve"/>
+            </w:r>
+          </w:p>
+        </w:tc>
       </w:tr>
       <w:tr>
         <w:trPr>
@@ -16067,6 +19094,61 @@
             </w:r>
           </w:p>
         </w:tc>
+        <w:tc>
+          <w:tcPr>
+            <w:tcBorders>
+              <w:bottom w:val="none" w:sz="0" w:space="0" w:color="000000"/>
+              <w:top w:val="none" w:sz="0" w:space="0" w:color="000000"/>
+              <w:left w:val="none" w:sz="0" w:space="0" w:color="000000"/>
+              <w:right w:val="none" w:sz="0" w:space="0" w:color="000000"/>
+            </w:tcBorders>
+            <w:shd w:val="clear" w:color="auto" w:fill="FFFFFF"/>
+            <w:tcMar>
+              <w:top w:w="0" w:type="dxa"/>
+              <w:bottom w:w="0" w:type="dxa"/>
+              <w:left w:w="0" w:type="dxa"/>
+              <w:right w:w="0" w:type="dxa"/>
+            </w:tcMar>
+            <w:vAlign w:val="top"/>
+          </w:tcPr>
+          <w:p>
+            <w:pPr>
+              <w:pStyle w:val="Normal"/>
+              <w:jc w:val="center"/>
+              <w:pBdr>
+                <w:bottom w:val="none" w:sz="0" w:space="0" w:color="000000"/>
+                <w:top w:val="none" w:sz="0" w:space="0" w:color="000000"/>
+                <w:left w:val="none" w:sz="0" w:space="0" w:color="000000"/>
+                <w:right w:val="none" w:sz="0" w:space="0" w:color="000000"/>
+              </w:pBdr>
+              <w:spacing w:after="100" w:before="100" w:line="240"/>
+              <w:ind w:left="100" w:right="100" w:firstLine="0" w:firstLineChars="0"/>
+              <w:rPr>
+                <w:rFonts w:ascii="Times New Roman" w:hAnsi="Times New Roman" w:eastAsia="Times New Roman" w:cs="Times New Roman"/>
+                <w:i w:val="false"/>
+                <w:b w:val="false"/>
+                <w:u w:val="none"/>
+                <w:strike w:val="false"/>
+                <w:sz w:val="18"/>
+                <w:szCs w:val="18"/>
+                <w:color w:val="000000"/>
+              </w:rPr>
+            </w:pPr>
+            <w:r>
+              <w:rPr>
+                <w:rFonts w:ascii="Times New Roman" w:hAnsi="Times New Roman" w:eastAsia="Times New Roman" w:cs="Times New Roman"/>
+                <w:i w:val="false"/>
+                <w:b w:val="false"/>
+                <w:u w:val="none"/>
+                <w:strike w:val="false"/>
+                <w:sz w:val="18"/>
+                <w:szCs w:val="18"/>
+                <w:color w:val="000000"/>
+              </w:rPr>
+              <w:t xml:space="preserve"/>
+            </w:r>
+          </w:p>
+        </w:tc>
       </w:tr>
       <w:tr>
         <w:trPr>
@@ -16347,6 +19429,61 @@
             </w:r>
           </w:p>
         </w:tc>
+        <w:tc>
+          <w:tcPr>
+            <w:tcBorders>
+              <w:bottom w:val="none" w:sz="0" w:space="0" w:color="000000"/>
+              <w:top w:val="none" w:sz="0" w:space="0" w:color="000000"/>
+              <w:left w:val="none" w:sz="0" w:space="0" w:color="000000"/>
+              <w:right w:val="none" w:sz="0" w:space="0" w:color="000000"/>
+            </w:tcBorders>
+            <w:shd w:val="clear" w:color="auto" w:fill="FFFFFF"/>
+            <w:tcMar>
+              <w:top w:w="0" w:type="dxa"/>
+              <w:bottom w:w="0" w:type="dxa"/>
+              <w:left w:w="0" w:type="dxa"/>
+              <w:right w:w="0" w:type="dxa"/>
+            </w:tcMar>
+            <w:vAlign w:val="top"/>
+          </w:tcPr>
+          <w:p>
+            <w:pPr>
+              <w:pStyle w:val="Normal"/>
+              <w:jc w:val="center"/>
+              <w:pBdr>
+                <w:bottom w:val="none" w:sz="0" w:space="0" w:color="000000"/>
+                <w:top w:val="none" w:sz="0" w:space="0" w:color="000000"/>
+                <w:left w:val="none" w:sz="0" w:space="0" w:color="000000"/>
+                <w:right w:val="none" w:sz="0" w:space="0" w:color="000000"/>
+              </w:pBdr>
+              <w:spacing w:after="100" w:before="100" w:line="240"/>
+              <w:ind w:left="100" w:right="100" w:firstLine="0" w:firstLineChars="0"/>
+              <w:rPr>
+                <w:rFonts w:ascii="Times New Roman" w:hAnsi="Times New Roman" w:eastAsia="Times New Roman" w:cs="Times New Roman"/>
+                <w:i w:val="false"/>
+                <w:b w:val="false"/>
+                <w:u w:val="none"/>
+                <w:strike w:val="false"/>
+                <w:sz w:val="18"/>
+                <w:szCs w:val="18"/>
+                <w:color w:val="000000"/>
+              </w:rPr>
+            </w:pPr>
+            <w:r>
+              <w:rPr>
+                <w:rFonts w:ascii="Times New Roman" w:hAnsi="Times New Roman" w:eastAsia="Times New Roman" w:cs="Times New Roman"/>
+                <w:i w:val="false"/>
+                <w:b w:val="false"/>
+                <w:u w:val="none"/>
+                <w:strike w:val="false"/>
+                <w:sz w:val="18"/>
+                <w:szCs w:val="18"/>
+                <w:color w:val="000000"/>
+              </w:rPr>
+              <w:t xml:space="preserve"/>
+            </w:r>
+          </w:p>
+        </w:tc>
       </w:tr>
       <w:tr>
         <w:trPr>
@@ -16627,6 +19764,61 @@
             </w:r>
           </w:p>
         </w:tc>
+        <w:tc>
+          <w:tcPr>
+            <w:tcBorders>
+              <w:bottom w:val="none" w:sz="0" w:space="0" w:color="000000"/>
+              <w:top w:val="none" w:sz="0" w:space="0" w:color="000000"/>
+              <w:left w:val="none" w:sz="0" w:space="0" w:color="000000"/>
+              <w:right w:val="none" w:sz="0" w:space="0" w:color="000000"/>
+            </w:tcBorders>
+            <w:shd w:val="clear" w:color="auto" w:fill="FFFFFF"/>
+            <w:tcMar>
+              <w:top w:w="0" w:type="dxa"/>
+              <w:bottom w:w="0" w:type="dxa"/>
+              <w:left w:w="0" w:type="dxa"/>
+              <w:right w:w="0" w:type="dxa"/>
+            </w:tcMar>
+            <w:vAlign w:val="top"/>
+          </w:tcPr>
+          <w:p>
+            <w:pPr>
+              <w:pStyle w:val="Normal"/>
+              <w:jc w:val="center"/>
+              <w:pBdr>
+                <w:bottom w:val="none" w:sz="0" w:space="0" w:color="000000"/>
+                <w:top w:val="none" w:sz="0" w:space="0" w:color="000000"/>
+                <w:left w:val="none" w:sz="0" w:space="0" w:color="000000"/>
+                <w:right w:val="none" w:sz="0" w:space="0" w:color="000000"/>
+              </w:pBdr>
+              <w:spacing w:after="100" w:before="100" w:line="240"/>
+              <w:ind w:left="100" w:right="100" w:firstLine="0" w:firstLineChars="0"/>
+              <w:rPr>
+                <w:rFonts w:ascii="Times New Roman" w:hAnsi="Times New Roman" w:eastAsia="Times New Roman" w:cs="Times New Roman"/>
+                <w:i w:val="false"/>
+                <w:b w:val="false"/>
+                <w:u w:val="none"/>
+                <w:strike w:val="false"/>
+                <w:sz w:val="18"/>
+                <w:szCs w:val="18"/>
+                <w:color w:val="000000"/>
+              </w:rPr>
+            </w:pPr>
+            <w:r>
+              <w:rPr>
+                <w:rFonts w:ascii="Times New Roman" w:hAnsi="Times New Roman" w:eastAsia="Times New Roman" w:cs="Times New Roman"/>
+                <w:i w:val="false"/>
+                <w:b w:val="false"/>
+                <w:u w:val="none"/>
+                <w:strike w:val="false"/>
+                <w:sz w:val="18"/>
+                <w:szCs w:val="18"/>
+                <w:color w:val="000000"/>
+              </w:rPr>
+              <w:t xml:space="preserve"/>
+            </w:r>
+          </w:p>
+        </w:tc>
       </w:tr>
       <w:tr>
         <w:trPr>
@@ -16907,6 +20099,61 @@
             </w:r>
           </w:p>
         </w:tc>
+        <w:tc>
+          <w:tcPr>
+            <w:tcBorders>
+              <w:bottom w:val="none" w:sz="0" w:space="0" w:color="000000"/>
+              <w:top w:val="none" w:sz="0" w:space="0" w:color="000000"/>
+              <w:left w:val="none" w:sz="0" w:space="0" w:color="000000"/>
+              <w:right w:val="none" w:sz="0" w:space="0" w:color="000000"/>
+            </w:tcBorders>
+            <w:shd w:val="clear" w:color="auto" w:fill="FFFFFF"/>
+            <w:tcMar>
+              <w:top w:w="0" w:type="dxa"/>
+              <w:bottom w:w="0" w:type="dxa"/>
+              <w:left w:w="0" w:type="dxa"/>
+              <w:right w:w="0" w:type="dxa"/>
+            </w:tcMar>
+            <w:vAlign w:val="top"/>
+          </w:tcPr>
+          <w:p>
+            <w:pPr>
+              <w:pStyle w:val="Normal"/>
+              <w:jc w:val="center"/>
+              <w:pBdr>
+                <w:bottom w:val="none" w:sz="0" w:space="0" w:color="000000"/>
+                <w:top w:val="none" w:sz="0" w:space="0" w:color="000000"/>
+                <w:left w:val="none" w:sz="0" w:space="0" w:color="000000"/>
+                <w:right w:val="none" w:sz="0" w:space="0" w:color="000000"/>
+              </w:pBdr>
+              <w:spacing w:after="100" w:before="100" w:line="240"/>
+              <w:ind w:left="100" w:right="100" w:firstLine="0" w:firstLineChars="0"/>
+              <w:rPr>
+                <w:rFonts w:ascii="Times New Roman" w:hAnsi="Times New Roman" w:eastAsia="Times New Roman" w:cs="Times New Roman"/>
+                <w:i w:val="false"/>
+                <w:b w:val="false"/>
+                <w:u w:val="none"/>
+                <w:strike w:val="false"/>
+                <w:sz w:val="18"/>
+                <w:szCs w:val="18"/>
+                <w:color w:val="000000"/>
+              </w:rPr>
+            </w:pPr>
+            <w:r>
+              <w:rPr>
+                <w:rFonts w:ascii="Times New Roman" w:hAnsi="Times New Roman" w:eastAsia="Times New Roman" w:cs="Times New Roman"/>
+                <w:i w:val="false"/>
+                <w:b w:val="false"/>
+                <w:u w:val="none"/>
+                <w:strike w:val="false"/>
+                <w:sz w:val="18"/>
+                <w:szCs w:val="18"/>
+                <w:color w:val="000000"/>
+              </w:rPr>
+              <w:t xml:space="preserve"/>
+            </w:r>
+          </w:p>
+        </w:tc>
       </w:tr>
       <w:tr>
         <w:trPr>
@@ -17187,6 +20434,61 @@
             </w:r>
           </w:p>
         </w:tc>
+        <w:tc>
+          <w:tcPr>
+            <w:tcBorders>
+              <w:bottom w:val="none" w:sz="0" w:space="0" w:color="000000"/>
+              <w:top w:val="none" w:sz="0" w:space="0" w:color="000000"/>
+              <w:left w:val="none" w:sz="0" w:space="0" w:color="000000"/>
+              <w:right w:val="none" w:sz="0" w:space="0" w:color="000000"/>
+            </w:tcBorders>
+            <w:shd w:val="clear" w:color="auto" w:fill="FFFFFF"/>
+            <w:tcMar>
+              <w:top w:w="0" w:type="dxa"/>
+              <w:bottom w:w="0" w:type="dxa"/>
+              <w:left w:w="0" w:type="dxa"/>
+              <w:right w:w="0" w:type="dxa"/>
+            </w:tcMar>
+            <w:vAlign w:val="top"/>
+          </w:tcPr>
+          <w:p>
+            <w:pPr>
+              <w:pStyle w:val="Normal"/>
+              <w:jc w:val="center"/>
+              <w:pBdr>
+                <w:bottom w:val="none" w:sz="0" w:space="0" w:color="000000"/>
+                <w:top w:val="none" w:sz="0" w:space="0" w:color="000000"/>
+                <w:left w:val="none" w:sz="0" w:space="0" w:color="000000"/>
+                <w:right w:val="none" w:sz="0" w:space="0" w:color="000000"/>
+              </w:pBdr>
+              <w:spacing w:after="100" w:before="100" w:line="240"/>
+              <w:ind w:left="100" w:right="100" w:firstLine="0" w:firstLineChars="0"/>
+              <w:rPr>
+                <w:rFonts w:ascii="Times New Roman" w:hAnsi="Times New Roman" w:eastAsia="Times New Roman" w:cs="Times New Roman"/>
+                <w:i w:val="false"/>
+                <w:b w:val="false"/>
+                <w:u w:val="none"/>
+                <w:strike w:val="false"/>
+                <w:sz w:val="18"/>
+                <w:szCs w:val="18"/>
+                <w:color w:val="000000"/>
+              </w:rPr>
+            </w:pPr>
+            <w:r>
+              <w:rPr>
+                <w:rFonts w:ascii="Times New Roman" w:hAnsi="Times New Roman" w:eastAsia="Times New Roman" w:cs="Times New Roman"/>
+                <w:i w:val="false"/>
+                <w:b w:val="false"/>
+                <w:u w:val="none"/>
+                <w:strike w:val="false"/>
+                <w:sz w:val="18"/>
+                <w:szCs w:val="18"/>
+                <w:color w:val="000000"/>
+              </w:rPr>
+              <w:t xml:space="preserve"/>
+            </w:r>
+          </w:p>
+        </w:tc>
       </w:tr>
       <w:tr>
         <w:trPr>
@@ -17467,6 +20769,61 @@
             </w:r>
           </w:p>
         </w:tc>
+        <w:tc>
+          <w:tcPr>
+            <w:tcBorders>
+              <w:bottom w:val="none" w:sz="0" w:space="0" w:color="000000"/>
+              <w:top w:val="none" w:sz="0" w:space="0" w:color="000000"/>
+              <w:left w:val="none" w:sz="0" w:space="0" w:color="000000"/>
+              <w:right w:val="none" w:sz="0" w:space="0" w:color="000000"/>
+            </w:tcBorders>
+            <w:shd w:val="clear" w:color="auto" w:fill="FFFFFF"/>
+            <w:tcMar>
+              <w:top w:w="0" w:type="dxa"/>
+              <w:bottom w:w="0" w:type="dxa"/>
+              <w:left w:w="0" w:type="dxa"/>
+              <w:right w:w="0" w:type="dxa"/>
+            </w:tcMar>
+            <w:vAlign w:val="top"/>
+          </w:tcPr>
+          <w:p>
+            <w:pPr>
+              <w:pStyle w:val="Normal"/>
+              <w:jc w:val="center"/>
+              <w:pBdr>
+                <w:bottom w:val="none" w:sz="0" w:space="0" w:color="000000"/>
+                <w:top w:val="none" w:sz="0" w:space="0" w:color="000000"/>
+                <w:left w:val="none" w:sz="0" w:space="0" w:color="000000"/>
+                <w:right w:val="none" w:sz="0" w:space="0" w:color="000000"/>
+              </w:pBdr>
+              <w:spacing w:after="100" w:before="100" w:line="240"/>
+              <w:ind w:left="100" w:right="100" w:firstLine="0" w:firstLineChars="0"/>
+              <w:rPr>
+                <w:rFonts w:ascii="Times New Roman" w:hAnsi="Times New Roman" w:eastAsia="Times New Roman" w:cs="Times New Roman"/>
+                <w:i w:val="false"/>
+                <w:b w:val="false"/>
+                <w:u w:val="none"/>
+                <w:strike w:val="false"/>
+                <w:sz w:val="18"/>
+                <w:szCs w:val="18"/>
+                <w:color w:val="000000"/>
+              </w:rPr>
+            </w:pPr>
+            <w:r>
+              <w:rPr>
+                <w:rFonts w:ascii="Times New Roman" w:hAnsi="Times New Roman" w:eastAsia="Times New Roman" w:cs="Times New Roman"/>
+                <w:i w:val="false"/>
+                <w:b w:val="false"/>
+                <w:u w:val="none"/>
+                <w:strike w:val="false"/>
+                <w:sz w:val="18"/>
+                <w:szCs w:val="18"/>
+                <w:color w:val="000000"/>
+              </w:rPr>
+              <w:t xml:space="preserve"/>
+            </w:r>
+          </w:p>
+        </w:tc>
       </w:tr>
       <w:tr>
         <w:trPr>
@@ -17747,6 +21104,61 @@
             </w:r>
           </w:p>
         </w:tc>
+        <w:tc>
+          <w:tcPr>
+            <w:tcBorders>
+              <w:bottom w:val="none" w:sz="0" w:space="0" w:color="000000"/>
+              <w:top w:val="none" w:sz="0" w:space="0" w:color="000000"/>
+              <w:left w:val="none" w:sz="0" w:space="0" w:color="000000"/>
+              <w:right w:val="none" w:sz="0" w:space="0" w:color="000000"/>
+            </w:tcBorders>
+            <w:shd w:val="clear" w:color="auto" w:fill="FFFFFF"/>
+            <w:tcMar>
+              <w:top w:w="0" w:type="dxa"/>
+              <w:bottom w:w="0" w:type="dxa"/>
+              <w:left w:w="0" w:type="dxa"/>
+              <w:right w:w="0" w:type="dxa"/>
+            </w:tcMar>
+            <w:vAlign w:val="top"/>
+          </w:tcPr>
+          <w:p>
+            <w:pPr>
+              <w:pStyle w:val="Normal"/>
+              <w:jc w:val="center"/>
+              <w:pBdr>
+                <w:bottom w:val="none" w:sz="0" w:space="0" w:color="000000"/>
+                <w:top w:val="none" w:sz="0" w:space="0" w:color="000000"/>
+                <w:left w:val="none" w:sz="0" w:space="0" w:color="000000"/>
+                <w:right w:val="none" w:sz="0" w:space="0" w:color="000000"/>
+              </w:pBdr>
+              <w:spacing w:after="100" w:before="100" w:line="240"/>
+              <w:ind w:left="100" w:right="100" w:firstLine="0" w:firstLineChars="0"/>
+              <w:rPr>
+                <w:rFonts w:ascii="Times New Roman" w:hAnsi="Times New Roman" w:eastAsia="Times New Roman" w:cs="Times New Roman"/>
+                <w:i w:val="false"/>
+                <w:b w:val="false"/>
+                <w:u w:val="none"/>
+                <w:strike w:val="false"/>
+                <w:sz w:val="18"/>
+                <w:szCs w:val="18"/>
+                <w:color w:val="000000"/>
+              </w:rPr>
+            </w:pPr>
+            <w:r>
+              <w:rPr>
+                <w:rFonts w:ascii="Times New Roman" w:hAnsi="Times New Roman" w:eastAsia="Times New Roman" w:cs="Times New Roman"/>
+                <w:i w:val="false"/>
+                <w:b w:val="false"/>
+                <w:u w:val="none"/>
+                <w:strike w:val="false"/>
+                <w:sz w:val="18"/>
+                <w:szCs w:val="18"/>
+                <w:color w:val="000000"/>
+              </w:rPr>
+              <w:t xml:space="preserve"/>
+            </w:r>
+          </w:p>
+        </w:tc>
       </w:tr>
       <w:tr>
         <w:trPr>
@@ -18027,6 +21439,61 @@
             </w:r>
           </w:p>
         </w:tc>
+        <w:tc>
+          <w:tcPr>
+            <w:tcBorders>
+              <w:bottom w:val="none" w:sz="0" w:space="0" w:color="000000"/>
+              <w:top w:val="none" w:sz="0" w:space="0" w:color="000000"/>
+              <w:left w:val="none" w:sz="0" w:space="0" w:color="000000"/>
+              <w:right w:val="none" w:sz="0" w:space="0" w:color="000000"/>
+            </w:tcBorders>
+            <w:shd w:val="clear" w:color="auto" w:fill="FFFFFF"/>
+            <w:tcMar>
+              <w:top w:w="0" w:type="dxa"/>
+              <w:bottom w:w="0" w:type="dxa"/>
+              <w:left w:w="0" w:type="dxa"/>
+              <w:right w:w="0" w:type="dxa"/>
+            </w:tcMar>
+            <w:vAlign w:val="top"/>
+          </w:tcPr>
+          <w:p>
+            <w:pPr>
+              <w:pStyle w:val="Normal"/>
+              <w:jc w:val="center"/>
+              <w:pBdr>
+                <w:bottom w:val="none" w:sz="0" w:space="0" w:color="000000"/>
+                <w:top w:val="none" w:sz="0" w:space="0" w:color="000000"/>
+                <w:left w:val="none" w:sz="0" w:space="0" w:color="000000"/>
+                <w:right w:val="none" w:sz="0" w:space="0" w:color="000000"/>
+              </w:pBdr>
+              <w:spacing w:after="100" w:before="100" w:line="240"/>
+              <w:ind w:left="100" w:right="100" w:firstLine="0" w:firstLineChars="0"/>
+              <w:rPr>
+                <w:rFonts w:ascii="Times New Roman" w:hAnsi="Times New Roman" w:eastAsia="Times New Roman" w:cs="Times New Roman"/>
+                <w:i w:val="false"/>
+                <w:b w:val="false"/>
+                <w:u w:val="none"/>
+                <w:strike w:val="false"/>
+                <w:sz w:val="18"/>
+                <w:szCs w:val="18"/>
+                <w:color w:val="000000"/>
+              </w:rPr>
+            </w:pPr>
+            <w:r>
+              <w:rPr>
+                <w:rFonts w:ascii="Times New Roman" w:hAnsi="Times New Roman" w:eastAsia="Times New Roman" w:cs="Times New Roman"/>
+                <w:i w:val="false"/>
+                <w:b w:val="false"/>
+                <w:u w:val="none"/>
+                <w:strike w:val="false"/>
+                <w:sz w:val="18"/>
+                <w:szCs w:val="18"/>
+                <w:color w:val="000000"/>
+              </w:rPr>
+              <w:t xml:space="preserve">&lt;0.001</w:t>
+            </w:r>
+          </w:p>
+        </w:tc>
       </w:tr>
       <w:tr>
         <w:trPr>
@@ -18307,6 +21774,61 @@
             </w:r>
           </w:p>
         </w:tc>
+        <w:tc>
+          <w:tcPr>
+            <w:tcBorders>
+              <w:bottom w:val="none" w:sz="0" w:space="0" w:color="000000"/>
+              <w:top w:val="none" w:sz="0" w:space="0" w:color="000000"/>
+              <w:left w:val="none" w:sz="0" w:space="0" w:color="000000"/>
+              <w:right w:val="none" w:sz="0" w:space="0" w:color="000000"/>
+            </w:tcBorders>
+            <w:shd w:val="clear" w:color="auto" w:fill="FFFFFF"/>
+            <w:tcMar>
+              <w:top w:w="0" w:type="dxa"/>
+              <w:bottom w:w="0" w:type="dxa"/>
+              <w:left w:w="0" w:type="dxa"/>
+              <w:right w:w="0" w:type="dxa"/>
+            </w:tcMar>
+            <w:vAlign w:val="top"/>
+          </w:tcPr>
+          <w:p>
+            <w:pPr>
+              <w:pStyle w:val="Normal"/>
+              <w:jc w:val="center"/>
+              <w:pBdr>
+                <w:bottom w:val="none" w:sz="0" w:space="0" w:color="000000"/>
+                <w:top w:val="none" w:sz="0" w:space="0" w:color="000000"/>
+                <w:left w:val="none" w:sz="0" w:space="0" w:color="000000"/>
+                <w:right w:val="none" w:sz="0" w:space="0" w:color="000000"/>
+              </w:pBdr>
+              <w:spacing w:after="100" w:before="100" w:line="240"/>
+              <w:ind w:left="100" w:right="100" w:firstLine="0" w:firstLineChars="0"/>
+              <w:rPr>
+                <w:rFonts w:ascii="Times New Roman" w:hAnsi="Times New Roman" w:eastAsia="Times New Roman" w:cs="Times New Roman"/>
+                <w:i w:val="false"/>
+                <w:b w:val="false"/>
+                <w:u w:val="none"/>
+                <w:strike w:val="false"/>
+                <w:sz w:val="18"/>
+                <w:szCs w:val="18"/>
+                <w:color w:val="000000"/>
+              </w:rPr>
+            </w:pPr>
+            <w:r>
+              <w:rPr>
+                <w:rFonts w:ascii="Times New Roman" w:hAnsi="Times New Roman" w:eastAsia="Times New Roman" w:cs="Times New Roman"/>
+                <w:i w:val="false"/>
+                <w:b w:val="false"/>
+                <w:u w:val="none"/>
+                <w:strike w:val="false"/>
+                <w:sz w:val="18"/>
+                <w:szCs w:val="18"/>
+                <w:color w:val="000000"/>
+              </w:rPr>
+              <w:t xml:space="preserve"/>
+            </w:r>
+          </w:p>
+        </w:tc>
       </w:tr>
       <w:tr>
         <w:trPr>
@@ -18587,6 +22109,61 @@
             </w:r>
           </w:p>
         </w:tc>
+        <w:tc>
+          <w:tcPr>
+            <w:tcBorders>
+              <w:bottom w:val="none" w:sz="0" w:space="0" w:color="000000"/>
+              <w:top w:val="none" w:sz="0" w:space="0" w:color="000000"/>
+              <w:left w:val="none" w:sz="0" w:space="0" w:color="000000"/>
+              <w:right w:val="none" w:sz="0" w:space="0" w:color="000000"/>
+            </w:tcBorders>
+            <w:shd w:val="clear" w:color="auto" w:fill="FFFFFF"/>
+            <w:tcMar>
+              <w:top w:w="0" w:type="dxa"/>
+              <w:bottom w:w="0" w:type="dxa"/>
+              <w:left w:w="0" w:type="dxa"/>
+              <w:right w:w="0" w:type="dxa"/>
+            </w:tcMar>
+            <w:vAlign w:val="top"/>
+          </w:tcPr>
+          <w:p>
+            <w:pPr>
+              <w:pStyle w:val="Normal"/>
+              <w:jc w:val="center"/>
+              <w:pBdr>
+                <w:bottom w:val="none" w:sz="0" w:space="0" w:color="000000"/>
+                <w:top w:val="none" w:sz="0" w:space="0" w:color="000000"/>
+                <w:left w:val="none" w:sz="0" w:space="0" w:color="000000"/>
+                <w:right w:val="none" w:sz="0" w:space="0" w:color="000000"/>
+              </w:pBdr>
+              <w:spacing w:after="100" w:before="100" w:line="240"/>
+              <w:ind w:left="100" w:right="100" w:firstLine="0" w:firstLineChars="0"/>
+              <w:rPr>
+                <w:rFonts w:ascii="Times New Roman" w:hAnsi="Times New Roman" w:eastAsia="Times New Roman" w:cs="Times New Roman"/>
+                <w:i w:val="false"/>
+                <w:b w:val="false"/>
+                <w:u w:val="none"/>
+                <w:strike w:val="false"/>
+                <w:sz w:val="18"/>
+                <w:szCs w:val="18"/>
+                <w:color w:val="000000"/>
+              </w:rPr>
+            </w:pPr>
+            <w:r>
+              <w:rPr>
+                <w:rFonts w:ascii="Times New Roman" w:hAnsi="Times New Roman" w:eastAsia="Times New Roman" w:cs="Times New Roman"/>
+                <w:i w:val="false"/>
+                <w:b w:val="false"/>
+                <w:u w:val="none"/>
+                <w:strike w:val="false"/>
+                <w:sz w:val="18"/>
+                <w:szCs w:val="18"/>
+                <w:color w:val="000000"/>
+              </w:rPr>
+              <w:t xml:space="preserve"/>
+            </w:r>
+          </w:p>
+        </w:tc>
       </w:tr>
       <w:tr>
         <w:trPr>
@@ -18867,6 +22444,61 @@
             </w:r>
           </w:p>
         </w:tc>
+        <w:tc>
+          <w:tcPr>
+            <w:tcBorders>
+              <w:bottom w:val="single" w:sz="8" w:space="0" w:color="000000"/>
+              <w:top w:val="none" w:sz="0" w:space="0" w:color="000000"/>
+              <w:left w:val="none" w:sz="0" w:space="0" w:color="000000"/>
+              <w:right w:val="none" w:sz="0" w:space="0" w:color="000000"/>
+            </w:tcBorders>
+            <w:shd w:val="clear" w:color="auto" w:fill="FFFFFF"/>
+            <w:tcMar>
+              <w:top w:w="0" w:type="dxa"/>
+              <w:bottom w:w="0" w:type="dxa"/>
+              <w:left w:w="0" w:type="dxa"/>
+              <w:right w:w="0" w:type="dxa"/>
+            </w:tcMar>
+            <w:vAlign w:val="top"/>
+          </w:tcPr>
+          <w:p>
+            <w:pPr>
+              <w:pStyle w:val="Normal"/>
+              <w:jc w:val="center"/>
+              <w:pBdr>
+                <w:bottom w:val="none" w:sz="0" w:space="0" w:color="000000"/>
+                <w:top w:val="none" w:sz="0" w:space="0" w:color="000000"/>
+                <w:left w:val="none" w:sz="0" w:space="0" w:color="000000"/>
+                <w:right w:val="none" w:sz="0" w:space="0" w:color="000000"/>
+              </w:pBdr>
+              <w:spacing w:after="100" w:before="100" w:line="240"/>
+              <w:ind w:left="100" w:right="100" w:firstLine="0" w:firstLineChars="0"/>
+              <w:rPr>
+                <w:rFonts w:ascii="Times New Roman" w:hAnsi="Times New Roman" w:eastAsia="Times New Roman" w:cs="Times New Roman"/>
+                <w:i w:val="false"/>
+                <w:b w:val="false"/>
+                <w:u w:val="none"/>
+                <w:strike w:val="false"/>
+                <w:sz w:val="18"/>
+                <w:szCs w:val="18"/>
+                <w:color w:val="000000"/>
+              </w:rPr>
+            </w:pPr>
+            <w:r>
+              <w:rPr>
+                <w:rFonts w:ascii="Times New Roman" w:hAnsi="Times New Roman" w:eastAsia="Times New Roman" w:cs="Times New Roman"/>
+                <w:i w:val="false"/>
+                <w:b w:val="false"/>
+                <w:u w:val="none"/>
+                <w:strike w:val="false"/>
+                <w:sz w:val="18"/>
+                <w:szCs w:val="18"/>
+                <w:color w:val="000000"/>
+              </w:rPr>
+              <w:t xml:space="preserve"/>
+            </w:r>
+          </w:p>
+        </w:tc>
       </w:tr>
       <w:tr>
         <w:trPr>
@@ -18874,7 +22506,7 @@
         </w:trPr>
         <w:tc>
           <w:tcPr>
-            <w:gridSpan w:val="5"/>
+            <w:gridSpan w:val="6"/>
             <w:tcBorders>
               <w:bottom w:val="none" w:sz="0" w:space="0" w:color="FFFFFF"/>
               <w:top w:val="single" w:sz="8" w:space="0" w:color="000000"/>
@@ -18949,7 +22581,7 @@
         </w:trPr>
         <w:tc>
           <w:tcPr>
-            <w:gridSpan w:val="5"/>
+            <w:gridSpan w:val="6"/>
             <w:tcBorders>
               <w:bottom w:val="none" w:sz="0" w:space="0" w:color="FFFFFF"/>
               <w:top w:val="none" w:sz="0" w:space="0" w:color="FFFFFF"/>

</xml_diff>

<commit_message>
family_history_colorectal_cancer added to table1
</commit_message>
<xml_diff>
--- a/output/tables/COAD/COAD_table1_APC.docx
+++ b/output/tables/COAD/COAD_table1_APC.docx
@@ -22167,6 +22167,2016 @@
       </w:tr>
       <w:tr>
         <w:trPr>
+          <w:trHeight w:val="560" w:hRule="auto"/>
+        </w:trPr>
+        <w:tc>
+          <w:tcPr>
+            <w:tcBorders>
+              <w:bottom w:val="none" w:sz="0" w:space="0" w:color="000000"/>
+              <w:top w:val="none" w:sz="0" w:space="0" w:color="000000"/>
+              <w:left w:val="none" w:sz="0" w:space="0" w:color="000000"/>
+              <w:right w:val="none" w:sz="0" w:space="0" w:color="000000"/>
+            </w:tcBorders>
+            <w:shd w:val="clear" w:color="auto" w:fill="FFFFFF"/>
+            <w:tcMar>
+              <w:top w:w="0" w:type="dxa"/>
+              <w:bottom w:w="0" w:type="dxa"/>
+              <w:left w:w="0" w:type="dxa"/>
+              <w:right w:w="0" w:type="dxa"/>
+            </w:tcMar>
+            <w:vAlign w:val="top"/>
+          </w:tcPr>
+          <w:p>
+            <w:pPr>
+              <w:pStyle w:val="Normal"/>
+              <w:jc w:val="left"/>
+              <w:pBdr>
+                <w:bottom w:val="none" w:sz="0" w:space="0" w:color="000000"/>
+                <w:top w:val="none" w:sz="0" w:space="0" w:color="000000"/>
+                <w:left w:val="none" w:sz="0" w:space="0" w:color="000000"/>
+                <w:right w:val="none" w:sz="0" w:space="0" w:color="000000"/>
+              </w:pBdr>
+              <w:spacing w:after="100" w:before="100" w:line="240"/>
+              <w:ind w:left="300" w:right="100" w:firstLine="0" w:firstLineChars="0"/>
+              <w:rPr>
+                <w:rFonts w:ascii="Times New Roman" w:hAnsi="Times New Roman" w:eastAsia="Times New Roman" w:cs="Times New Roman"/>
+                <w:i w:val="false"/>
+                <w:b w:val="false"/>
+                <w:u w:val="none"/>
+                <w:strike w:val="false"/>
+                <w:sz w:val="18"/>
+                <w:szCs w:val="18"/>
+                <w:color w:val="000000"/>
+              </w:rPr>
+            </w:pPr>
+            <w:r>
+              <w:rPr>
+                <w:rFonts w:ascii="Times New Roman" w:hAnsi="Times New Roman" w:eastAsia="Times New Roman" w:cs="Times New Roman"/>
+                <w:i w:val="false"/>
+                <w:b w:val="false"/>
+                <w:u w:val="none"/>
+                <w:strike w:val="false"/>
+                <w:sz w:val="18"/>
+                <w:szCs w:val="18"/>
+                <w:color w:val="000000"/>
+              </w:rPr>
+              <w:t xml:space="preserve">Missing</w:t>
+            </w:r>
+          </w:p>
+        </w:tc>
+        <w:tc>
+          <w:tcPr>
+            <w:tcBorders>
+              <w:bottom w:val="none" w:sz="0" w:space="0" w:color="000000"/>
+              <w:top w:val="none" w:sz="0" w:space="0" w:color="000000"/>
+              <w:left w:val="none" w:sz="0" w:space="0" w:color="000000"/>
+              <w:right w:val="none" w:sz="0" w:space="0" w:color="000000"/>
+            </w:tcBorders>
+            <w:shd w:val="clear" w:color="auto" w:fill="FFFFFF"/>
+            <w:tcMar>
+              <w:top w:w="0" w:type="dxa"/>
+              <w:bottom w:w="0" w:type="dxa"/>
+              <w:left w:w="0" w:type="dxa"/>
+              <w:right w:w="0" w:type="dxa"/>
+            </w:tcMar>
+            <w:vAlign w:val="top"/>
+          </w:tcPr>
+          <w:p>
+            <w:pPr>
+              <w:pStyle w:val="Normal"/>
+              <w:jc w:val="center"/>
+              <w:pBdr>
+                <w:bottom w:val="none" w:sz="0" w:space="0" w:color="000000"/>
+                <w:top w:val="none" w:sz="0" w:space="0" w:color="000000"/>
+                <w:left w:val="none" w:sz="0" w:space="0" w:color="000000"/>
+                <w:right w:val="none" w:sz="0" w:space="0" w:color="000000"/>
+              </w:pBdr>
+              <w:spacing w:after="100" w:before="100" w:line="240"/>
+              <w:ind w:left="100" w:right="100" w:firstLine="0" w:firstLineChars="0"/>
+              <w:rPr>
+                <w:rFonts w:ascii="Times New Roman" w:hAnsi="Times New Roman" w:eastAsia="Times New Roman" w:cs="Times New Roman"/>
+                <w:i w:val="false"/>
+                <w:b w:val="false"/>
+                <w:u w:val="none"/>
+                <w:strike w:val="false"/>
+                <w:sz w:val="18"/>
+                <w:szCs w:val="18"/>
+                <w:color w:val="000000"/>
+              </w:rPr>
+            </w:pPr>
+            <w:r>
+              <w:rPr>
+                <w:rFonts w:ascii="Times New Roman" w:hAnsi="Times New Roman" w:eastAsia="Times New Roman" w:cs="Times New Roman"/>
+                <w:i w:val="false"/>
+                <w:b w:val="false"/>
+                <w:u w:val="none"/>
+                <w:strike w:val="false"/>
+                <w:sz w:val="18"/>
+                <w:szCs w:val="18"/>
+                <w:color w:val="000000"/>
+              </w:rPr>
+              <w:t xml:space="preserve">45</w:t>
+            </w:r>
+          </w:p>
+        </w:tc>
+        <w:tc>
+          <w:tcPr>
+            <w:tcBorders>
+              <w:bottom w:val="none" w:sz="0" w:space="0" w:color="000000"/>
+              <w:top w:val="none" w:sz="0" w:space="0" w:color="000000"/>
+              <w:left w:val="none" w:sz="0" w:space="0" w:color="000000"/>
+              <w:right w:val="none" w:sz="0" w:space="0" w:color="000000"/>
+            </w:tcBorders>
+            <w:shd w:val="clear" w:color="auto" w:fill="FFFFFF"/>
+            <w:tcMar>
+              <w:top w:w="0" w:type="dxa"/>
+              <w:bottom w:w="0" w:type="dxa"/>
+              <w:left w:w="0" w:type="dxa"/>
+              <w:right w:w="0" w:type="dxa"/>
+            </w:tcMar>
+            <w:vAlign w:val="top"/>
+          </w:tcPr>
+          <w:p>
+            <w:pPr>
+              <w:pStyle w:val="Normal"/>
+              <w:jc w:val="center"/>
+              <w:pBdr>
+                <w:bottom w:val="none" w:sz="0" w:space="0" w:color="000000"/>
+                <w:top w:val="none" w:sz="0" w:space="0" w:color="000000"/>
+                <w:left w:val="none" w:sz="0" w:space="0" w:color="000000"/>
+                <w:right w:val="none" w:sz="0" w:space="0" w:color="000000"/>
+              </w:pBdr>
+              <w:spacing w:after="100" w:before="100" w:line="240"/>
+              <w:ind w:left="100" w:right="100" w:firstLine="0" w:firstLineChars="0"/>
+              <w:rPr>
+                <w:rFonts w:ascii="Times New Roman" w:hAnsi="Times New Roman" w:eastAsia="Times New Roman" w:cs="Times New Roman"/>
+                <w:i w:val="false"/>
+                <w:b w:val="false"/>
+                <w:u w:val="none"/>
+                <w:strike w:val="false"/>
+                <w:sz w:val="18"/>
+                <w:szCs w:val="18"/>
+                <w:color w:val="000000"/>
+              </w:rPr>
+            </w:pPr>
+            <w:r>
+              <w:rPr>
+                <w:rFonts w:ascii="Times New Roman" w:hAnsi="Times New Roman" w:eastAsia="Times New Roman" w:cs="Times New Roman"/>
+                <w:i w:val="false"/>
+                <w:b w:val="false"/>
+                <w:u w:val="none"/>
+                <w:strike w:val="false"/>
+                <w:sz w:val="18"/>
+                <w:szCs w:val="18"/>
+                <w:color w:val="000000"/>
+              </w:rPr>
+              <w:t xml:space="preserve">20</w:t>
+            </w:r>
+          </w:p>
+        </w:tc>
+        <w:tc>
+          <w:tcPr>
+            <w:tcBorders>
+              <w:bottom w:val="none" w:sz="0" w:space="0" w:color="000000"/>
+              <w:top w:val="none" w:sz="0" w:space="0" w:color="000000"/>
+              <w:left w:val="none" w:sz="0" w:space="0" w:color="000000"/>
+              <w:right w:val="none" w:sz="0" w:space="0" w:color="000000"/>
+            </w:tcBorders>
+            <w:shd w:val="clear" w:color="auto" w:fill="FFFFFF"/>
+            <w:tcMar>
+              <w:top w:w="0" w:type="dxa"/>
+              <w:bottom w:w="0" w:type="dxa"/>
+              <w:left w:w="0" w:type="dxa"/>
+              <w:right w:w="0" w:type="dxa"/>
+            </w:tcMar>
+            <w:vAlign w:val="top"/>
+          </w:tcPr>
+          <w:p>
+            <w:pPr>
+              <w:pStyle w:val="Normal"/>
+              <w:jc w:val="center"/>
+              <w:pBdr>
+                <w:bottom w:val="none" w:sz="0" w:space="0" w:color="000000"/>
+                <w:top w:val="none" w:sz="0" w:space="0" w:color="000000"/>
+                <w:left w:val="none" w:sz="0" w:space="0" w:color="000000"/>
+                <w:right w:val="none" w:sz="0" w:space="0" w:color="000000"/>
+              </w:pBdr>
+              <w:spacing w:after="100" w:before="100" w:line="240"/>
+              <w:ind w:left="100" w:right="100" w:firstLine="0" w:firstLineChars="0"/>
+              <w:rPr>
+                <w:rFonts w:ascii="Times New Roman" w:hAnsi="Times New Roman" w:eastAsia="Times New Roman" w:cs="Times New Roman"/>
+                <w:i w:val="false"/>
+                <w:b w:val="false"/>
+                <w:u w:val="none"/>
+                <w:strike w:val="false"/>
+                <w:sz w:val="18"/>
+                <w:szCs w:val="18"/>
+                <w:color w:val="000000"/>
+              </w:rPr>
+            </w:pPr>
+            <w:r>
+              <w:rPr>
+                <w:rFonts w:ascii="Times New Roman" w:hAnsi="Times New Roman" w:eastAsia="Times New Roman" w:cs="Times New Roman"/>
+                <w:i w:val="false"/>
+                <w:b w:val="false"/>
+                <w:u w:val="none"/>
+                <w:strike w:val="false"/>
+                <w:sz w:val="18"/>
+                <w:szCs w:val="18"/>
+                <w:color w:val="000000"/>
+              </w:rPr>
+              <w:t xml:space="preserve">25</w:t>
+            </w:r>
+          </w:p>
+        </w:tc>
+        <w:tc>
+          <w:tcPr>
+            <w:tcBorders>
+              <w:bottom w:val="none" w:sz="0" w:space="0" w:color="000000"/>
+              <w:top w:val="none" w:sz="0" w:space="0" w:color="000000"/>
+              <w:left w:val="none" w:sz="0" w:space="0" w:color="000000"/>
+              <w:right w:val="none" w:sz="0" w:space="0" w:color="000000"/>
+            </w:tcBorders>
+            <w:shd w:val="clear" w:color="auto" w:fill="FFFFFF"/>
+            <w:tcMar>
+              <w:top w:w="0" w:type="dxa"/>
+              <w:bottom w:w="0" w:type="dxa"/>
+              <w:left w:w="0" w:type="dxa"/>
+              <w:right w:w="0" w:type="dxa"/>
+            </w:tcMar>
+            <w:vAlign w:val="top"/>
+          </w:tcPr>
+          <w:p>
+            <w:pPr>
+              <w:pStyle w:val="Normal"/>
+              <w:jc w:val="center"/>
+              <w:pBdr>
+                <w:bottom w:val="none" w:sz="0" w:space="0" w:color="000000"/>
+                <w:top w:val="none" w:sz="0" w:space="0" w:color="000000"/>
+                <w:left w:val="none" w:sz="0" w:space="0" w:color="000000"/>
+                <w:right w:val="none" w:sz="0" w:space="0" w:color="000000"/>
+              </w:pBdr>
+              <w:spacing w:after="100" w:before="100" w:line="240"/>
+              <w:ind w:left="100" w:right="100" w:firstLine="0" w:firstLineChars="0"/>
+              <w:rPr>
+                <w:rFonts w:ascii="Times New Roman" w:hAnsi="Times New Roman" w:eastAsia="Times New Roman" w:cs="Times New Roman"/>
+                <w:i w:val="false"/>
+                <w:b w:val="false"/>
+                <w:u w:val="none"/>
+                <w:strike w:val="false"/>
+                <w:sz w:val="18"/>
+                <w:szCs w:val="18"/>
+                <w:color w:val="000000"/>
+              </w:rPr>
+            </w:pPr>
+            <w:r>
+              <w:rPr>
+                <w:rFonts w:ascii="Times New Roman" w:hAnsi="Times New Roman" w:eastAsia="Times New Roman" w:cs="Times New Roman"/>
+                <w:i w:val="false"/>
+                <w:b w:val="false"/>
+                <w:u w:val="none"/>
+                <w:strike w:val="false"/>
+                <w:sz w:val="18"/>
+                <w:szCs w:val="18"/>
+                <w:color w:val="000000"/>
+              </w:rPr>
+              <w:t xml:space="preserve"/>
+            </w:r>
+          </w:p>
+        </w:tc>
+        <w:tc>
+          <w:tcPr>
+            <w:tcBorders>
+              <w:bottom w:val="none" w:sz="0" w:space="0" w:color="000000"/>
+              <w:top w:val="none" w:sz="0" w:space="0" w:color="000000"/>
+              <w:left w:val="none" w:sz="0" w:space="0" w:color="000000"/>
+              <w:right w:val="none" w:sz="0" w:space="0" w:color="000000"/>
+            </w:tcBorders>
+            <w:shd w:val="clear" w:color="auto" w:fill="FFFFFF"/>
+            <w:tcMar>
+              <w:top w:w="0" w:type="dxa"/>
+              <w:bottom w:w="0" w:type="dxa"/>
+              <w:left w:w="0" w:type="dxa"/>
+              <w:right w:w="0" w:type="dxa"/>
+            </w:tcMar>
+            <w:vAlign w:val="top"/>
+          </w:tcPr>
+          <w:p>
+            <w:pPr>
+              <w:pStyle w:val="Normal"/>
+              <w:jc w:val="center"/>
+              <w:pBdr>
+                <w:bottom w:val="none" w:sz="0" w:space="0" w:color="000000"/>
+                <w:top w:val="none" w:sz="0" w:space="0" w:color="000000"/>
+                <w:left w:val="none" w:sz="0" w:space="0" w:color="000000"/>
+                <w:right w:val="none" w:sz="0" w:space="0" w:color="000000"/>
+              </w:pBdr>
+              <w:spacing w:after="100" w:before="100" w:line="240"/>
+              <w:ind w:left="100" w:right="100" w:firstLine="0" w:firstLineChars="0"/>
+              <w:rPr>
+                <w:rFonts w:ascii="Times New Roman" w:hAnsi="Times New Roman" w:eastAsia="Times New Roman" w:cs="Times New Roman"/>
+                <w:i w:val="false"/>
+                <w:b w:val="false"/>
+                <w:u w:val="none"/>
+                <w:strike w:val="false"/>
+                <w:sz w:val="18"/>
+                <w:szCs w:val="18"/>
+                <w:color w:val="000000"/>
+              </w:rPr>
+            </w:pPr>
+            <w:r>
+              <w:rPr>
+                <w:rFonts w:ascii="Times New Roman" w:hAnsi="Times New Roman" w:eastAsia="Times New Roman" w:cs="Times New Roman"/>
+                <w:i w:val="false"/>
+                <w:b w:val="false"/>
+                <w:u w:val="none"/>
+                <w:strike w:val="false"/>
+                <w:sz w:val="18"/>
+                <w:szCs w:val="18"/>
+                <w:color w:val="000000"/>
+              </w:rPr>
+              <w:t xml:space="preserve"/>
+            </w:r>
+          </w:p>
+        </w:tc>
+      </w:tr>
+      <w:tr>
+        <w:trPr>
+          <w:trHeight w:val="560" w:hRule="auto"/>
+        </w:trPr>
+        <w:tc>
+          <w:tcPr>
+            <w:tcBorders>
+              <w:bottom w:val="none" w:sz="0" w:space="0" w:color="000000"/>
+              <w:top w:val="none" w:sz="0" w:space="0" w:color="000000"/>
+              <w:left w:val="none" w:sz="0" w:space="0" w:color="000000"/>
+              <w:right w:val="none" w:sz="0" w:space="0" w:color="000000"/>
+            </w:tcBorders>
+            <w:shd w:val="clear" w:color="auto" w:fill="FFFFFF"/>
+            <w:tcMar>
+              <w:top w:w="0" w:type="dxa"/>
+              <w:bottom w:w="0" w:type="dxa"/>
+              <w:left w:w="0" w:type="dxa"/>
+              <w:right w:w="0" w:type="dxa"/>
+            </w:tcMar>
+            <w:vAlign w:val="top"/>
+          </w:tcPr>
+          <w:p>
+            <w:pPr>
+              <w:pStyle w:val="Normal"/>
+              <w:jc w:val="left"/>
+              <w:pBdr>
+                <w:bottom w:val="none" w:sz="0" w:space="0" w:color="000000"/>
+                <w:top w:val="none" w:sz="0" w:space="0" w:color="000000"/>
+                <w:left w:val="none" w:sz="0" w:space="0" w:color="000000"/>
+                <w:right w:val="none" w:sz="0" w:space="0" w:color="000000"/>
+              </w:pBdr>
+              <w:spacing w:after="100" w:before="100" w:line="240"/>
+              <w:ind w:left="100" w:right="100" w:firstLine="0" w:firstLineChars="0"/>
+              <w:rPr>
+                <w:rFonts w:ascii="Times New Roman" w:hAnsi="Times New Roman" w:eastAsia="Times New Roman" w:cs="Times New Roman"/>
+                <w:i w:val="false"/>
+                <w:b w:val="true"/>
+                <w:u w:val="none"/>
+                <w:strike w:val="false"/>
+                <w:sz w:val="18"/>
+                <w:szCs w:val="18"/>
+                <w:color w:val="000000"/>
+              </w:rPr>
+            </w:pPr>
+            <w:r>
+              <w:rPr>
+                <w:rFonts w:ascii="Times New Roman" w:hAnsi="Times New Roman" w:eastAsia="Times New Roman" w:cs="Times New Roman"/>
+                <w:i w:val="false"/>
+                <w:b w:val="true"/>
+                <w:u w:val="none"/>
+                <w:strike w:val="false"/>
+                <w:sz w:val="18"/>
+                <w:szCs w:val="18"/>
+                <w:color w:val="000000"/>
+              </w:rPr>
+              <w:t xml:space="preserve">family_history_colorectal_cancer</w:t>
+            </w:r>
+          </w:p>
+        </w:tc>
+        <w:tc>
+          <w:tcPr>
+            <w:tcBorders>
+              <w:bottom w:val="none" w:sz="0" w:space="0" w:color="000000"/>
+              <w:top w:val="none" w:sz="0" w:space="0" w:color="000000"/>
+              <w:left w:val="none" w:sz="0" w:space="0" w:color="000000"/>
+              <w:right w:val="none" w:sz="0" w:space="0" w:color="000000"/>
+            </w:tcBorders>
+            <w:shd w:val="clear" w:color="auto" w:fill="FFFFFF"/>
+            <w:tcMar>
+              <w:top w:w="0" w:type="dxa"/>
+              <w:bottom w:w="0" w:type="dxa"/>
+              <w:left w:w="0" w:type="dxa"/>
+              <w:right w:w="0" w:type="dxa"/>
+            </w:tcMar>
+            <w:vAlign w:val="top"/>
+          </w:tcPr>
+          <w:p>
+            <w:pPr>
+              <w:pStyle w:val="Normal"/>
+              <w:jc w:val="center"/>
+              <w:pBdr>
+                <w:bottom w:val="none" w:sz="0" w:space="0" w:color="000000"/>
+                <w:top w:val="none" w:sz="0" w:space="0" w:color="000000"/>
+                <w:left w:val="none" w:sz="0" w:space="0" w:color="000000"/>
+                <w:right w:val="none" w:sz="0" w:space="0" w:color="000000"/>
+              </w:pBdr>
+              <w:spacing w:after="100" w:before="100" w:line="240"/>
+              <w:ind w:left="100" w:right="100" w:firstLine="0" w:firstLineChars="0"/>
+              <w:rPr>
+                <w:rFonts w:ascii="Times New Roman" w:hAnsi="Times New Roman" w:eastAsia="Times New Roman" w:cs="Times New Roman"/>
+                <w:i w:val="false"/>
+                <w:b w:val="false"/>
+                <w:u w:val="none"/>
+                <w:strike w:val="false"/>
+                <w:sz w:val="18"/>
+                <w:szCs w:val="18"/>
+                <w:color w:val="000000"/>
+              </w:rPr>
+            </w:pPr>
+            <w:r>
+              <w:rPr>
+                <w:rFonts w:ascii="Times New Roman" w:hAnsi="Times New Roman" w:eastAsia="Times New Roman" w:cs="Times New Roman"/>
+                <w:i w:val="false"/>
+                <w:b w:val="false"/>
+                <w:u w:val="none"/>
+                <w:strike w:val="false"/>
+                <w:sz w:val="18"/>
+                <w:szCs w:val="18"/>
+                <w:color w:val="000000"/>
+              </w:rPr>
+              <w:t xml:space="preserve"/>
+            </w:r>
+          </w:p>
+        </w:tc>
+        <w:tc>
+          <w:tcPr>
+            <w:tcBorders>
+              <w:bottom w:val="none" w:sz="0" w:space="0" w:color="000000"/>
+              <w:top w:val="none" w:sz="0" w:space="0" w:color="000000"/>
+              <w:left w:val="none" w:sz="0" w:space="0" w:color="000000"/>
+              <w:right w:val="none" w:sz="0" w:space="0" w:color="000000"/>
+            </w:tcBorders>
+            <w:shd w:val="clear" w:color="auto" w:fill="FFFFFF"/>
+            <w:tcMar>
+              <w:top w:w="0" w:type="dxa"/>
+              <w:bottom w:w="0" w:type="dxa"/>
+              <w:left w:w="0" w:type="dxa"/>
+              <w:right w:w="0" w:type="dxa"/>
+            </w:tcMar>
+            <w:vAlign w:val="top"/>
+          </w:tcPr>
+          <w:p>
+            <w:pPr>
+              <w:pStyle w:val="Normal"/>
+              <w:jc w:val="center"/>
+              <w:pBdr>
+                <w:bottom w:val="none" w:sz="0" w:space="0" w:color="000000"/>
+                <w:top w:val="none" w:sz="0" w:space="0" w:color="000000"/>
+                <w:left w:val="none" w:sz="0" w:space="0" w:color="000000"/>
+                <w:right w:val="none" w:sz="0" w:space="0" w:color="000000"/>
+              </w:pBdr>
+              <w:spacing w:after="100" w:before="100" w:line="240"/>
+              <w:ind w:left="100" w:right="100" w:firstLine="0" w:firstLineChars="0"/>
+              <w:rPr>
+                <w:rFonts w:ascii="Times New Roman" w:hAnsi="Times New Roman" w:eastAsia="Times New Roman" w:cs="Times New Roman"/>
+                <w:i w:val="false"/>
+                <w:b w:val="false"/>
+                <w:u w:val="none"/>
+                <w:strike w:val="false"/>
+                <w:sz w:val="18"/>
+                <w:szCs w:val="18"/>
+                <w:color w:val="000000"/>
+              </w:rPr>
+            </w:pPr>
+            <w:r>
+              <w:rPr>
+                <w:rFonts w:ascii="Times New Roman" w:hAnsi="Times New Roman" w:eastAsia="Times New Roman" w:cs="Times New Roman"/>
+                <w:i w:val="false"/>
+                <w:b w:val="false"/>
+                <w:u w:val="none"/>
+                <w:strike w:val="false"/>
+                <w:sz w:val="18"/>
+                <w:szCs w:val="18"/>
+                <w:color w:val="000000"/>
+              </w:rPr>
+              <w:t xml:space="preserve"/>
+            </w:r>
+          </w:p>
+        </w:tc>
+        <w:tc>
+          <w:tcPr>
+            <w:tcBorders>
+              <w:bottom w:val="none" w:sz="0" w:space="0" w:color="000000"/>
+              <w:top w:val="none" w:sz="0" w:space="0" w:color="000000"/>
+              <w:left w:val="none" w:sz="0" w:space="0" w:color="000000"/>
+              <w:right w:val="none" w:sz="0" w:space="0" w:color="000000"/>
+            </w:tcBorders>
+            <w:shd w:val="clear" w:color="auto" w:fill="FFFFFF"/>
+            <w:tcMar>
+              <w:top w:w="0" w:type="dxa"/>
+              <w:bottom w:w="0" w:type="dxa"/>
+              <w:left w:w="0" w:type="dxa"/>
+              <w:right w:w="0" w:type="dxa"/>
+            </w:tcMar>
+            <w:vAlign w:val="top"/>
+          </w:tcPr>
+          <w:p>
+            <w:pPr>
+              <w:pStyle w:val="Normal"/>
+              <w:jc w:val="center"/>
+              <w:pBdr>
+                <w:bottom w:val="none" w:sz="0" w:space="0" w:color="000000"/>
+                <w:top w:val="none" w:sz="0" w:space="0" w:color="000000"/>
+                <w:left w:val="none" w:sz="0" w:space="0" w:color="000000"/>
+                <w:right w:val="none" w:sz="0" w:space="0" w:color="000000"/>
+              </w:pBdr>
+              <w:spacing w:after="100" w:before="100" w:line="240"/>
+              <w:ind w:left="100" w:right="100" w:firstLine="0" w:firstLineChars="0"/>
+              <w:rPr>
+                <w:rFonts w:ascii="Times New Roman" w:hAnsi="Times New Roman" w:eastAsia="Times New Roman" w:cs="Times New Roman"/>
+                <w:i w:val="false"/>
+                <w:b w:val="false"/>
+                <w:u w:val="none"/>
+                <w:strike w:val="false"/>
+                <w:sz w:val="18"/>
+                <w:szCs w:val="18"/>
+                <w:color w:val="000000"/>
+              </w:rPr>
+            </w:pPr>
+            <w:r>
+              <w:rPr>
+                <w:rFonts w:ascii="Times New Roman" w:hAnsi="Times New Roman" w:eastAsia="Times New Roman" w:cs="Times New Roman"/>
+                <w:i w:val="false"/>
+                <w:b w:val="false"/>
+                <w:u w:val="none"/>
+                <w:strike w:val="false"/>
+                <w:sz w:val="18"/>
+                <w:szCs w:val="18"/>
+                <w:color w:val="000000"/>
+              </w:rPr>
+              <w:t xml:space="preserve"/>
+            </w:r>
+          </w:p>
+        </w:tc>
+        <w:tc>
+          <w:tcPr>
+            <w:tcBorders>
+              <w:bottom w:val="none" w:sz="0" w:space="0" w:color="000000"/>
+              <w:top w:val="none" w:sz="0" w:space="0" w:color="000000"/>
+              <w:left w:val="none" w:sz="0" w:space="0" w:color="000000"/>
+              <w:right w:val="none" w:sz="0" w:space="0" w:color="000000"/>
+            </w:tcBorders>
+            <w:shd w:val="clear" w:color="auto" w:fill="FFFFFF"/>
+            <w:tcMar>
+              <w:top w:w="0" w:type="dxa"/>
+              <w:bottom w:w="0" w:type="dxa"/>
+              <w:left w:w="0" w:type="dxa"/>
+              <w:right w:w="0" w:type="dxa"/>
+            </w:tcMar>
+            <w:vAlign w:val="top"/>
+          </w:tcPr>
+          <w:p>
+            <w:pPr>
+              <w:pStyle w:val="Normal"/>
+              <w:jc w:val="center"/>
+              <w:pBdr>
+                <w:bottom w:val="none" w:sz="0" w:space="0" w:color="000000"/>
+                <w:top w:val="none" w:sz="0" w:space="0" w:color="000000"/>
+                <w:left w:val="none" w:sz="0" w:space="0" w:color="000000"/>
+                <w:right w:val="none" w:sz="0" w:space="0" w:color="000000"/>
+              </w:pBdr>
+              <w:spacing w:after="100" w:before="100" w:line="240"/>
+              <w:ind w:left="100" w:right="100" w:firstLine="0" w:firstLineChars="0"/>
+              <w:rPr>
+                <w:rFonts w:ascii="Times New Roman" w:hAnsi="Times New Roman" w:eastAsia="Times New Roman" w:cs="Times New Roman"/>
+                <w:i w:val="false"/>
+                <w:b w:val="false"/>
+                <w:u w:val="none"/>
+                <w:strike w:val="false"/>
+                <w:sz w:val="18"/>
+                <w:szCs w:val="18"/>
+                <w:color w:val="000000"/>
+              </w:rPr>
+            </w:pPr>
+            <w:r>
+              <w:rPr>
+                <w:rFonts w:ascii="Times New Roman" w:hAnsi="Times New Roman" w:eastAsia="Times New Roman" w:cs="Times New Roman"/>
+                <w:i w:val="false"/>
+                <w:b w:val="false"/>
+                <w:u w:val="none"/>
+                <w:strike w:val="false"/>
+                <w:sz w:val="18"/>
+                <w:szCs w:val="18"/>
+                <w:color w:val="000000"/>
+              </w:rPr>
+              <w:t xml:space="preserve">&gt;0.999</w:t>
+            </w:r>
+          </w:p>
+        </w:tc>
+        <w:tc>
+          <w:tcPr>
+            <w:tcBorders>
+              <w:bottom w:val="none" w:sz="0" w:space="0" w:color="000000"/>
+              <w:top w:val="none" w:sz="0" w:space="0" w:color="000000"/>
+              <w:left w:val="none" w:sz="0" w:space="0" w:color="000000"/>
+              <w:right w:val="none" w:sz="0" w:space="0" w:color="000000"/>
+            </w:tcBorders>
+            <w:shd w:val="clear" w:color="auto" w:fill="FFFFFF"/>
+            <w:tcMar>
+              <w:top w:w="0" w:type="dxa"/>
+              <w:bottom w:w="0" w:type="dxa"/>
+              <w:left w:w="0" w:type="dxa"/>
+              <w:right w:w="0" w:type="dxa"/>
+            </w:tcMar>
+            <w:vAlign w:val="top"/>
+          </w:tcPr>
+          <w:p>
+            <w:pPr>
+              <w:pStyle w:val="Normal"/>
+              <w:jc w:val="center"/>
+              <w:pBdr>
+                <w:bottom w:val="none" w:sz="0" w:space="0" w:color="000000"/>
+                <w:top w:val="none" w:sz="0" w:space="0" w:color="000000"/>
+                <w:left w:val="none" w:sz="0" w:space="0" w:color="000000"/>
+                <w:right w:val="none" w:sz="0" w:space="0" w:color="000000"/>
+              </w:pBdr>
+              <w:spacing w:after="100" w:before="100" w:line="240"/>
+              <w:ind w:left="100" w:right="100" w:firstLine="0" w:firstLineChars="0"/>
+              <w:rPr>
+                <w:rFonts w:ascii="Times New Roman" w:hAnsi="Times New Roman" w:eastAsia="Times New Roman" w:cs="Times New Roman"/>
+                <w:i w:val="false"/>
+                <w:b w:val="false"/>
+                <w:u w:val="none"/>
+                <w:strike w:val="false"/>
+                <w:sz w:val="18"/>
+                <w:szCs w:val="18"/>
+                <w:color w:val="000000"/>
+              </w:rPr>
+            </w:pPr>
+            <w:r>
+              <w:rPr>
+                <w:rFonts w:ascii="Times New Roman" w:hAnsi="Times New Roman" w:eastAsia="Times New Roman" w:cs="Times New Roman"/>
+                <w:i w:val="false"/>
+                <w:b w:val="false"/>
+                <w:u w:val="none"/>
+                <w:strike w:val="false"/>
+                <w:sz w:val="18"/>
+                <w:szCs w:val="18"/>
+                <w:color w:val="000000"/>
+              </w:rPr>
+              <w:t xml:space="preserve">&gt;0.999</w:t>
+            </w:r>
+          </w:p>
+        </w:tc>
+      </w:tr>
+      <w:tr>
+        <w:trPr>
+          <w:trHeight w:val="560" w:hRule="auto"/>
+        </w:trPr>
+        <w:tc>
+          <w:tcPr>
+            <w:tcBorders>
+              <w:bottom w:val="none" w:sz="0" w:space="0" w:color="000000"/>
+              <w:top w:val="none" w:sz="0" w:space="0" w:color="000000"/>
+              <w:left w:val="none" w:sz="0" w:space="0" w:color="000000"/>
+              <w:right w:val="none" w:sz="0" w:space="0" w:color="000000"/>
+            </w:tcBorders>
+            <w:shd w:val="clear" w:color="auto" w:fill="FFFFFF"/>
+            <w:tcMar>
+              <w:top w:w="0" w:type="dxa"/>
+              <w:bottom w:w="0" w:type="dxa"/>
+              <w:left w:w="0" w:type="dxa"/>
+              <w:right w:w="0" w:type="dxa"/>
+            </w:tcMar>
+            <w:vAlign w:val="top"/>
+          </w:tcPr>
+          <w:p>
+            <w:pPr>
+              <w:pStyle w:val="Normal"/>
+              <w:jc w:val="left"/>
+              <w:pBdr>
+                <w:bottom w:val="none" w:sz="0" w:space="0" w:color="000000"/>
+                <w:top w:val="none" w:sz="0" w:space="0" w:color="000000"/>
+                <w:left w:val="none" w:sz="0" w:space="0" w:color="000000"/>
+                <w:right w:val="none" w:sz="0" w:space="0" w:color="000000"/>
+              </w:pBdr>
+              <w:spacing w:after="100" w:before="100" w:line="240"/>
+              <w:ind w:left="300" w:right="100" w:firstLine="0" w:firstLineChars="0"/>
+              <w:rPr>
+                <w:rFonts w:ascii="Times New Roman" w:hAnsi="Times New Roman" w:eastAsia="Times New Roman" w:cs="Times New Roman"/>
+                <w:i w:val="false"/>
+                <w:b w:val="false"/>
+                <w:u w:val="none"/>
+                <w:strike w:val="false"/>
+                <w:sz w:val="18"/>
+                <w:szCs w:val="18"/>
+                <w:color w:val="000000"/>
+              </w:rPr>
+            </w:pPr>
+            <w:r>
+              <w:rPr>
+                <w:rFonts w:ascii="Times New Roman" w:hAnsi="Times New Roman" w:eastAsia="Times New Roman" w:cs="Times New Roman"/>
+                <w:i w:val="false"/>
+                <w:b w:val="false"/>
+                <w:u w:val="none"/>
+                <w:strike w:val="false"/>
+                <w:sz w:val="18"/>
+                <w:szCs w:val="18"/>
+                <w:color w:val="000000"/>
+              </w:rPr>
+              <w:t xml:space="preserve">0</w:t>
+            </w:r>
+          </w:p>
+        </w:tc>
+        <w:tc>
+          <w:tcPr>
+            <w:tcBorders>
+              <w:bottom w:val="none" w:sz="0" w:space="0" w:color="000000"/>
+              <w:top w:val="none" w:sz="0" w:space="0" w:color="000000"/>
+              <w:left w:val="none" w:sz="0" w:space="0" w:color="000000"/>
+              <w:right w:val="none" w:sz="0" w:space="0" w:color="000000"/>
+            </w:tcBorders>
+            <w:shd w:val="clear" w:color="auto" w:fill="FFFFFF"/>
+            <w:tcMar>
+              <w:top w:w="0" w:type="dxa"/>
+              <w:bottom w:w="0" w:type="dxa"/>
+              <w:left w:w="0" w:type="dxa"/>
+              <w:right w:w="0" w:type="dxa"/>
+            </w:tcMar>
+            <w:vAlign w:val="top"/>
+          </w:tcPr>
+          <w:p>
+            <w:pPr>
+              <w:pStyle w:val="Normal"/>
+              <w:jc w:val="center"/>
+              <w:pBdr>
+                <w:bottom w:val="none" w:sz="0" w:space="0" w:color="000000"/>
+                <w:top w:val="none" w:sz="0" w:space="0" w:color="000000"/>
+                <w:left w:val="none" w:sz="0" w:space="0" w:color="000000"/>
+                <w:right w:val="none" w:sz="0" w:space="0" w:color="000000"/>
+              </w:pBdr>
+              <w:spacing w:after="100" w:before="100" w:line="240"/>
+              <w:ind w:left="100" w:right="100" w:firstLine="0" w:firstLineChars="0"/>
+              <w:rPr>
+                <w:rFonts w:ascii="Times New Roman" w:hAnsi="Times New Roman" w:eastAsia="Times New Roman" w:cs="Times New Roman"/>
+                <w:i w:val="false"/>
+                <w:b w:val="false"/>
+                <w:u w:val="none"/>
+                <w:strike w:val="false"/>
+                <w:sz w:val="18"/>
+                <w:szCs w:val="18"/>
+                <w:color w:val="000000"/>
+              </w:rPr>
+            </w:pPr>
+            <w:r>
+              <w:rPr>
+                <w:rFonts w:ascii="Times New Roman" w:hAnsi="Times New Roman" w:eastAsia="Times New Roman" w:cs="Times New Roman"/>
+                <w:i w:val="false"/>
+                <w:b w:val="false"/>
+                <w:u w:val="none"/>
+                <w:strike w:val="false"/>
+                <w:sz w:val="18"/>
+                <w:szCs w:val="18"/>
+                <w:color w:val="000000"/>
+              </w:rPr>
+              <w:t xml:space="preserve">317 (84.5%)</w:t>
+            </w:r>
+          </w:p>
+        </w:tc>
+        <w:tc>
+          <w:tcPr>
+            <w:tcBorders>
+              <w:bottom w:val="none" w:sz="0" w:space="0" w:color="000000"/>
+              <w:top w:val="none" w:sz="0" w:space="0" w:color="000000"/>
+              <w:left w:val="none" w:sz="0" w:space="0" w:color="000000"/>
+              <w:right w:val="none" w:sz="0" w:space="0" w:color="000000"/>
+            </w:tcBorders>
+            <w:shd w:val="clear" w:color="auto" w:fill="FFFFFF"/>
+            <w:tcMar>
+              <w:top w:w="0" w:type="dxa"/>
+              <w:bottom w:w="0" w:type="dxa"/>
+              <w:left w:w="0" w:type="dxa"/>
+              <w:right w:w="0" w:type="dxa"/>
+            </w:tcMar>
+            <w:vAlign w:val="top"/>
+          </w:tcPr>
+          <w:p>
+            <w:pPr>
+              <w:pStyle w:val="Normal"/>
+              <w:jc w:val="center"/>
+              <w:pBdr>
+                <w:bottom w:val="none" w:sz="0" w:space="0" w:color="000000"/>
+                <w:top w:val="none" w:sz="0" w:space="0" w:color="000000"/>
+                <w:left w:val="none" w:sz="0" w:space="0" w:color="000000"/>
+                <w:right w:val="none" w:sz="0" w:space="0" w:color="000000"/>
+              </w:pBdr>
+              <w:spacing w:after="100" w:before="100" w:line="240"/>
+              <w:ind w:left="100" w:right="100" w:firstLine="0" w:firstLineChars="0"/>
+              <w:rPr>
+                <w:rFonts w:ascii="Times New Roman" w:hAnsi="Times New Roman" w:eastAsia="Times New Roman" w:cs="Times New Roman"/>
+                <w:i w:val="false"/>
+                <w:b w:val="false"/>
+                <w:u w:val="none"/>
+                <w:strike w:val="false"/>
+                <w:sz w:val="18"/>
+                <w:szCs w:val="18"/>
+                <w:color w:val="000000"/>
+              </w:rPr>
+            </w:pPr>
+            <w:r>
+              <w:rPr>
+                <w:rFonts w:ascii="Times New Roman" w:hAnsi="Times New Roman" w:eastAsia="Times New Roman" w:cs="Times New Roman"/>
+                <w:i w:val="false"/>
+                <w:b w:val="false"/>
+                <w:u w:val="none"/>
+                <w:strike w:val="false"/>
+                <w:sz w:val="18"/>
+                <w:szCs w:val="18"/>
+                <w:color w:val="000000"/>
+              </w:rPr>
+              <w:t xml:space="preserve">165 (84.2%)</w:t>
+            </w:r>
+          </w:p>
+        </w:tc>
+        <w:tc>
+          <w:tcPr>
+            <w:tcBorders>
+              <w:bottom w:val="none" w:sz="0" w:space="0" w:color="000000"/>
+              <w:top w:val="none" w:sz="0" w:space="0" w:color="000000"/>
+              <w:left w:val="none" w:sz="0" w:space="0" w:color="000000"/>
+              <w:right w:val="none" w:sz="0" w:space="0" w:color="000000"/>
+            </w:tcBorders>
+            <w:shd w:val="clear" w:color="auto" w:fill="FFFFFF"/>
+            <w:tcMar>
+              <w:top w:w="0" w:type="dxa"/>
+              <w:bottom w:w="0" w:type="dxa"/>
+              <w:left w:w="0" w:type="dxa"/>
+              <w:right w:w="0" w:type="dxa"/>
+            </w:tcMar>
+            <w:vAlign w:val="top"/>
+          </w:tcPr>
+          <w:p>
+            <w:pPr>
+              <w:pStyle w:val="Normal"/>
+              <w:jc w:val="center"/>
+              <w:pBdr>
+                <w:bottom w:val="none" w:sz="0" w:space="0" w:color="000000"/>
+                <w:top w:val="none" w:sz="0" w:space="0" w:color="000000"/>
+                <w:left w:val="none" w:sz="0" w:space="0" w:color="000000"/>
+                <w:right w:val="none" w:sz="0" w:space="0" w:color="000000"/>
+              </w:pBdr>
+              <w:spacing w:after="100" w:before="100" w:line="240"/>
+              <w:ind w:left="100" w:right="100" w:firstLine="0" w:firstLineChars="0"/>
+              <w:rPr>
+                <w:rFonts w:ascii="Times New Roman" w:hAnsi="Times New Roman" w:eastAsia="Times New Roman" w:cs="Times New Roman"/>
+                <w:i w:val="false"/>
+                <w:b w:val="false"/>
+                <w:u w:val="none"/>
+                <w:strike w:val="false"/>
+                <w:sz w:val="18"/>
+                <w:szCs w:val="18"/>
+                <w:color w:val="000000"/>
+              </w:rPr>
+            </w:pPr>
+            <w:r>
+              <w:rPr>
+                <w:rFonts w:ascii="Times New Roman" w:hAnsi="Times New Roman" w:eastAsia="Times New Roman" w:cs="Times New Roman"/>
+                <w:i w:val="false"/>
+                <w:b w:val="false"/>
+                <w:u w:val="none"/>
+                <w:strike w:val="false"/>
+                <w:sz w:val="18"/>
+                <w:szCs w:val="18"/>
+                <w:color w:val="000000"/>
+              </w:rPr>
+              <w:t xml:space="preserve">152 (84.9%)</w:t>
+            </w:r>
+          </w:p>
+        </w:tc>
+        <w:tc>
+          <w:tcPr>
+            <w:tcBorders>
+              <w:bottom w:val="none" w:sz="0" w:space="0" w:color="000000"/>
+              <w:top w:val="none" w:sz="0" w:space="0" w:color="000000"/>
+              <w:left w:val="none" w:sz="0" w:space="0" w:color="000000"/>
+              <w:right w:val="none" w:sz="0" w:space="0" w:color="000000"/>
+            </w:tcBorders>
+            <w:shd w:val="clear" w:color="auto" w:fill="FFFFFF"/>
+            <w:tcMar>
+              <w:top w:w="0" w:type="dxa"/>
+              <w:bottom w:w="0" w:type="dxa"/>
+              <w:left w:w="0" w:type="dxa"/>
+              <w:right w:w="0" w:type="dxa"/>
+            </w:tcMar>
+            <w:vAlign w:val="top"/>
+          </w:tcPr>
+          <w:p>
+            <w:pPr>
+              <w:pStyle w:val="Normal"/>
+              <w:jc w:val="center"/>
+              <w:pBdr>
+                <w:bottom w:val="none" w:sz="0" w:space="0" w:color="000000"/>
+                <w:top w:val="none" w:sz="0" w:space="0" w:color="000000"/>
+                <w:left w:val="none" w:sz="0" w:space="0" w:color="000000"/>
+                <w:right w:val="none" w:sz="0" w:space="0" w:color="000000"/>
+              </w:pBdr>
+              <w:spacing w:after="100" w:before="100" w:line="240"/>
+              <w:ind w:left="100" w:right="100" w:firstLine="0" w:firstLineChars="0"/>
+              <w:rPr>
+                <w:rFonts w:ascii="Times New Roman" w:hAnsi="Times New Roman" w:eastAsia="Times New Roman" w:cs="Times New Roman"/>
+                <w:i w:val="false"/>
+                <w:b w:val="false"/>
+                <w:u w:val="none"/>
+                <w:strike w:val="false"/>
+                <w:sz w:val="18"/>
+                <w:szCs w:val="18"/>
+                <w:color w:val="000000"/>
+              </w:rPr>
+            </w:pPr>
+            <w:r>
+              <w:rPr>
+                <w:rFonts w:ascii="Times New Roman" w:hAnsi="Times New Roman" w:eastAsia="Times New Roman" w:cs="Times New Roman"/>
+                <w:i w:val="false"/>
+                <w:b w:val="false"/>
+                <w:u w:val="none"/>
+                <w:strike w:val="false"/>
+                <w:sz w:val="18"/>
+                <w:szCs w:val="18"/>
+                <w:color w:val="000000"/>
+              </w:rPr>
+              <w:t xml:space="preserve"/>
+            </w:r>
+          </w:p>
+        </w:tc>
+        <w:tc>
+          <w:tcPr>
+            <w:tcBorders>
+              <w:bottom w:val="none" w:sz="0" w:space="0" w:color="000000"/>
+              <w:top w:val="none" w:sz="0" w:space="0" w:color="000000"/>
+              <w:left w:val="none" w:sz="0" w:space="0" w:color="000000"/>
+              <w:right w:val="none" w:sz="0" w:space="0" w:color="000000"/>
+            </w:tcBorders>
+            <w:shd w:val="clear" w:color="auto" w:fill="FFFFFF"/>
+            <w:tcMar>
+              <w:top w:w="0" w:type="dxa"/>
+              <w:bottom w:w="0" w:type="dxa"/>
+              <w:left w:w="0" w:type="dxa"/>
+              <w:right w:w="0" w:type="dxa"/>
+            </w:tcMar>
+            <w:vAlign w:val="top"/>
+          </w:tcPr>
+          <w:p>
+            <w:pPr>
+              <w:pStyle w:val="Normal"/>
+              <w:jc w:val="center"/>
+              <w:pBdr>
+                <w:bottom w:val="none" w:sz="0" w:space="0" w:color="000000"/>
+                <w:top w:val="none" w:sz="0" w:space="0" w:color="000000"/>
+                <w:left w:val="none" w:sz="0" w:space="0" w:color="000000"/>
+                <w:right w:val="none" w:sz="0" w:space="0" w:color="000000"/>
+              </w:pBdr>
+              <w:spacing w:after="100" w:before="100" w:line="240"/>
+              <w:ind w:left="100" w:right="100" w:firstLine="0" w:firstLineChars="0"/>
+              <w:rPr>
+                <w:rFonts w:ascii="Times New Roman" w:hAnsi="Times New Roman" w:eastAsia="Times New Roman" w:cs="Times New Roman"/>
+                <w:i w:val="false"/>
+                <w:b w:val="false"/>
+                <w:u w:val="none"/>
+                <w:strike w:val="false"/>
+                <w:sz w:val="18"/>
+                <w:szCs w:val="18"/>
+                <w:color w:val="000000"/>
+              </w:rPr>
+            </w:pPr>
+            <w:r>
+              <w:rPr>
+                <w:rFonts w:ascii="Times New Roman" w:hAnsi="Times New Roman" w:eastAsia="Times New Roman" w:cs="Times New Roman"/>
+                <w:i w:val="false"/>
+                <w:b w:val="false"/>
+                <w:u w:val="none"/>
+                <w:strike w:val="false"/>
+                <w:sz w:val="18"/>
+                <w:szCs w:val="18"/>
+                <w:color w:val="000000"/>
+              </w:rPr>
+              <w:t xml:space="preserve"/>
+            </w:r>
+          </w:p>
+        </w:tc>
+      </w:tr>
+      <w:tr>
+        <w:trPr>
+          <w:trHeight w:val="560" w:hRule="auto"/>
+        </w:trPr>
+        <w:tc>
+          <w:tcPr>
+            <w:tcBorders>
+              <w:bottom w:val="none" w:sz="0" w:space="0" w:color="000000"/>
+              <w:top w:val="none" w:sz="0" w:space="0" w:color="000000"/>
+              <w:left w:val="none" w:sz="0" w:space="0" w:color="000000"/>
+              <w:right w:val="none" w:sz="0" w:space="0" w:color="000000"/>
+            </w:tcBorders>
+            <w:shd w:val="clear" w:color="auto" w:fill="FFFFFF"/>
+            <w:tcMar>
+              <w:top w:w="0" w:type="dxa"/>
+              <w:bottom w:w="0" w:type="dxa"/>
+              <w:left w:w="0" w:type="dxa"/>
+              <w:right w:w="0" w:type="dxa"/>
+            </w:tcMar>
+            <w:vAlign w:val="top"/>
+          </w:tcPr>
+          <w:p>
+            <w:pPr>
+              <w:pStyle w:val="Normal"/>
+              <w:jc w:val="left"/>
+              <w:pBdr>
+                <w:bottom w:val="none" w:sz="0" w:space="0" w:color="000000"/>
+                <w:top w:val="none" w:sz="0" w:space="0" w:color="000000"/>
+                <w:left w:val="none" w:sz="0" w:space="0" w:color="000000"/>
+                <w:right w:val="none" w:sz="0" w:space="0" w:color="000000"/>
+              </w:pBdr>
+              <w:spacing w:after="100" w:before="100" w:line="240"/>
+              <w:ind w:left="300" w:right="100" w:firstLine="0" w:firstLineChars="0"/>
+              <w:rPr>
+                <w:rFonts w:ascii="Times New Roman" w:hAnsi="Times New Roman" w:eastAsia="Times New Roman" w:cs="Times New Roman"/>
+                <w:i w:val="false"/>
+                <w:b w:val="false"/>
+                <w:u w:val="none"/>
+                <w:strike w:val="false"/>
+                <w:sz w:val="18"/>
+                <w:szCs w:val="18"/>
+                <w:color w:val="000000"/>
+              </w:rPr>
+            </w:pPr>
+            <w:r>
+              <w:rPr>
+                <w:rFonts w:ascii="Times New Roman" w:hAnsi="Times New Roman" w:eastAsia="Times New Roman" w:cs="Times New Roman"/>
+                <w:i w:val="false"/>
+                <w:b w:val="false"/>
+                <w:u w:val="none"/>
+                <w:strike w:val="false"/>
+                <w:sz w:val="18"/>
+                <w:szCs w:val="18"/>
+                <w:color w:val="000000"/>
+              </w:rPr>
+              <w:t xml:space="preserve">1</w:t>
+            </w:r>
+          </w:p>
+        </w:tc>
+        <w:tc>
+          <w:tcPr>
+            <w:tcBorders>
+              <w:bottom w:val="none" w:sz="0" w:space="0" w:color="000000"/>
+              <w:top w:val="none" w:sz="0" w:space="0" w:color="000000"/>
+              <w:left w:val="none" w:sz="0" w:space="0" w:color="000000"/>
+              <w:right w:val="none" w:sz="0" w:space="0" w:color="000000"/>
+            </w:tcBorders>
+            <w:shd w:val="clear" w:color="auto" w:fill="FFFFFF"/>
+            <w:tcMar>
+              <w:top w:w="0" w:type="dxa"/>
+              <w:bottom w:w="0" w:type="dxa"/>
+              <w:left w:w="0" w:type="dxa"/>
+              <w:right w:w="0" w:type="dxa"/>
+            </w:tcMar>
+            <w:vAlign w:val="top"/>
+          </w:tcPr>
+          <w:p>
+            <w:pPr>
+              <w:pStyle w:val="Normal"/>
+              <w:jc w:val="center"/>
+              <w:pBdr>
+                <w:bottom w:val="none" w:sz="0" w:space="0" w:color="000000"/>
+                <w:top w:val="none" w:sz="0" w:space="0" w:color="000000"/>
+                <w:left w:val="none" w:sz="0" w:space="0" w:color="000000"/>
+                <w:right w:val="none" w:sz="0" w:space="0" w:color="000000"/>
+              </w:pBdr>
+              <w:spacing w:after="100" w:before="100" w:line="240"/>
+              <w:ind w:left="100" w:right="100" w:firstLine="0" w:firstLineChars="0"/>
+              <w:rPr>
+                <w:rFonts w:ascii="Times New Roman" w:hAnsi="Times New Roman" w:eastAsia="Times New Roman" w:cs="Times New Roman"/>
+                <w:i w:val="false"/>
+                <w:b w:val="false"/>
+                <w:u w:val="none"/>
+                <w:strike w:val="false"/>
+                <w:sz w:val="18"/>
+                <w:szCs w:val="18"/>
+                <w:color w:val="000000"/>
+              </w:rPr>
+            </w:pPr>
+            <w:r>
+              <w:rPr>
+                <w:rFonts w:ascii="Times New Roman" w:hAnsi="Times New Roman" w:eastAsia="Times New Roman" w:cs="Times New Roman"/>
+                <w:i w:val="false"/>
+                <w:b w:val="false"/>
+                <w:u w:val="none"/>
+                <w:strike w:val="false"/>
+                <w:sz w:val="18"/>
+                <w:szCs w:val="18"/>
+                <w:color w:val="000000"/>
+              </w:rPr>
+              <w:t xml:space="preserve">47 (12.5%)</w:t>
+            </w:r>
+          </w:p>
+        </w:tc>
+        <w:tc>
+          <w:tcPr>
+            <w:tcBorders>
+              <w:bottom w:val="none" w:sz="0" w:space="0" w:color="000000"/>
+              <w:top w:val="none" w:sz="0" w:space="0" w:color="000000"/>
+              <w:left w:val="none" w:sz="0" w:space="0" w:color="000000"/>
+              <w:right w:val="none" w:sz="0" w:space="0" w:color="000000"/>
+            </w:tcBorders>
+            <w:shd w:val="clear" w:color="auto" w:fill="FFFFFF"/>
+            <w:tcMar>
+              <w:top w:w="0" w:type="dxa"/>
+              <w:bottom w:w="0" w:type="dxa"/>
+              <w:left w:w="0" w:type="dxa"/>
+              <w:right w:w="0" w:type="dxa"/>
+            </w:tcMar>
+            <w:vAlign w:val="top"/>
+          </w:tcPr>
+          <w:p>
+            <w:pPr>
+              <w:pStyle w:val="Normal"/>
+              <w:jc w:val="center"/>
+              <w:pBdr>
+                <w:bottom w:val="none" w:sz="0" w:space="0" w:color="000000"/>
+                <w:top w:val="none" w:sz="0" w:space="0" w:color="000000"/>
+                <w:left w:val="none" w:sz="0" w:space="0" w:color="000000"/>
+                <w:right w:val="none" w:sz="0" w:space="0" w:color="000000"/>
+              </w:pBdr>
+              <w:spacing w:after="100" w:before="100" w:line="240"/>
+              <w:ind w:left="100" w:right="100" w:firstLine="0" w:firstLineChars="0"/>
+              <w:rPr>
+                <w:rFonts w:ascii="Times New Roman" w:hAnsi="Times New Roman" w:eastAsia="Times New Roman" w:cs="Times New Roman"/>
+                <w:i w:val="false"/>
+                <w:b w:val="false"/>
+                <w:u w:val="none"/>
+                <w:strike w:val="false"/>
+                <w:sz w:val="18"/>
+                <w:szCs w:val="18"/>
+                <w:color w:val="000000"/>
+              </w:rPr>
+            </w:pPr>
+            <w:r>
+              <w:rPr>
+                <w:rFonts w:ascii="Times New Roman" w:hAnsi="Times New Roman" w:eastAsia="Times New Roman" w:cs="Times New Roman"/>
+                <w:i w:val="false"/>
+                <w:b w:val="false"/>
+                <w:u w:val="none"/>
+                <w:strike w:val="false"/>
+                <w:sz w:val="18"/>
+                <w:szCs w:val="18"/>
+                <w:color w:val="000000"/>
+              </w:rPr>
+              <w:t xml:space="preserve">25 (12.8%)</w:t>
+            </w:r>
+          </w:p>
+        </w:tc>
+        <w:tc>
+          <w:tcPr>
+            <w:tcBorders>
+              <w:bottom w:val="none" w:sz="0" w:space="0" w:color="000000"/>
+              <w:top w:val="none" w:sz="0" w:space="0" w:color="000000"/>
+              <w:left w:val="none" w:sz="0" w:space="0" w:color="000000"/>
+              <w:right w:val="none" w:sz="0" w:space="0" w:color="000000"/>
+            </w:tcBorders>
+            <w:shd w:val="clear" w:color="auto" w:fill="FFFFFF"/>
+            <w:tcMar>
+              <w:top w:w="0" w:type="dxa"/>
+              <w:bottom w:w="0" w:type="dxa"/>
+              <w:left w:w="0" w:type="dxa"/>
+              <w:right w:w="0" w:type="dxa"/>
+            </w:tcMar>
+            <w:vAlign w:val="top"/>
+          </w:tcPr>
+          <w:p>
+            <w:pPr>
+              <w:pStyle w:val="Normal"/>
+              <w:jc w:val="center"/>
+              <w:pBdr>
+                <w:bottom w:val="none" w:sz="0" w:space="0" w:color="000000"/>
+                <w:top w:val="none" w:sz="0" w:space="0" w:color="000000"/>
+                <w:left w:val="none" w:sz="0" w:space="0" w:color="000000"/>
+                <w:right w:val="none" w:sz="0" w:space="0" w:color="000000"/>
+              </w:pBdr>
+              <w:spacing w:after="100" w:before="100" w:line="240"/>
+              <w:ind w:left="100" w:right="100" w:firstLine="0" w:firstLineChars="0"/>
+              <w:rPr>
+                <w:rFonts w:ascii="Times New Roman" w:hAnsi="Times New Roman" w:eastAsia="Times New Roman" w:cs="Times New Roman"/>
+                <w:i w:val="false"/>
+                <w:b w:val="false"/>
+                <w:u w:val="none"/>
+                <w:strike w:val="false"/>
+                <w:sz w:val="18"/>
+                <w:szCs w:val="18"/>
+                <w:color w:val="000000"/>
+              </w:rPr>
+            </w:pPr>
+            <w:r>
+              <w:rPr>
+                <w:rFonts w:ascii="Times New Roman" w:hAnsi="Times New Roman" w:eastAsia="Times New Roman" w:cs="Times New Roman"/>
+                <w:i w:val="false"/>
+                <w:b w:val="false"/>
+                <w:u w:val="none"/>
+                <w:strike w:val="false"/>
+                <w:sz w:val="18"/>
+                <w:szCs w:val="18"/>
+                <w:color w:val="000000"/>
+              </w:rPr>
+              <w:t xml:space="preserve">22 (12.3%)</w:t>
+            </w:r>
+          </w:p>
+        </w:tc>
+        <w:tc>
+          <w:tcPr>
+            <w:tcBorders>
+              <w:bottom w:val="none" w:sz="0" w:space="0" w:color="000000"/>
+              <w:top w:val="none" w:sz="0" w:space="0" w:color="000000"/>
+              <w:left w:val="none" w:sz="0" w:space="0" w:color="000000"/>
+              <w:right w:val="none" w:sz="0" w:space="0" w:color="000000"/>
+            </w:tcBorders>
+            <w:shd w:val="clear" w:color="auto" w:fill="FFFFFF"/>
+            <w:tcMar>
+              <w:top w:w="0" w:type="dxa"/>
+              <w:bottom w:w="0" w:type="dxa"/>
+              <w:left w:w="0" w:type="dxa"/>
+              <w:right w:w="0" w:type="dxa"/>
+            </w:tcMar>
+            <w:vAlign w:val="top"/>
+          </w:tcPr>
+          <w:p>
+            <w:pPr>
+              <w:pStyle w:val="Normal"/>
+              <w:jc w:val="center"/>
+              <w:pBdr>
+                <w:bottom w:val="none" w:sz="0" w:space="0" w:color="000000"/>
+                <w:top w:val="none" w:sz="0" w:space="0" w:color="000000"/>
+                <w:left w:val="none" w:sz="0" w:space="0" w:color="000000"/>
+                <w:right w:val="none" w:sz="0" w:space="0" w:color="000000"/>
+              </w:pBdr>
+              <w:spacing w:after="100" w:before="100" w:line="240"/>
+              <w:ind w:left="100" w:right="100" w:firstLine="0" w:firstLineChars="0"/>
+              <w:rPr>
+                <w:rFonts w:ascii="Times New Roman" w:hAnsi="Times New Roman" w:eastAsia="Times New Roman" w:cs="Times New Roman"/>
+                <w:i w:val="false"/>
+                <w:b w:val="false"/>
+                <w:u w:val="none"/>
+                <w:strike w:val="false"/>
+                <w:sz w:val="18"/>
+                <w:szCs w:val="18"/>
+                <w:color w:val="000000"/>
+              </w:rPr>
+            </w:pPr>
+            <w:r>
+              <w:rPr>
+                <w:rFonts w:ascii="Times New Roman" w:hAnsi="Times New Roman" w:eastAsia="Times New Roman" w:cs="Times New Roman"/>
+                <w:i w:val="false"/>
+                <w:b w:val="false"/>
+                <w:u w:val="none"/>
+                <w:strike w:val="false"/>
+                <w:sz w:val="18"/>
+                <w:szCs w:val="18"/>
+                <w:color w:val="000000"/>
+              </w:rPr>
+              <w:t xml:space="preserve"/>
+            </w:r>
+          </w:p>
+        </w:tc>
+        <w:tc>
+          <w:tcPr>
+            <w:tcBorders>
+              <w:bottom w:val="none" w:sz="0" w:space="0" w:color="000000"/>
+              <w:top w:val="none" w:sz="0" w:space="0" w:color="000000"/>
+              <w:left w:val="none" w:sz="0" w:space="0" w:color="000000"/>
+              <w:right w:val="none" w:sz="0" w:space="0" w:color="000000"/>
+            </w:tcBorders>
+            <w:shd w:val="clear" w:color="auto" w:fill="FFFFFF"/>
+            <w:tcMar>
+              <w:top w:w="0" w:type="dxa"/>
+              <w:bottom w:w="0" w:type="dxa"/>
+              <w:left w:w="0" w:type="dxa"/>
+              <w:right w:w="0" w:type="dxa"/>
+            </w:tcMar>
+            <w:vAlign w:val="top"/>
+          </w:tcPr>
+          <w:p>
+            <w:pPr>
+              <w:pStyle w:val="Normal"/>
+              <w:jc w:val="center"/>
+              <w:pBdr>
+                <w:bottom w:val="none" w:sz="0" w:space="0" w:color="000000"/>
+                <w:top w:val="none" w:sz="0" w:space="0" w:color="000000"/>
+                <w:left w:val="none" w:sz="0" w:space="0" w:color="000000"/>
+                <w:right w:val="none" w:sz="0" w:space="0" w:color="000000"/>
+              </w:pBdr>
+              <w:spacing w:after="100" w:before="100" w:line="240"/>
+              <w:ind w:left="100" w:right="100" w:firstLine="0" w:firstLineChars="0"/>
+              <w:rPr>
+                <w:rFonts w:ascii="Times New Roman" w:hAnsi="Times New Roman" w:eastAsia="Times New Roman" w:cs="Times New Roman"/>
+                <w:i w:val="false"/>
+                <w:b w:val="false"/>
+                <w:u w:val="none"/>
+                <w:strike w:val="false"/>
+                <w:sz w:val="18"/>
+                <w:szCs w:val="18"/>
+                <w:color w:val="000000"/>
+              </w:rPr>
+            </w:pPr>
+            <w:r>
+              <w:rPr>
+                <w:rFonts w:ascii="Times New Roman" w:hAnsi="Times New Roman" w:eastAsia="Times New Roman" w:cs="Times New Roman"/>
+                <w:i w:val="false"/>
+                <w:b w:val="false"/>
+                <w:u w:val="none"/>
+                <w:strike w:val="false"/>
+                <w:sz w:val="18"/>
+                <w:szCs w:val="18"/>
+                <w:color w:val="000000"/>
+              </w:rPr>
+              <w:t xml:space="preserve"/>
+            </w:r>
+          </w:p>
+        </w:tc>
+      </w:tr>
+      <w:tr>
+        <w:trPr>
+          <w:trHeight w:val="560" w:hRule="auto"/>
+        </w:trPr>
+        <w:tc>
+          <w:tcPr>
+            <w:tcBorders>
+              <w:bottom w:val="none" w:sz="0" w:space="0" w:color="000000"/>
+              <w:top w:val="none" w:sz="0" w:space="0" w:color="000000"/>
+              <w:left w:val="none" w:sz="0" w:space="0" w:color="000000"/>
+              <w:right w:val="none" w:sz="0" w:space="0" w:color="000000"/>
+            </w:tcBorders>
+            <w:shd w:val="clear" w:color="auto" w:fill="FFFFFF"/>
+            <w:tcMar>
+              <w:top w:w="0" w:type="dxa"/>
+              <w:bottom w:w="0" w:type="dxa"/>
+              <w:left w:w="0" w:type="dxa"/>
+              <w:right w:w="0" w:type="dxa"/>
+            </w:tcMar>
+            <w:vAlign w:val="top"/>
+          </w:tcPr>
+          <w:p>
+            <w:pPr>
+              <w:pStyle w:val="Normal"/>
+              <w:jc w:val="left"/>
+              <w:pBdr>
+                <w:bottom w:val="none" w:sz="0" w:space="0" w:color="000000"/>
+                <w:top w:val="none" w:sz="0" w:space="0" w:color="000000"/>
+                <w:left w:val="none" w:sz="0" w:space="0" w:color="000000"/>
+                <w:right w:val="none" w:sz="0" w:space="0" w:color="000000"/>
+              </w:pBdr>
+              <w:spacing w:after="100" w:before="100" w:line="240"/>
+              <w:ind w:left="300" w:right="100" w:firstLine="0" w:firstLineChars="0"/>
+              <w:rPr>
+                <w:rFonts w:ascii="Times New Roman" w:hAnsi="Times New Roman" w:eastAsia="Times New Roman" w:cs="Times New Roman"/>
+                <w:i w:val="false"/>
+                <w:b w:val="false"/>
+                <w:u w:val="none"/>
+                <w:strike w:val="false"/>
+                <w:sz w:val="18"/>
+                <w:szCs w:val="18"/>
+                <w:color w:val="000000"/>
+              </w:rPr>
+            </w:pPr>
+            <w:r>
+              <w:rPr>
+                <w:rFonts w:ascii="Times New Roman" w:hAnsi="Times New Roman" w:eastAsia="Times New Roman" w:cs="Times New Roman"/>
+                <w:i w:val="false"/>
+                <w:b w:val="false"/>
+                <w:u w:val="none"/>
+                <w:strike w:val="false"/>
+                <w:sz w:val="18"/>
+                <w:szCs w:val="18"/>
+                <w:color w:val="000000"/>
+              </w:rPr>
+              <w:t xml:space="preserve">2</w:t>
+            </w:r>
+          </w:p>
+        </w:tc>
+        <w:tc>
+          <w:tcPr>
+            <w:tcBorders>
+              <w:bottom w:val="none" w:sz="0" w:space="0" w:color="000000"/>
+              <w:top w:val="none" w:sz="0" w:space="0" w:color="000000"/>
+              <w:left w:val="none" w:sz="0" w:space="0" w:color="000000"/>
+              <w:right w:val="none" w:sz="0" w:space="0" w:color="000000"/>
+            </w:tcBorders>
+            <w:shd w:val="clear" w:color="auto" w:fill="FFFFFF"/>
+            <w:tcMar>
+              <w:top w:w="0" w:type="dxa"/>
+              <w:bottom w:w="0" w:type="dxa"/>
+              <w:left w:w="0" w:type="dxa"/>
+              <w:right w:w="0" w:type="dxa"/>
+            </w:tcMar>
+            <w:vAlign w:val="top"/>
+          </w:tcPr>
+          <w:p>
+            <w:pPr>
+              <w:pStyle w:val="Normal"/>
+              <w:jc w:val="center"/>
+              <w:pBdr>
+                <w:bottom w:val="none" w:sz="0" w:space="0" w:color="000000"/>
+                <w:top w:val="none" w:sz="0" w:space="0" w:color="000000"/>
+                <w:left w:val="none" w:sz="0" w:space="0" w:color="000000"/>
+                <w:right w:val="none" w:sz="0" w:space="0" w:color="000000"/>
+              </w:pBdr>
+              <w:spacing w:after="100" w:before="100" w:line="240"/>
+              <w:ind w:left="100" w:right="100" w:firstLine="0" w:firstLineChars="0"/>
+              <w:rPr>
+                <w:rFonts w:ascii="Times New Roman" w:hAnsi="Times New Roman" w:eastAsia="Times New Roman" w:cs="Times New Roman"/>
+                <w:i w:val="false"/>
+                <w:b w:val="false"/>
+                <w:u w:val="none"/>
+                <w:strike w:val="false"/>
+                <w:sz w:val="18"/>
+                <w:szCs w:val="18"/>
+                <w:color w:val="000000"/>
+              </w:rPr>
+            </w:pPr>
+            <w:r>
+              <w:rPr>
+                <w:rFonts w:ascii="Times New Roman" w:hAnsi="Times New Roman" w:eastAsia="Times New Roman" w:cs="Times New Roman"/>
+                <w:i w:val="false"/>
+                <w:b w:val="false"/>
+                <w:u w:val="none"/>
+                <w:strike w:val="false"/>
+                <w:sz w:val="18"/>
+                <w:szCs w:val="18"/>
+                <w:color w:val="000000"/>
+              </w:rPr>
+              <w:t xml:space="preserve">9 (2.4%)</w:t>
+            </w:r>
+          </w:p>
+        </w:tc>
+        <w:tc>
+          <w:tcPr>
+            <w:tcBorders>
+              <w:bottom w:val="none" w:sz="0" w:space="0" w:color="000000"/>
+              <w:top w:val="none" w:sz="0" w:space="0" w:color="000000"/>
+              <w:left w:val="none" w:sz="0" w:space="0" w:color="000000"/>
+              <w:right w:val="none" w:sz="0" w:space="0" w:color="000000"/>
+            </w:tcBorders>
+            <w:shd w:val="clear" w:color="auto" w:fill="FFFFFF"/>
+            <w:tcMar>
+              <w:top w:w="0" w:type="dxa"/>
+              <w:bottom w:w="0" w:type="dxa"/>
+              <w:left w:w="0" w:type="dxa"/>
+              <w:right w:w="0" w:type="dxa"/>
+            </w:tcMar>
+            <w:vAlign w:val="top"/>
+          </w:tcPr>
+          <w:p>
+            <w:pPr>
+              <w:pStyle w:val="Normal"/>
+              <w:jc w:val="center"/>
+              <w:pBdr>
+                <w:bottom w:val="none" w:sz="0" w:space="0" w:color="000000"/>
+                <w:top w:val="none" w:sz="0" w:space="0" w:color="000000"/>
+                <w:left w:val="none" w:sz="0" w:space="0" w:color="000000"/>
+                <w:right w:val="none" w:sz="0" w:space="0" w:color="000000"/>
+              </w:pBdr>
+              <w:spacing w:after="100" w:before="100" w:line="240"/>
+              <w:ind w:left="100" w:right="100" w:firstLine="0" w:firstLineChars="0"/>
+              <w:rPr>
+                <w:rFonts w:ascii="Times New Roman" w:hAnsi="Times New Roman" w:eastAsia="Times New Roman" w:cs="Times New Roman"/>
+                <w:i w:val="false"/>
+                <w:b w:val="false"/>
+                <w:u w:val="none"/>
+                <w:strike w:val="false"/>
+                <w:sz w:val="18"/>
+                <w:szCs w:val="18"/>
+                <w:color w:val="000000"/>
+              </w:rPr>
+            </w:pPr>
+            <w:r>
+              <w:rPr>
+                <w:rFonts w:ascii="Times New Roman" w:hAnsi="Times New Roman" w:eastAsia="Times New Roman" w:cs="Times New Roman"/>
+                <w:i w:val="false"/>
+                <w:b w:val="false"/>
+                <w:u w:val="none"/>
+                <w:strike w:val="false"/>
+                <w:sz w:val="18"/>
+                <w:szCs w:val="18"/>
+                <w:color w:val="000000"/>
+              </w:rPr>
+              <w:t xml:space="preserve">5 (2.6%)</w:t>
+            </w:r>
+          </w:p>
+        </w:tc>
+        <w:tc>
+          <w:tcPr>
+            <w:tcBorders>
+              <w:bottom w:val="none" w:sz="0" w:space="0" w:color="000000"/>
+              <w:top w:val="none" w:sz="0" w:space="0" w:color="000000"/>
+              <w:left w:val="none" w:sz="0" w:space="0" w:color="000000"/>
+              <w:right w:val="none" w:sz="0" w:space="0" w:color="000000"/>
+            </w:tcBorders>
+            <w:shd w:val="clear" w:color="auto" w:fill="FFFFFF"/>
+            <w:tcMar>
+              <w:top w:w="0" w:type="dxa"/>
+              <w:bottom w:w="0" w:type="dxa"/>
+              <w:left w:w="0" w:type="dxa"/>
+              <w:right w:w="0" w:type="dxa"/>
+            </w:tcMar>
+            <w:vAlign w:val="top"/>
+          </w:tcPr>
+          <w:p>
+            <w:pPr>
+              <w:pStyle w:val="Normal"/>
+              <w:jc w:val="center"/>
+              <w:pBdr>
+                <w:bottom w:val="none" w:sz="0" w:space="0" w:color="000000"/>
+                <w:top w:val="none" w:sz="0" w:space="0" w:color="000000"/>
+                <w:left w:val="none" w:sz="0" w:space="0" w:color="000000"/>
+                <w:right w:val="none" w:sz="0" w:space="0" w:color="000000"/>
+              </w:pBdr>
+              <w:spacing w:after="100" w:before="100" w:line="240"/>
+              <w:ind w:left="100" w:right="100" w:firstLine="0" w:firstLineChars="0"/>
+              <w:rPr>
+                <w:rFonts w:ascii="Times New Roman" w:hAnsi="Times New Roman" w:eastAsia="Times New Roman" w:cs="Times New Roman"/>
+                <w:i w:val="false"/>
+                <w:b w:val="false"/>
+                <w:u w:val="none"/>
+                <w:strike w:val="false"/>
+                <w:sz w:val="18"/>
+                <w:szCs w:val="18"/>
+                <w:color w:val="000000"/>
+              </w:rPr>
+            </w:pPr>
+            <w:r>
+              <w:rPr>
+                <w:rFonts w:ascii="Times New Roman" w:hAnsi="Times New Roman" w:eastAsia="Times New Roman" w:cs="Times New Roman"/>
+                <w:i w:val="false"/>
+                <w:b w:val="false"/>
+                <w:u w:val="none"/>
+                <w:strike w:val="false"/>
+                <w:sz w:val="18"/>
+                <w:szCs w:val="18"/>
+                <w:color w:val="000000"/>
+              </w:rPr>
+              <w:t xml:space="preserve">4 (2.2%)</w:t>
+            </w:r>
+          </w:p>
+        </w:tc>
+        <w:tc>
+          <w:tcPr>
+            <w:tcBorders>
+              <w:bottom w:val="none" w:sz="0" w:space="0" w:color="000000"/>
+              <w:top w:val="none" w:sz="0" w:space="0" w:color="000000"/>
+              <w:left w:val="none" w:sz="0" w:space="0" w:color="000000"/>
+              <w:right w:val="none" w:sz="0" w:space="0" w:color="000000"/>
+            </w:tcBorders>
+            <w:shd w:val="clear" w:color="auto" w:fill="FFFFFF"/>
+            <w:tcMar>
+              <w:top w:w="0" w:type="dxa"/>
+              <w:bottom w:w="0" w:type="dxa"/>
+              <w:left w:w="0" w:type="dxa"/>
+              <w:right w:w="0" w:type="dxa"/>
+            </w:tcMar>
+            <w:vAlign w:val="top"/>
+          </w:tcPr>
+          <w:p>
+            <w:pPr>
+              <w:pStyle w:val="Normal"/>
+              <w:jc w:val="center"/>
+              <w:pBdr>
+                <w:bottom w:val="none" w:sz="0" w:space="0" w:color="000000"/>
+                <w:top w:val="none" w:sz="0" w:space="0" w:color="000000"/>
+                <w:left w:val="none" w:sz="0" w:space="0" w:color="000000"/>
+                <w:right w:val="none" w:sz="0" w:space="0" w:color="000000"/>
+              </w:pBdr>
+              <w:spacing w:after="100" w:before="100" w:line="240"/>
+              <w:ind w:left="100" w:right="100" w:firstLine="0" w:firstLineChars="0"/>
+              <w:rPr>
+                <w:rFonts w:ascii="Times New Roman" w:hAnsi="Times New Roman" w:eastAsia="Times New Roman" w:cs="Times New Roman"/>
+                <w:i w:val="false"/>
+                <w:b w:val="false"/>
+                <w:u w:val="none"/>
+                <w:strike w:val="false"/>
+                <w:sz w:val="18"/>
+                <w:szCs w:val="18"/>
+                <w:color w:val="000000"/>
+              </w:rPr>
+            </w:pPr>
+            <w:r>
+              <w:rPr>
+                <w:rFonts w:ascii="Times New Roman" w:hAnsi="Times New Roman" w:eastAsia="Times New Roman" w:cs="Times New Roman"/>
+                <w:i w:val="false"/>
+                <w:b w:val="false"/>
+                <w:u w:val="none"/>
+                <w:strike w:val="false"/>
+                <w:sz w:val="18"/>
+                <w:szCs w:val="18"/>
+                <w:color w:val="000000"/>
+              </w:rPr>
+              <w:t xml:space="preserve"/>
+            </w:r>
+          </w:p>
+        </w:tc>
+        <w:tc>
+          <w:tcPr>
+            <w:tcBorders>
+              <w:bottom w:val="none" w:sz="0" w:space="0" w:color="000000"/>
+              <w:top w:val="none" w:sz="0" w:space="0" w:color="000000"/>
+              <w:left w:val="none" w:sz="0" w:space="0" w:color="000000"/>
+              <w:right w:val="none" w:sz="0" w:space="0" w:color="000000"/>
+            </w:tcBorders>
+            <w:shd w:val="clear" w:color="auto" w:fill="FFFFFF"/>
+            <w:tcMar>
+              <w:top w:w="0" w:type="dxa"/>
+              <w:bottom w:w="0" w:type="dxa"/>
+              <w:left w:w="0" w:type="dxa"/>
+              <w:right w:w="0" w:type="dxa"/>
+            </w:tcMar>
+            <w:vAlign w:val="top"/>
+          </w:tcPr>
+          <w:p>
+            <w:pPr>
+              <w:pStyle w:val="Normal"/>
+              <w:jc w:val="center"/>
+              <w:pBdr>
+                <w:bottom w:val="none" w:sz="0" w:space="0" w:color="000000"/>
+                <w:top w:val="none" w:sz="0" w:space="0" w:color="000000"/>
+                <w:left w:val="none" w:sz="0" w:space="0" w:color="000000"/>
+                <w:right w:val="none" w:sz="0" w:space="0" w:color="000000"/>
+              </w:pBdr>
+              <w:spacing w:after="100" w:before="100" w:line="240"/>
+              <w:ind w:left="100" w:right="100" w:firstLine="0" w:firstLineChars="0"/>
+              <w:rPr>
+                <w:rFonts w:ascii="Times New Roman" w:hAnsi="Times New Roman" w:eastAsia="Times New Roman" w:cs="Times New Roman"/>
+                <w:i w:val="false"/>
+                <w:b w:val="false"/>
+                <w:u w:val="none"/>
+                <w:strike w:val="false"/>
+                <w:sz w:val="18"/>
+                <w:szCs w:val="18"/>
+                <w:color w:val="000000"/>
+              </w:rPr>
+            </w:pPr>
+            <w:r>
+              <w:rPr>
+                <w:rFonts w:ascii="Times New Roman" w:hAnsi="Times New Roman" w:eastAsia="Times New Roman" w:cs="Times New Roman"/>
+                <w:i w:val="false"/>
+                <w:b w:val="false"/>
+                <w:u w:val="none"/>
+                <w:strike w:val="false"/>
+                <w:sz w:val="18"/>
+                <w:szCs w:val="18"/>
+                <w:color w:val="000000"/>
+              </w:rPr>
+              <w:t xml:space="preserve"/>
+            </w:r>
+          </w:p>
+        </w:tc>
+      </w:tr>
+      <w:tr>
+        <w:trPr>
+          <w:trHeight w:val="560" w:hRule="auto"/>
+        </w:trPr>
+        <w:tc>
+          <w:tcPr>
+            <w:tcBorders>
+              <w:bottom w:val="none" w:sz="0" w:space="0" w:color="000000"/>
+              <w:top w:val="none" w:sz="0" w:space="0" w:color="000000"/>
+              <w:left w:val="none" w:sz="0" w:space="0" w:color="000000"/>
+              <w:right w:val="none" w:sz="0" w:space="0" w:color="000000"/>
+            </w:tcBorders>
+            <w:shd w:val="clear" w:color="auto" w:fill="FFFFFF"/>
+            <w:tcMar>
+              <w:top w:w="0" w:type="dxa"/>
+              <w:bottom w:w="0" w:type="dxa"/>
+              <w:left w:w="0" w:type="dxa"/>
+              <w:right w:w="0" w:type="dxa"/>
+            </w:tcMar>
+            <w:vAlign w:val="top"/>
+          </w:tcPr>
+          <w:p>
+            <w:pPr>
+              <w:pStyle w:val="Normal"/>
+              <w:jc w:val="left"/>
+              <w:pBdr>
+                <w:bottom w:val="none" w:sz="0" w:space="0" w:color="000000"/>
+                <w:top w:val="none" w:sz="0" w:space="0" w:color="000000"/>
+                <w:left w:val="none" w:sz="0" w:space="0" w:color="000000"/>
+                <w:right w:val="none" w:sz="0" w:space="0" w:color="000000"/>
+              </w:pBdr>
+              <w:spacing w:after="100" w:before="100" w:line="240"/>
+              <w:ind w:left="300" w:right="100" w:firstLine="0" w:firstLineChars="0"/>
+              <w:rPr>
+                <w:rFonts w:ascii="Times New Roman" w:hAnsi="Times New Roman" w:eastAsia="Times New Roman" w:cs="Times New Roman"/>
+                <w:i w:val="false"/>
+                <w:b w:val="false"/>
+                <w:u w:val="none"/>
+                <w:strike w:val="false"/>
+                <w:sz w:val="18"/>
+                <w:szCs w:val="18"/>
+                <w:color w:val="000000"/>
+              </w:rPr>
+            </w:pPr>
+            <w:r>
+              <w:rPr>
+                <w:rFonts w:ascii="Times New Roman" w:hAnsi="Times New Roman" w:eastAsia="Times New Roman" w:cs="Times New Roman"/>
+                <w:i w:val="false"/>
+                <w:b w:val="false"/>
+                <w:u w:val="none"/>
+                <w:strike w:val="false"/>
+                <w:sz w:val="18"/>
+                <w:szCs w:val="18"/>
+                <w:color w:val="000000"/>
+              </w:rPr>
+              <w:t xml:space="preserve">3</w:t>
+            </w:r>
+          </w:p>
+        </w:tc>
+        <w:tc>
+          <w:tcPr>
+            <w:tcBorders>
+              <w:bottom w:val="none" w:sz="0" w:space="0" w:color="000000"/>
+              <w:top w:val="none" w:sz="0" w:space="0" w:color="000000"/>
+              <w:left w:val="none" w:sz="0" w:space="0" w:color="000000"/>
+              <w:right w:val="none" w:sz="0" w:space="0" w:color="000000"/>
+            </w:tcBorders>
+            <w:shd w:val="clear" w:color="auto" w:fill="FFFFFF"/>
+            <w:tcMar>
+              <w:top w:w="0" w:type="dxa"/>
+              <w:bottom w:w="0" w:type="dxa"/>
+              <w:left w:w="0" w:type="dxa"/>
+              <w:right w:w="0" w:type="dxa"/>
+            </w:tcMar>
+            <w:vAlign w:val="top"/>
+          </w:tcPr>
+          <w:p>
+            <w:pPr>
+              <w:pStyle w:val="Normal"/>
+              <w:jc w:val="center"/>
+              <w:pBdr>
+                <w:bottom w:val="none" w:sz="0" w:space="0" w:color="000000"/>
+                <w:top w:val="none" w:sz="0" w:space="0" w:color="000000"/>
+                <w:left w:val="none" w:sz="0" w:space="0" w:color="000000"/>
+                <w:right w:val="none" w:sz="0" w:space="0" w:color="000000"/>
+              </w:pBdr>
+              <w:spacing w:after="100" w:before="100" w:line="240"/>
+              <w:ind w:left="100" w:right="100" w:firstLine="0" w:firstLineChars="0"/>
+              <w:rPr>
+                <w:rFonts w:ascii="Times New Roman" w:hAnsi="Times New Roman" w:eastAsia="Times New Roman" w:cs="Times New Roman"/>
+                <w:i w:val="false"/>
+                <w:b w:val="false"/>
+                <w:u w:val="none"/>
+                <w:strike w:val="false"/>
+                <w:sz w:val="18"/>
+                <w:szCs w:val="18"/>
+                <w:color w:val="000000"/>
+              </w:rPr>
+            </w:pPr>
+            <w:r>
+              <w:rPr>
+                <w:rFonts w:ascii="Times New Roman" w:hAnsi="Times New Roman" w:eastAsia="Times New Roman" w:cs="Times New Roman"/>
+                <w:i w:val="false"/>
+                <w:b w:val="false"/>
+                <w:u w:val="none"/>
+                <w:strike w:val="false"/>
+                <w:sz w:val="18"/>
+                <w:szCs w:val="18"/>
+                <w:color w:val="000000"/>
+              </w:rPr>
+              <w:t xml:space="preserve">2 (0.5%)</w:t>
+            </w:r>
+          </w:p>
+        </w:tc>
+        <w:tc>
+          <w:tcPr>
+            <w:tcBorders>
+              <w:bottom w:val="none" w:sz="0" w:space="0" w:color="000000"/>
+              <w:top w:val="none" w:sz="0" w:space="0" w:color="000000"/>
+              <w:left w:val="none" w:sz="0" w:space="0" w:color="000000"/>
+              <w:right w:val="none" w:sz="0" w:space="0" w:color="000000"/>
+            </w:tcBorders>
+            <w:shd w:val="clear" w:color="auto" w:fill="FFFFFF"/>
+            <w:tcMar>
+              <w:top w:w="0" w:type="dxa"/>
+              <w:bottom w:w="0" w:type="dxa"/>
+              <w:left w:w="0" w:type="dxa"/>
+              <w:right w:w="0" w:type="dxa"/>
+            </w:tcMar>
+            <w:vAlign w:val="top"/>
+          </w:tcPr>
+          <w:p>
+            <w:pPr>
+              <w:pStyle w:val="Normal"/>
+              <w:jc w:val="center"/>
+              <w:pBdr>
+                <w:bottom w:val="none" w:sz="0" w:space="0" w:color="000000"/>
+                <w:top w:val="none" w:sz="0" w:space="0" w:color="000000"/>
+                <w:left w:val="none" w:sz="0" w:space="0" w:color="000000"/>
+                <w:right w:val="none" w:sz="0" w:space="0" w:color="000000"/>
+              </w:pBdr>
+              <w:spacing w:after="100" w:before="100" w:line="240"/>
+              <w:ind w:left="100" w:right="100" w:firstLine="0" w:firstLineChars="0"/>
+              <w:rPr>
+                <w:rFonts w:ascii="Times New Roman" w:hAnsi="Times New Roman" w:eastAsia="Times New Roman" w:cs="Times New Roman"/>
+                <w:i w:val="false"/>
+                <w:b w:val="false"/>
+                <w:u w:val="none"/>
+                <w:strike w:val="false"/>
+                <w:sz w:val="18"/>
+                <w:szCs w:val="18"/>
+                <w:color w:val="000000"/>
+              </w:rPr>
+            </w:pPr>
+            <w:r>
+              <w:rPr>
+                <w:rFonts w:ascii="Times New Roman" w:hAnsi="Times New Roman" w:eastAsia="Times New Roman" w:cs="Times New Roman"/>
+                <w:i w:val="false"/>
+                <w:b w:val="false"/>
+                <w:u w:val="none"/>
+                <w:strike w:val="false"/>
+                <w:sz w:val="18"/>
+                <w:szCs w:val="18"/>
+                <w:color w:val="000000"/>
+              </w:rPr>
+              <w:t xml:space="preserve">1 (0.5%)</w:t>
+            </w:r>
+          </w:p>
+        </w:tc>
+        <w:tc>
+          <w:tcPr>
+            <w:tcBorders>
+              <w:bottom w:val="none" w:sz="0" w:space="0" w:color="000000"/>
+              <w:top w:val="none" w:sz="0" w:space="0" w:color="000000"/>
+              <w:left w:val="none" w:sz="0" w:space="0" w:color="000000"/>
+              <w:right w:val="none" w:sz="0" w:space="0" w:color="000000"/>
+            </w:tcBorders>
+            <w:shd w:val="clear" w:color="auto" w:fill="FFFFFF"/>
+            <w:tcMar>
+              <w:top w:w="0" w:type="dxa"/>
+              <w:bottom w:w="0" w:type="dxa"/>
+              <w:left w:w="0" w:type="dxa"/>
+              <w:right w:w="0" w:type="dxa"/>
+            </w:tcMar>
+            <w:vAlign w:val="top"/>
+          </w:tcPr>
+          <w:p>
+            <w:pPr>
+              <w:pStyle w:val="Normal"/>
+              <w:jc w:val="center"/>
+              <w:pBdr>
+                <w:bottom w:val="none" w:sz="0" w:space="0" w:color="000000"/>
+                <w:top w:val="none" w:sz="0" w:space="0" w:color="000000"/>
+                <w:left w:val="none" w:sz="0" w:space="0" w:color="000000"/>
+                <w:right w:val="none" w:sz="0" w:space="0" w:color="000000"/>
+              </w:pBdr>
+              <w:spacing w:after="100" w:before="100" w:line="240"/>
+              <w:ind w:left="100" w:right="100" w:firstLine="0" w:firstLineChars="0"/>
+              <w:rPr>
+                <w:rFonts w:ascii="Times New Roman" w:hAnsi="Times New Roman" w:eastAsia="Times New Roman" w:cs="Times New Roman"/>
+                <w:i w:val="false"/>
+                <w:b w:val="false"/>
+                <w:u w:val="none"/>
+                <w:strike w:val="false"/>
+                <w:sz w:val="18"/>
+                <w:szCs w:val="18"/>
+                <w:color w:val="000000"/>
+              </w:rPr>
+            </w:pPr>
+            <w:r>
+              <w:rPr>
+                <w:rFonts w:ascii="Times New Roman" w:hAnsi="Times New Roman" w:eastAsia="Times New Roman" w:cs="Times New Roman"/>
+                <w:i w:val="false"/>
+                <w:b w:val="false"/>
+                <w:u w:val="none"/>
+                <w:strike w:val="false"/>
+                <w:sz w:val="18"/>
+                <w:szCs w:val="18"/>
+                <w:color w:val="000000"/>
+              </w:rPr>
+              <w:t xml:space="preserve">1 (0.6%)</w:t>
+            </w:r>
+          </w:p>
+        </w:tc>
+        <w:tc>
+          <w:tcPr>
+            <w:tcBorders>
+              <w:bottom w:val="none" w:sz="0" w:space="0" w:color="000000"/>
+              <w:top w:val="none" w:sz="0" w:space="0" w:color="000000"/>
+              <w:left w:val="none" w:sz="0" w:space="0" w:color="000000"/>
+              <w:right w:val="none" w:sz="0" w:space="0" w:color="000000"/>
+            </w:tcBorders>
+            <w:shd w:val="clear" w:color="auto" w:fill="FFFFFF"/>
+            <w:tcMar>
+              <w:top w:w="0" w:type="dxa"/>
+              <w:bottom w:w="0" w:type="dxa"/>
+              <w:left w:w="0" w:type="dxa"/>
+              <w:right w:w="0" w:type="dxa"/>
+            </w:tcMar>
+            <w:vAlign w:val="top"/>
+          </w:tcPr>
+          <w:p>
+            <w:pPr>
+              <w:pStyle w:val="Normal"/>
+              <w:jc w:val="center"/>
+              <w:pBdr>
+                <w:bottom w:val="none" w:sz="0" w:space="0" w:color="000000"/>
+                <w:top w:val="none" w:sz="0" w:space="0" w:color="000000"/>
+                <w:left w:val="none" w:sz="0" w:space="0" w:color="000000"/>
+                <w:right w:val="none" w:sz="0" w:space="0" w:color="000000"/>
+              </w:pBdr>
+              <w:spacing w:after="100" w:before="100" w:line="240"/>
+              <w:ind w:left="100" w:right="100" w:firstLine="0" w:firstLineChars="0"/>
+              <w:rPr>
+                <w:rFonts w:ascii="Times New Roman" w:hAnsi="Times New Roman" w:eastAsia="Times New Roman" w:cs="Times New Roman"/>
+                <w:i w:val="false"/>
+                <w:b w:val="false"/>
+                <w:u w:val="none"/>
+                <w:strike w:val="false"/>
+                <w:sz w:val="18"/>
+                <w:szCs w:val="18"/>
+                <w:color w:val="000000"/>
+              </w:rPr>
+            </w:pPr>
+            <w:r>
+              <w:rPr>
+                <w:rFonts w:ascii="Times New Roman" w:hAnsi="Times New Roman" w:eastAsia="Times New Roman" w:cs="Times New Roman"/>
+                <w:i w:val="false"/>
+                <w:b w:val="false"/>
+                <w:u w:val="none"/>
+                <w:strike w:val="false"/>
+                <w:sz w:val="18"/>
+                <w:szCs w:val="18"/>
+                <w:color w:val="000000"/>
+              </w:rPr>
+              <w:t xml:space="preserve"/>
+            </w:r>
+          </w:p>
+        </w:tc>
+        <w:tc>
+          <w:tcPr>
+            <w:tcBorders>
+              <w:bottom w:val="none" w:sz="0" w:space="0" w:color="000000"/>
+              <w:top w:val="none" w:sz="0" w:space="0" w:color="000000"/>
+              <w:left w:val="none" w:sz="0" w:space="0" w:color="000000"/>
+              <w:right w:val="none" w:sz="0" w:space="0" w:color="000000"/>
+            </w:tcBorders>
+            <w:shd w:val="clear" w:color="auto" w:fill="FFFFFF"/>
+            <w:tcMar>
+              <w:top w:w="0" w:type="dxa"/>
+              <w:bottom w:w="0" w:type="dxa"/>
+              <w:left w:w="0" w:type="dxa"/>
+              <w:right w:w="0" w:type="dxa"/>
+            </w:tcMar>
+            <w:vAlign w:val="top"/>
+          </w:tcPr>
+          <w:p>
+            <w:pPr>
+              <w:pStyle w:val="Normal"/>
+              <w:jc w:val="center"/>
+              <w:pBdr>
+                <w:bottom w:val="none" w:sz="0" w:space="0" w:color="000000"/>
+                <w:top w:val="none" w:sz="0" w:space="0" w:color="000000"/>
+                <w:left w:val="none" w:sz="0" w:space="0" w:color="000000"/>
+                <w:right w:val="none" w:sz="0" w:space="0" w:color="000000"/>
+              </w:pBdr>
+              <w:spacing w:after="100" w:before="100" w:line="240"/>
+              <w:ind w:left="100" w:right="100" w:firstLine="0" w:firstLineChars="0"/>
+              <w:rPr>
+                <w:rFonts w:ascii="Times New Roman" w:hAnsi="Times New Roman" w:eastAsia="Times New Roman" w:cs="Times New Roman"/>
+                <w:i w:val="false"/>
+                <w:b w:val="false"/>
+                <w:u w:val="none"/>
+                <w:strike w:val="false"/>
+                <w:sz w:val="18"/>
+                <w:szCs w:val="18"/>
+                <w:color w:val="000000"/>
+              </w:rPr>
+            </w:pPr>
+            <w:r>
+              <w:rPr>
+                <w:rFonts w:ascii="Times New Roman" w:hAnsi="Times New Roman" w:eastAsia="Times New Roman" w:cs="Times New Roman"/>
+                <w:i w:val="false"/>
+                <w:b w:val="false"/>
+                <w:u w:val="none"/>
+                <w:strike w:val="false"/>
+                <w:sz w:val="18"/>
+                <w:szCs w:val="18"/>
+                <w:color w:val="000000"/>
+              </w:rPr>
+              <w:t xml:space="preserve"/>
+            </w:r>
+          </w:p>
+        </w:tc>
+      </w:tr>
+      <w:tr>
+        <w:trPr>
           <w:trHeight w:val="570" w:hRule="auto"/>
         </w:trPr>
         <w:tc>
@@ -22275,7 +24285,7 @@
                 <w:szCs w:val="18"/>
                 <w:color w:val="000000"/>
               </w:rPr>
-              <w:t xml:space="preserve">45</w:t>
+              <w:t xml:space="preserve">64</w:t>
             </w:r>
           </w:p>
         </w:tc>
@@ -22330,7 +24340,7 @@
                 <w:szCs w:val="18"/>
                 <w:color w:val="000000"/>
               </w:rPr>
-              <w:t xml:space="preserve">20</w:t>
+              <w:t xml:space="preserve">23</w:t>
             </w:r>
           </w:p>
         </w:tc>
@@ -22385,7 +24395,7 @@
                 <w:szCs w:val="18"/>
                 <w:color w:val="000000"/>
               </w:rPr>
-              <w:t xml:space="preserve">25</w:t>
+              <w:t xml:space="preserve">41</w:t>
             </w:r>
           </w:p>
         </w:tc>

</xml_diff>